<commit_message>
docs(project): one brief to follow, each idea's level-1 outcome, and a fallback for every failure
The Project Showcase card now leads with the one-week brief; the full brief is marked reference-only on the card, in the README and at the top of its own page.

Every idea maps to one session-2 starter file that already has screen, buttons, sound, matrix, MQTT and a command back, and states what text edits alone deliver. Ideas that need new code are marked. A fallback table covers: level 2 not finished, an edit breaking the board, no edits possible, the web app failing, and being stuck; plus a mid-week checkpoint.
</commit_message>
<xml_diff>
--- a/PROJECT_BRIEF_lite_th.docx
+++ b/PROJECT_BRIEF_lite_th.docx
@@ -1376,7 +1376,7 @@
           <w:sz w:val="30"/>
           <w:szCs w:val="30"/>
         </w:rPr>
-        <w:t xml:space="preserve">ใช้ไอเดียตั้งต้น 8 เรื่องเดิมของโจทย์ แต่ </w:t>
+        <w:t xml:space="preserve">ทุกไอเดียมี </w:t>
       </w:r>
       <w:r>
         <w:rPr>
@@ -1386,15 +1386,51 @@
           <w:sz w:val="30"/>
           <w:szCs w:val="30"/>
         </w:rPr>
-        <w:t xml:space="preserve">ทำด้วยของคาบ 1–2 เท่านั้น</w:t>
-      </w:r>
-      <w:r>
-        <w:rPr>
-          <w:rFonts w:ascii="TH Sarabun New" w:cs="TH Sarabun New" w:eastAsia="TH Sarabun New" w:hAnsi="TH Sarabun New"/>
-          <w:sz w:val="30"/>
-          <w:szCs w:val="30"/>
-        </w:rPr>
-        <w:t xml:space="preserve"> · เรดาร์ ไมค์ และ Edge AI (คาบ 3) เป็นโบนัส · ทุกไฟล์ตั้งต้นต่อ MQTT ได้อยู่แล้ว</w:t>
+        <w:t xml:space="preserve">ไฟล์ตั้งต้นจากคาบ 2 ไฟล์เดียว</w:t>
+      </w:r>
+      <w:r>
+        <w:rPr>
+          <w:rFonts w:ascii="TH Sarabun New" w:cs="TH Sarabun New" w:eastAsia="TH Sarabun New" w:hAnsi="TH Sarabun New"/>
+          <w:sz w:val="30"/>
+          <w:szCs w:val="30"/>
+        </w:rPr>
+        <w:t xml:space="preserve"> ที่มีจอ ปุ่ม เสียง RGB matrix MQTT และรับคำสั่งจากมือถือครบอยู่แล้ว · </w:t>
+      </w:r>
+      <w:r>
+        <w:rPr>
+          <w:rFonts w:ascii="TH Sarabun New" w:cs="TH Sarabun New" w:eastAsia="TH Sarabun New" w:hAnsi="TH Sarabun New"/>
+          <w:b/>
+          <w:bCs/>
+          <w:sz w:val="30"/>
+          <w:szCs w:val="30"/>
+        </w:rPr>
+        <w:t xml:space="preserve">ระดับ 1</w:t>
+      </w:r>
+      <w:r>
+        <w:rPr>
+          <w:rFonts w:ascii="TH Sarabun New" w:cs="TH Sarabun New" w:eastAsia="TH Sarabun New" w:hAnsi="TH Sarabun New"/>
+          <w:sz w:val="30"/>
+          <w:szCs w:val="30"/>
+        </w:rPr>
+        <w:t xml:space="preserve"> = แก้ข้อความอย่างเดียวก็ได้โปรเจกต์ที่ครบ · </w:t>
+      </w:r>
+      <w:r>
+        <w:rPr>
+          <w:rFonts w:ascii="TH Sarabun New" w:cs="TH Sarabun New" w:eastAsia="TH Sarabun New" w:hAnsi="TH Sarabun New"/>
+          <w:b/>
+          <w:bCs/>
+          <w:sz w:val="30"/>
+          <w:szCs w:val="30"/>
+        </w:rPr>
+        <w:t xml:space="preserve">ระดับ 2</w:t>
+      </w:r>
+      <w:r>
+        <w:rPr>
+          <w:rFonts w:ascii="TH Sarabun New" w:cs="TH Sarabun New" w:eastAsia="TH Sarabun New" w:hAnsi="TH Sarabun New"/>
+          <w:sz w:val="30"/>
+          <w:szCs w:val="30"/>
+        </w:rPr>
+        <w:t xml:space="preserve"> = เพิ่มความสามารถ ถ้าทำได้</w:t>
       </w:r>
     </w:p>
     <w:tbl>
@@ -1410,10 +1446,10 @@
         </w:tblBorders>
       </w:tblPr>
       <w:tblGrid>
-        <w:gridCol w:w="2700"/>
-        <w:gridCol w:w="3168"/>
-        <w:gridCol w:w="2400"/>
-        <w:gridCol w:w="2100"/>
+        <w:gridCol w:w="2300"/>
+        <w:gridCol w:w="1700"/>
+        <w:gridCol w:w="3484"/>
+        <w:gridCol w:w="2884"/>
       </w:tblGrid>
       <w:tr>
         <w:trPr>
@@ -1421,7 +1457,7 @@
         </w:trPr>
         <w:tc>
           <w:tcPr>
-            <w:tcW w:type="dxa" w:w="2700"/>
+            <w:tcW w:type="dxa" w:w="2300"/>
             <w:tcBorders>
               <w:top w:val="single" w:color="BFBFBF" w:sz="4"/>
               <w:left w:val="single" w:color="BFBFBF" w:sz="4"/>
@@ -1454,7 +1490,7 @@
         </w:tc>
         <w:tc>
           <w:tcPr>
-            <w:tcW w:type="dxa" w:w="3168"/>
+            <w:tcW w:type="dxa" w:w="1700"/>
             <w:tcBorders>
               <w:top w:val="single" w:color="BFBFBF" w:sz="4"/>
               <w:left w:val="single" w:color="BFBFBF" w:sz="4"/>
@@ -1481,13 +1517,13 @@
                 <w:sz w:val="28"/>
                 <w:szCs w:val="28"/>
               </w:rPr>
-              <w:t xml:space="preserve">ทำแบบง่าย (คาบ 1–2)</w:t>
-            </w:r>
-          </w:p>
-        </w:tc>
-        <w:tc>
-          <w:tcPr>
-            <w:tcW w:type="dxa" w:w="2400"/>
+              <w:t xml:space="preserve">ไฟล์ตั้งต้น</w:t>
+            </w:r>
+          </w:p>
+        </w:tc>
+        <w:tc>
+          <w:tcPr>
+            <w:tcW w:type="dxa" w:w="3484"/>
             <w:tcBorders>
               <w:top w:val="single" w:color="BFBFBF" w:sz="4"/>
               <w:left w:val="single" w:color="BFBFBF" w:sz="4"/>
@@ -1514,13 +1550,13 @@
                 <w:sz w:val="28"/>
                 <w:szCs w:val="28"/>
               </w:rPr>
-              <w:t xml:space="preserve">ไฟล์ตั้งต้น</w:t>
-            </w:r>
-          </w:p>
-        </w:tc>
-        <w:tc>
-          <w:tcPr>
-            <w:tcW w:type="dxa" w:w="2100"/>
+              <w:t xml:space="preserve">ระดับ 1: แก้ข้อความอย่างเดียว ได้อะไร</w:t>
+            </w:r>
+          </w:p>
+        </w:tc>
+        <w:tc>
+          <w:tcPr>
+            <w:tcW w:type="dxa" w:w="2884"/>
             <w:tcBorders>
               <w:top w:val="single" w:color="BFBFBF" w:sz="4"/>
               <w:left w:val="single" w:color="BFBFBF" w:sz="4"/>
@@ -1547,7 +1583,7 @@
                 <w:sz w:val="28"/>
                 <w:szCs w:val="28"/>
               </w:rPr>
-              <w:t xml:space="preserve">ยืมไอเดียจาก</w:t>
+              <w:t xml:space="preserve">ระดับ 2 (ถ้าทำได้)</w:t>
             </w:r>
           </w:p>
         </w:tc>
@@ -1555,129 +1591,129 @@
       <w:tr>
         <w:tc>
           <w:tcPr>
-            <w:tcW w:type="dxa" w:w="2700"/>
-            <w:tcBorders>
-              <w:top w:val="single" w:color="BFBFBF" w:sz="4"/>
-              <w:left w:val="single" w:color="BFBFBF" w:sz="4"/>
-              <w:bottom w:val="single" w:color="BFBFBF" w:sz="4"/>
-              <w:right w:val="single" w:color="BFBFBF" w:sz="4"/>
-            </w:tcBorders>
-            <w:tcMar>
-              <w:top w:type="dxa" w:w="40"/>
-              <w:left w:type="dxa" w:w="100"/>
-              <w:bottom w:type="dxa" w:w="40"/>
-              <w:right w:type="dxa" w:w="100"/>
-            </w:tcMar>
-          </w:tcPr>
-          <w:p>
-            <w:pPr>
-              <w:spacing w:after="0"/>
-            </w:pPr>
-            <w:r>
-              <w:rPr>
-                <w:rFonts w:ascii="TH Sarabun New" w:cs="TH Sarabun New" w:eastAsia="TH Sarabun New" w:hAnsi="TH Sarabun New"/>
-                <w:b w:val="false"/>
-                <w:bCs w:val="false"/>
-                <w:sz w:val="28"/>
-                <w:szCs w:val="28"/>
-              </w:rPr>
-              <w:t xml:space="preserve">1 · กล่องขนส่งผลไม้ห้องเย็น</w:t>
-            </w:r>
-          </w:p>
-        </w:tc>
-        <w:tc>
-          <w:tcPr>
-            <w:tcW w:type="dxa" w:w="3168"/>
-            <w:tcBorders>
-              <w:top w:val="single" w:color="BFBFBF" w:sz="4"/>
-              <w:left w:val="single" w:color="BFBFBF" w:sz="4"/>
-              <w:bottom w:val="single" w:color="BFBFBF" w:sz="4"/>
-              <w:right w:val="single" w:color="BFBFBF" w:sz="4"/>
-            </w:tcBorders>
-            <w:tcMar>
-              <w:top w:type="dxa" w:w="40"/>
-              <w:left w:type="dxa" w:w="100"/>
-              <w:bottom w:type="dxa" w:w="40"/>
-              <w:right w:type="dxa" w:w="100"/>
-            </w:tcMar>
-          </w:tcPr>
-          <w:p>
-            <w:pPr>
-              <w:spacing w:after="0"/>
-            </w:pPr>
-            <w:r>
-              <w:rPr>
-                <w:rFonts w:ascii="TH Sarabun New" w:cs="TH Sarabun New" w:eastAsia="TH Sarabun New" w:hAnsi="TH Sarabun New"/>
-                <w:b w:val="false"/>
-                <w:bCs w:val="false"/>
-                <w:sz w:val="28"/>
-                <w:szCs w:val="28"/>
-              </w:rPr>
-              <w:t xml:space="preserve">SHT40 ร้อนเกิน + BMI270 กระแทก · SW5 เริ่มเที่ยว</w:t>
-            </w:r>
-          </w:p>
-        </w:tc>
-        <w:tc>
-          <w:tcPr>
-            <w:tcW w:type="dxa" w:w="2400"/>
-            <w:tcBorders>
-              <w:top w:val="single" w:color="BFBFBF" w:sz="4"/>
-              <w:left w:val="single" w:color="BFBFBF" w:sz="4"/>
-              <w:bottom w:val="single" w:color="BFBFBF" w:sz="4"/>
-              <w:right w:val="single" w:color="BFBFBF" w:sz="4"/>
-            </w:tcBorders>
-            <w:tcMar>
-              <w:top w:type="dxa" w:w="40"/>
-              <w:left w:type="dxa" w:w="100"/>
-              <w:bottom w:type="dxa" w:w="40"/>
-              <w:right w:type="dxa" w:w="100"/>
-            </w:tcMar>
-          </w:tcPr>
-          <w:p>
-            <w:pPr>
-              <w:spacing w:after="0"/>
-            </w:pPr>
-            <w:r>
-              <w:rPr>
-                <w:rFonts w:ascii="TH Sarabun New" w:cs="TH Sarabun New" w:eastAsia="TH Sarabun New" w:hAnsi="TH Sarabun New"/>
-                <w:b w:val="false"/>
-                <w:bCs w:val="false"/>
-                <w:sz w:val="28"/>
-                <w:szCs w:val="28"/>
-              </w:rPr>
-              <w:t xml:space="preserve">sf2_02 (มี az อยู่แล้ว)</w:t>
-            </w:r>
-          </w:p>
-        </w:tc>
-        <w:tc>
-          <w:tcPr>
-            <w:tcW w:type="dxa" w:w="2100"/>
-            <w:tcBorders>
-              <w:top w:val="single" w:color="BFBFBF" w:sz="4"/>
-              <w:left w:val="single" w:color="BFBFBF" w:sz="4"/>
-              <w:bottom w:val="single" w:color="BFBFBF" w:sz="4"/>
-              <w:right w:val="single" w:color="BFBFBF" w:sz="4"/>
-            </w:tcBorders>
-            <w:tcMar>
-              <w:top w:type="dxa" w:w="40"/>
-              <w:left w:type="dxa" w:w="100"/>
-              <w:bottom w:type="dxa" w:w="40"/>
-              <w:right w:type="dxa" w:w="100"/>
-            </w:tcMar>
-          </w:tcPr>
-          <w:p>
-            <w:pPr>
-              <w:spacing w:after="0"/>
-            </w:pPr>
-            <w:r>
-              <w:rPr>
-                <w:rFonts w:ascii="TH Sarabun New" w:cs="TH Sarabun New" w:eastAsia="TH Sarabun New" w:hAnsi="TH Sarabun New"/>
-                <w:b w:val="false"/>
-                <w:bCs w:val="false"/>
-                <w:sz w:val="28"/>
-                <w:szCs w:val="28"/>
-              </w:rPr>
-              <w:t xml:space="preserve">sf1_02 · sf1_04</w:t>
+            <w:tcW w:type="dxa" w:w="2300"/>
+            <w:tcBorders>
+              <w:top w:val="single" w:color="BFBFBF" w:sz="4"/>
+              <w:left w:val="single" w:color="BFBFBF" w:sz="4"/>
+              <w:bottom w:val="single" w:color="BFBFBF" w:sz="4"/>
+              <w:right w:val="single" w:color="BFBFBF" w:sz="4"/>
+            </w:tcBorders>
+            <w:tcMar>
+              <w:top w:type="dxa" w:w="40"/>
+              <w:left w:type="dxa" w:w="100"/>
+              <w:bottom w:type="dxa" w:w="40"/>
+              <w:right w:type="dxa" w:w="100"/>
+            </w:tcMar>
+          </w:tcPr>
+          <w:p>
+            <w:pPr>
+              <w:spacing w:after="0"/>
+            </w:pPr>
+            <w:r>
+              <w:rPr>
+                <w:rFonts w:ascii="TH Sarabun New" w:cs="TH Sarabun New" w:eastAsia="TH Sarabun New" w:hAnsi="TH Sarabun New"/>
+                <w:b w:val="false"/>
+                <w:bCs w:val="false"/>
+                <w:sz w:val="28"/>
+                <w:szCs w:val="28"/>
+              </w:rPr>
+              <w:t xml:space="preserve">3 · ไซโลข้าวเปลือก</w:t>
+            </w:r>
+          </w:p>
+        </w:tc>
+        <w:tc>
+          <w:tcPr>
+            <w:tcW w:type="dxa" w:w="1700"/>
+            <w:tcBorders>
+              <w:top w:val="single" w:color="BFBFBF" w:sz="4"/>
+              <w:left w:val="single" w:color="BFBFBF" w:sz="4"/>
+              <w:bottom w:val="single" w:color="BFBFBF" w:sz="4"/>
+              <w:right w:val="single" w:color="BFBFBF" w:sz="4"/>
+            </w:tcBorders>
+            <w:tcMar>
+              <w:top w:type="dxa" w:w="40"/>
+              <w:left w:type="dxa" w:w="100"/>
+              <w:bottom w:type="dxa" w:w="40"/>
+              <w:right w:type="dxa" w:w="100"/>
+            </w:tcMar>
+          </w:tcPr>
+          <w:p>
+            <w:pPr>
+              <w:spacing w:after="0"/>
+            </w:pPr>
+            <w:r>
+              <w:rPr>
+                <w:rFonts w:ascii="TH Sarabun New" w:cs="TH Sarabun New" w:eastAsia="TH Sarabun New" w:hAnsi="TH Sarabun New"/>
+                <w:b w:val="false"/>
+                <w:bCs w:val="false"/>
+                <w:sz w:val="28"/>
+                <w:szCs w:val="28"/>
+              </w:rPr>
+              <w:t xml:space="preserve">sf2_04</w:t>
+            </w:r>
+          </w:p>
+        </w:tc>
+        <w:tc>
+          <w:tcPr>
+            <w:tcW w:type="dxa" w:w="3484"/>
+            <w:tcBorders>
+              <w:top w:val="single" w:color="BFBFBF" w:sz="4"/>
+              <w:left w:val="single" w:color="BFBFBF" w:sz="4"/>
+              <w:bottom w:val="single" w:color="BFBFBF" w:sz="4"/>
+              <w:right w:val="single" w:color="BFBFBF" w:sz="4"/>
+            </w:tcBorders>
+            <w:tcMar>
+              <w:top w:type="dxa" w:w="40"/>
+              <w:left w:type="dxa" w:w="100"/>
+              <w:bottom w:type="dxa" w:w="40"/>
+              <w:right w:type="dxa" w:w="100"/>
+            </w:tcMar>
+          </w:tcPr>
+          <w:p>
+            <w:pPr>
+              <w:spacing w:after="0"/>
+            </w:pPr>
+            <w:r>
+              <w:rPr>
+                <w:rFonts w:ascii="TH Sarabun New" w:cs="TH Sarabun New" w:eastAsia="TH Sarabun New" w:hAnsi="TH Sarabun New"/>
+                <w:b w:val="false"/>
+                <w:bCs w:val="false"/>
+                <w:sz w:val="28"/>
+                <w:szCs w:val="28"/>
+              </w:rPr>
+              <w:t xml:space="preserve">เตือนความชื้นในไซโลสูง · คนงานกดรับทราบ · มือถือเห็น</w:t>
+            </w:r>
+          </w:p>
+        </w:tc>
+        <w:tc>
+          <w:tcPr>
+            <w:tcW w:type="dxa" w:w="2884"/>
+            <w:tcBorders>
+              <w:top w:val="single" w:color="BFBFBF" w:sz="4"/>
+              <w:left w:val="single" w:color="BFBFBF" w:sz="4"/>
+              <w:bottom w:val="single" w:color="BFBFBF" w:sz="4"/>
+              <w:right w:val="single" w:color="BFBFBF" w:sz="4"/>
+            </w:tcBorders>
+            <w:tcMar>
+              <w:top w:type="dxa" w:w="40"/>
+              <w:left w:type="dxa" w:w="100"/>
+              <w:bottom w:type="dxa" w:w="40"/>
+              <w:right w:type="dxa" w:w="100"/>
+            </w:tcMar>
+          </w:tcPr>
+          <w:p>
+            <w:pPr>
+              <w:spacing w:after="0"/>
+            </w:pPr>
+            <w:r>
+              <w:rPr>
+                <w:rFonts w:ascii="TH Sarabun New" w:cs="TH Sarabun New" w:eastAsia="TH Sarabun New" w:hAnsi="TH Sarabun New"/>
+                <w:b w:val="false"/>
+                <w:bCs w:val="false"/>
+                <w:sz w:val="28"/>
+                <w:szCs w:val="28"/>
+              </w:rPr>
+              <w:t xml:space="preserve">แนวโน้มความชื้นบนเว็บ</w:t>
             </w:r>
           </w:p>
         </w:tc>
@@ -1685,129 +1721,129 @@
       <w:tr>
         <w:tc>
           <w:tcPr>
-            <w:tcW w:type="dxa" w:w="2700"/>
-            <w:tcBorders>
-              <w:top w:val="single" w:color="BFBFBF" w:sz="4"/>
-              <w:left w:val="single" w:color="BFBFBF" w:sz="4"/>
-              <w:bottom w:val="single" w:color="BFBFBF" w:sz="4"/>
-              <w:right w:val="single" w:color="BFBFBF" w:sz="4"/>
-            </w:tcBorders>
-            <w:tcMar>
-              <w:top w:type="dxa" w:w="40"/>
-              <w:left w:type="dxa" w:w="100"/>
-              <w:bottom w:type="dxa" w:w="40"/>
-              <w:right w:type="dxa" w:w="100"/>
-            </w:tcMar>
-          </w:tcPr>
-          <w:p>
-            <w:pPr>
-              <w:spacing w:after="0"/>
-            </w:pPr>
-            <w:r>
-              <w:rPr>
-                <w:rFonts w:ascii="TH Sarabun New" w:cs="TH Sarabun New" w:eastAsia="TH Sarabun New" w:hAnsi="TH Sarabun New"/>
-                <w:b w:val="false"/>
-                <w:bCs w:val="false"/>
-                <w:sz w:val="28"/>
-                <w:szCs w:val="28"/>
-              </w:rPr>
-              <w:t xml:space="preserve">2 · รถส่งผลผลิตถึงตลาด</w:t>
-            </w:r>
-          </w:p>
-        </w:tc>
-        <w:tc>
-          <w:tcPr>
-            <w:tcW w:type="dxa" w:w="3168"/>
-            <w:tcBorders>
-              <w:top w:val="single" w:color="BFBFBF" w:sz="4"/>
-              <w:left w:val="single" w:color="BFBFBF" w:sz="4"/>
-              <w:bottom w:val="single" w:color="BFBFBF" w:sz="4"/>
-              <w:right w:val="single" w:color="BFBFBF" w:sz="4"/>
-            </w:tcBorders>
-            <w:tcMar>
-              <w:top w:type="dxa" w:w="40"/>
-              <w:left w:type="dxa" w:w="100"/>
-              <w:bottom w:type="dxa" w:w="40"/>
-              <w:right w:type="dxa" w:w="100"/>
-            </w:tcMar>
-          </w:tcPr>
-          <w:p>
-            <w:pPr>
-              <w:spacing w:after="0"/>
-            </w:pPr>
-            <w:r>
-              <w:rPr>
-                <w:rFonts w:ascii="TH Sarabun New" w:cs="TH Sarabun New" w:eastAsia="TH Sarabun New" w:hAnsi="TH Sarabun New"/>
-                <w:b w:val="false"/>
-                <w:bCs w:val="false"/>
-                <w:sz w:val="28"/>
-                <w:szCs w:val="28"/>
-              </w:rPr>
-              <w:t xml:space="preserve">BMI270 ถนนขรุขระ · SW6 = ส่งมอบแล้ว</w:t>
-            </w:r>
-          </w:p>
-        </w:tc>
-        <w:tc>
-          <w:tcPr>
-            <w:tcW w:type="dxa" w:w="2400"/>
-            <w:tcBorders>
-              <w:top w:val="single" w:color="BFBFBF" w:sz="4"/>
-              <w:left w:val="single" w:color="BFBFBF" w:sz="4"/>
-              <w:bottom w:val="single" w:color="BFBFBF" w:sz="4"/>
-              <w:right w:val="single" w:color="BFBFBF" w:sz="4"/>
-            </w:tcBorders>
-            <w:tcMar>
-              <w:top w:type="dxa" w:w="40"/>
-              <w:left w:type="dxa" w:w="100"/>
-              <w:bottom w:type="dxa" w:w="40"/>
-              <w:right w:type="dxa" w:w="100"/>
-            </w:tcMar>
-          </w:tcPr>
-          <w:p>
-            <w:pPr>
-              <w:spacing w:after="0"/>
-            </w:pPr>
-            <w:r>
-              <w:rPr>
-                <w:rFonts w:ascii="TH Sarabun New" w:cs="TH Sarabun New" w:eastAsia="TH Sarabun New" w:hAnsi="TH Sarabun New"/>
-                <w:b w:val="false"/>
-                <w:bCs w:val="false"/>
-                <w:sz w:val="28"/>
-                <w:szCs w:val="28"/>
-              </w:rPr>
-              <w:t xml:space="preserve">sf2_02</w:t>
-            </w:r>
-          </w:p>
-        </w:tc>
-        <w:tc>
-          <w:tcPr>
-            <w:tcW w:type="dxa" w:w="2100"/>
-            <w:tcBorders>
-              <w:top w:val="single" w:color="BFBFBF" w:sz="4"/>
-              <w:left w:val="single" w:color="BFBFBF" w:sz="4"/>
-              <w:bottom w:val="single" w:color="BFBFBF" w:sz="4"/>
-              <w:right w:val="single" w:color="BFBFBF" w:sz="4"/>
-            </w:tcBorders>
-            <w:tcMar>
-              <w:top w:type="dxa" w:w="40"/>
-              <w:left w:type="dxa" w:w="100"/>
-              <w:bottom w:type="dxa" w:w="40"/>
-              <w:right w:type="dxa" w:w="100"/>
-            </w:tcMar>
-          </w:tcPr>
-          <w:p>
-            <w:pPr>
-              <w:spacing w:after="0"/>
-            </w:pPr>
-            <w:r>
-              <w:rPr>
-                <w:rFonts w:ascii="TH Sarabun New" w:cs="TH Sarabun New" w:eastAsia="TH Sarabun New" w:hAnsi="TH Sarabun New"/>
-                <w:b w:val="false"/>
-                <w:bCs w:val="false"/>
-                <w:sz w:val="28"/>
-                <w:szCs w:val="28"/>
-              </w:rPr>
-              <w:t xml:space="preserve">sf1_04</w:t>
+            <w:tcW w:type="dxa" w:w="2300"/>
+            <w:tcBorders>
+              <w:top w:val="single" w:color="BFBFBF" w:sz="4"/>
+              <w:left w:val="single" w:color="BFBFBF" w:sz="4"/>
+              <w:bottom w:val="single" w:color="BFBFBF" w:sz="4"/>
+              <w:right w:val="single" w:color="BFBFBF" w:sz="4"/>
+            </w:tcBorders>
+            <w:tcMar>
+              <w:top w:type="dxa" w:w="40"/>
+              <w:left w:type="dxa" w:w="100"/>
+              <w:bottom w:type="dxa" w:w="40"/>
+              <w:right w:type="dxa" w:w="100"/>
+            </w:tcMar>
+          </w:tcPr>
+          <w:p>
+            <w:pPr>
+              <w:spacing w:after="0"/>
+            </w:pPr>
+            <w:r>
+              <w:rPr>
+                <w:rFonts w:ascii="TH Sarabun New" w:cs="TH Sarabun New" w:eastAsia="TH Sarabun New" w:hAnsi="TH Sarabun New"/>
+                <w:b w:val="false"/>
+                <w:bCs w:val="false"/>
+                <w:sz w:val="28"/>
+                <w:szCs w:val="28"/>
+              </w:rPr>
+              <w:t xml:space="preserve">8 · เล้าไก่กันเครียดฝูง</w:t>
+            </w:r>
+          </w:p>
+        </w:tc>
+        <w:tc>
+          <w:tcPr>
+            <w:tcW w:type="dxa" w:w="1700"/>
+            <w:tcBorders>
+              <w:top w:val="single" w:color="BFBFBF" w:sz="4"/>
+              <w:left w:val="single" w:color="BFBFBF" w:sz="4"/>
+              <w:bottom w:val="single" w:color="BFBFBF" w:sz="4"/>
+              <w:right w:val="single" w:color="BFBFBF" w:sz="4"/>
+            </w:tcBorders>
+            <w:tcMar>
+              <w:top w:type="dxa" w:w="40"/>
+              <w:left w:type="dxa" w:w="100"/>
+              <w:bottom w:type="dxa" w:w="40"/>
+              <w:right w:type="dxa" w:w="100"/>
+            </w:tcMar>
+          </w:tcPr>
+          <w:p>
+            <w:pPr>
+              <w:spacing w:after="0"/>
+            </w:pPr>
+            <w:r>
+              <w:rPr>
+                <w:rFonts w:ascii="TH Sarabun New" w:cs="TH Sarabun New" w:eastAsia="TH Sarabun New" w:hAnsi="TH Sarabun New"/>
+                <w:b w:val="false"/>
+                <w:bCs w:val="false"/>
+                <w:sz w:val="28"/>
+                <w:szCs w:val="28"/>
+              </w:rPr>
+              <w:t xml:space="preserve">sf2_04</w:t>
+            </w:r>
+          </w:p>
+        </w:tc>
+        <w:tc>
+          <w:tcPr>
+            <w:tcW w:type="dxa" w:w="3484"/>
+            <w:tcBorders>
+              <w:top w:val="single" w:color="BFBFBF" w:sz="4"/>
+              <w:left w:val="single" w:color="BFBFBF" w:sz="4"/>
+              <w:bottom w:val="single" w:color="BFBFBF" w:sz="4"/>
+              <w:right w:val="single" w:color="BFBFBF" w:sz="4"/>
+            </w:tcBorders>
+            <w:tcMar>
+              <w:top w:type="dxa" w:w="40"/>
+              <w:left w:type="dxa" w:w="100"/>
+              <w:bottom w:type="dxa" w:w="40"/>
+              <w:right w:type="dxa" w:w="100"/>
+            </w:tcMar>
+          </w:tcPr>
+          <w:p>
+            <w:pPr>
+              <w:spacing w:after="0"/>
+            </w:pPr>
+            <w:r>
+              <w:rPr>
+                <w:rFonts w:ascii="TH Sarabun New" w:cs="TH Sarabun New" w:eastAsia="TH Sarabun New" w:hAnsi="TH Sarabun New"/>
+                <w:b w:val="false"/>
+                <w:bCs w:val="false"/>
+                <w:sz w:val="28"/>
+                <w:szCs w:val="28"/>
+              </w:rPr>
+              <w:t xml:space="preserve">เตือนเล้าร้อน/ชื้นเกิน · รับทราบ · มือถือเห็น</w:t>
+            </w:r>
+          </w:p>
+        </w:tc>
+        <w:tc>
+          <w:tcPr>
+            <w:tcW w:type="dxa" w:w="2884"/>
+            <w:tcBorders>
+              <w:top w:val="single" w:color="BFBFBF" w:sz="4"/>
+              <w:left w:val="single" w:color="BFBFBF" w:sz="4"/>
+              <w:bottom w:val="single" w:color="BFBFBF" w:sz="4"/>
+              <w:right w:val="single" w:color="BFBFBF" w:sz="4"/>
+            </w:tcBorders>
+            <w:tcMar>
+              <w:top w:type="dxa" w:w="40"/>
+              <w:left w:type="dxa" w:w="100"/>
+              <w:bottom w:type="dxa" w:w="40"/>
+              <w:right w:type="dxa" w:w="100"/>
+            </w:tcMar>
+          </w:tcPr>
+          <w:p>
+            <w:pPr>
+              <w:spacing w:after="0"/>
+            </w:pPr>
+            <w:r>
+              <w:rPr>
+                <w:rFonts w:ascii="TH Sarabun New" w:cs="TH Sarabun New" w:eastAsia="TH Sarabun New" w:hAnsi="TH Sarabun New"/>
+                <w:b w:val="false"/>
+                <w:bCs w:val="false"/>
+                <w:sz w:val="28"/>
+                <w:szCs w:val="28"/>
+              </w:rPr>
+              <w:t xml:space="preserve">นับเสียงดังจากไมค์ (sf3_02)</w:t>
             </w:r>
           </w:p>
         </w:tc>
@@ -1815,71 +1851,39 @@
       <w:tr>
         <w:tc>
           <w:tcPr>
-            <w:tcW w:type="dxa" w:w="2700"/>
-            <w:tcBorders>
-              <w:top w:val="single" w:color="BFBFBF" w:sz="4"/>
-              <w:left w:val="single" w:color="BFBFBF" w:sz="4"/>
-              <w:bottom w:val="single" w:color="BFBFBF" w:sz="4"/>
-              <w:right w:val="single" w:color="BFBFBF" w:sz="4"/>
-            </w:tcBorders>
-            <w:tcMar>
-              <w:top w:type="dxa" w:w="40"/>
-              <w:left w:type="dxa" w:w="100"/>
-              <w:bottom w:type="dxa" w:w="40"/>
-              <w:right w:type="dxa" w:w="100"/>
-            </w:tcMar>
-          </w:tcPr>
-          <w:p>
-            <w:pPr>
-              <w:spacing w:after="0"/>
-            </w:pPr>
-            <w:r>
-              <w:rPr>
-                <w:rFonts w:ascii="TH Sarabun New" w:cs="TH Sarabun New" w:eastAsia="TH Sarabun New" w:hAnsi="TH Sarabun New"/>
-                <w:b w:val="false"/>
-                <w:bCs w:val="false"/>
-                <w:sz w:val="28"/>
-                <w:szCs w:val="28"/>
-              </w:rPr>
-              <w:t xml:space="preserve">3 · ไซโลข้าวเปลือก</w:t>
-            </w:r>
-          </w:p>
-        </w:tc>
-        <w:tc>
-          <w:tcPr>
-            <w:tcW w:type="dxa" w:w="3168"/>
-            <w:tcBorders>
-              <w:top w:val="single" w:color="BFBFBF" w:sz="4"/>
-              <w:left w:val="single" w:color="BFBFBF" w:sz="4"/>
-              <w:bottom w:val="single" w:color="BFBFBF" w:sz="4"/>
-              <w:right w:val="single" w:color="BFBFBF" w:sz="4"/>
-            </w:tcBorders>
-            <w:tcMar>
-              <w:top w:type="dxa" w:w="40"/>
-              <w:left w:type="dxa" w:w="100"/>
-              <w:bottom w:type="dxa" w:w="40"/>
-              <w:right w:type="dxa" w:w="100"/>
-            </w:tcMar>
-          </w:tcPr>
-          <w:p>
-            <w:pPr>
-              <w:spacing w:after="0"/>
-            </w:pPr>
-            <w:r>
-              <w:rPr>
-                <w:rFonts w:ascii="TH Sarabun New" w:cs="TH Sarabun New" w:eastAsia="TH Sarabun New" w:hAnsi="TH Sarabun New"/>
-                <w:b w:val="false"/>
-                <w:bCs w:val="false"/>
-                <w:sz w:val="28"/>
-                <w:szCs w:val="28"/>
-              </w:rPr>
-              <w:t xml:space="preserve">ความชื้นสูงเกินเกณฑ์ (ตัดเรดาร์ออก)</w:t>
-            </w:r>
-          </w:p>
-        </w:tc>
-        <w:tc>
-          <w:tcPr>
-            <w:tcW w:type="dxa" w:w="2400"/>
+            <w:tcW w:type="dxa" w:w="2300"/>
+            <w:tcBorders>
+              <w:top w:val="single" w:color="BFBFBF" w:sz="4"/>
+              <w:left w:val="single" w:color="BFBFBF" w:sz="4"/>
+              <w:bottom w:val="single" w:color="BFBFBF" w:sz="4"/>
+              <w:right w:val="single" w:color="BFBFBF" w:sz="4"/>
+            </w:tcBorders>
+            <w:tcMar>
+              <w:top w:type="dxa" w:w="40"/>
+              <w:left w:type="dxa" w:w="100"/>
+              <w:bottom w:type="dxa" w:w="40"/>
+              <w:right w:type="dxa" w:w="100"/>
+            </w:tcMar>
+          </w:tcPr>
+          <w:p>
+            <w:pPr>
+              <w:spacing w:after="0"/>
+            </w:pPr>
+            <w:r>
+              <w:rPr>
+                <w:rFonts w:ascii="TH Sarabun New" w:cs="TH Sarabun New" w:eastAsia="TH Sarabun New" w:hAnsi="TH Sarabun New"/>
+                <w:b w:val="false"/>
+                <w:bCs w:val="false"/>
+                <w:sz w:val="28"/>
+                <w:szCs w:val="28"/>
+              </w:rPr>
+              <w:t xml:space="preserve">1 · กล่องขนส่งห้องเย็น</w:t>
+            </w:r>
+          </w:p>
+        </w:tc>
+        <w:tc>
+          <w:tcPr>
+            <w:tcW w:type="dxa" w:w="1700"/>
             <w:tcBorders>
               <w:top w:val="single" w:color="BFBFBF" w:sz="4"/>
               <w:left w:val="single" w:color="BFBFBF" w:sz="4"/>
@@ -1911,33 +1915,65 @@
         </w:tc>
         <w:tc>
           <w:tcPr>
-            <w:tcW w:type="dxa" w:w="2100"/>
-            <w:tcBorders>
-              <w:top w:val="single" w:color="BFBFBF" w:sz="4"/>
-              <w:left w:val="single" w:color="BFBFBF" w:sz="4"/>
-              <w:bottom w:val="single" w:color="BFBFBF" w:sz="4"/>
-              <w:right w:val="single" w:color="BFBFBF" w:sz="4"/>
-            </w:tcBorders>
-            <w:tcMar>
-              <w:top w:type="dxa" w:w="40"/>
-              <w:left w:type="dxa" w:w="100"/>
-              <w:bottom w:type="dxa" w:w="40"/>
-              <w:right w:type="dxa" w:w="100"/>
-            </w:tcMar>
-          </w:tcPr>
-          <w:p>
-            <w:pPr>
-              <w:spacing w:after="0"/>
-            </w:pPr>
-            <w:r>
-              <w:rPr>
-                <w:rFonts w:ascii="TH Sarabun New" w:cs="TH Sarabun New" w:eastAsia="TH Sarabun New" w:hAnsi="TH Sarabun New"/>
-                <w:b w:val="false"/>
-                <w:bCs w:val="false"/>
-                <w:sz w:val="28"/>
-                <w:szCs w:val="28"/>
-              </w:rPr>
-              <w:t xml:space="preserve">sf1_02</w:t>
+            <w:tcW w:type="dxa" w:w="3484"/>
+            <w:tcBorders>
+              <w:top w:val="single" w:color="BFBFBF" w:sz="4"/>
+              <w:left w:val="single" w:color="BFBFBF" w:sz="4"/>
+              <w:bottom w:val="single" w:color="BFBFBF" w:sz="4"/>
+              <w:right w:val="single" w:color="BFBFBF" w:sz="4"/>
+            </w:tcBorders>
+            <w:tcMar>
+              <w:top w:type="dxa" w:w="40"/>
+              <w:left w:type="dxa" w:w="100"/>
+              <w:bottom w:type="dxa" w:w="40"/>
+              <w:right w:type="dxa" w:w="100"/>
+            </w:tcMar>
+          </w:tcPr>
+          <w:p>
+            <w:pPr>
+              <w:spacing w:after="0"/>
+            </w:pPr>
+            <w:r>
+              <w:rPr>
+                <w:rFonts w:ascii="TH Sarabun New" w:cs="TH Sarabun New" w:eastAsia="TH Sarabun New" w:hAnsi="TH Sarabun New"/>
+                <w:b w:val="false"/>
+                <w:bCs w:val="false"/>
+                <w:sz w:val="28"/>
+                <w:szCs w:val="28"/>
+              </w:rPr>
+              <w:t xml:space="preserve">เตือนกล่องร้อนเกินระหว่างขนส่ง · รับทราบ · มือถือเห็น</w:t>
+            </w:r>
+          </w:p>
+        </w:tc>
+        <w:tc>
+          <w:tcPr>
+            <w:tcW w:type="dxa" w:w="2884"/>
+            <w:tcBorders>
+              <w:top w:val="single" w:color="BFBFBF" w:sz="4"/>
+              <w:left w:val="single" w:color="BFBFBF" w:sz="4"/>
+              <w:bottom w:val="single" w:color="BFBFBF" w:sz="4"/>
+              <w:right w:val="single" w:color="BFBFBF" w:sz="4"/>
+            </w:tcBorders>
+            <w:tcMar>
+              <w:top w:type="dxa" w:w="40"/>
+              <w:left w:type="dxa" w:w="100"/>
+              <w:bottom w:type="dxa" w:w="40"/>
+              <w:right w:type="dxa" w:w="100"/>
+            </w:tcMar>
+          </w:tcPr>
+          <w:p>
+            <w:pPr>
+              <w:spacing w:after="0"/>
+            </w:pPr>
+            <w:r>
+              <w:rPr>
+                <w:rFonts w:ascii="TH Sarabun New" w:cs="TH Sarabun New" w:eastAsia="TH Sarabun New" w:hAnsi="TH Sarabun New"/>
+                <w:b w:val="false"/>
+                <w:bCs w:val="false"/>
+                <w:sz w:val="28"/>
+                <w:szCs w:val="28"/>
+              </w:rPr>
+              <w:t xml:space="preserve">นับการกระแทก (sf1_04)</w:t>
             </w:r>
           </w:p>
         </w:tc>
@@ -1945,129 +1981,129 @@
       <w:tr>
         <w:tc>
           <w:tcPr>
-            <w:tcW w:type="dxa" w:w="2700"/>
-            <w:tcBorders>
-              <w:top w:val="single" w:color="BFBFBF" w:sz="4"/>
-              <w:left w:val="single" w:color="BFBFBF" w:sz="4"/>
-              <w:bottom w:val="single" w:color="BFBFBF" w:sz="4"/>
-              <w:right w:val="single" w:color="BFBFBF" w:sz="4"/>
-            </w:tcBorders>
-            <w:tcMar>
-              <w:top w:type="dxa" w:w="40"/>
-              <w:left w:type="dxa" w:w="100"/>
-              <w:bottom w:type="dxa" w:w="40"/>
-              <w:right w:type="dxa" w:w="100"/>
-            </w:tcMar>
-          </w:tcPr>
-          <w:p>
-            <w:pPr>
-              <w:spacing w:after="0"/>
-            </w:pPr>
-            <w:r>
-              <w:rPr>
-                <w:rFonts w:ascii="TH Sarabun New" w:cs="TH Sarabun New" w:eastAsia="TH Sarabun New" w:hAnsi="TH Sarabun New"/>
-                <w:b w:val="false"/>
-                <w:bCs w:val="false"/>
-                <w:sz w:val="28"/>
-                <w:szCs w:val="28"/>
-              </w:rPr>
-              <w:t xml:space="preserve">4 · โรงเรือนอัจฉริยะ</w:t>
-            </w:r>
-          </w:p>
-        </w:tc>
-        <w:tc>
-          <w:tcPr>
-            <w:tcW w:type="dxa" w:w="3168"/>
-            <w:tcBorders>
-              <w:top w:val="single" w:color="BFBFBF" w:sz="4"/>
-              <w:left w:val="single" w:color="BFBFBF" w:sz="4"/>
-              <w:bottom w:val="single" w:color="BFBFBF" w:sz="4"/>
-              <w:right w:val="single" w:color="BFBFBF" w:sz="4"/>
-            </w:tcBorders>
-            <w:tcMar>
-              <w:top w:type="dxa" w:w="40"/>
-              <w:left w:type="dxa" w:w="100"/>
-              <w:bottom w:type="dxa" w:w="40"/>
-              <w:right w:type="dxa" w:w="100"/>
-            </w:tcMar>
-          </w:tcPr>
-          <w:p>
-            <w:pPr>
-              <w:spacing w:after="0"/>
-            </w:pPr>
-            <w:r>
-              <w:rPr>
-                <w:rFonts w:ascii="TH Sarabun New" w:cs="TH Sarabun New" w:eastAsia="TH Sarabun New" w:hAnsi="TH Sarabun New"/>
-                <w:b w:val="false"/>
-                <w:bCs w:val="false"/>
-                <w:sz w:val="28"/>
-                <w:szCs w:val="28"/>
-              </w:rPr>
-              <w:t xml:space="preserve">ดินจำลองด้วย VR · สั่งรดน้ำจากมือถือ</w:t>
-            </w:r>
-          </w:p>
-        </w:tc>
-        <w:tc>
-          <w:tcPr>
-            <w:tcW w:type="dxa" w:w="2400"/>
-            <w:tcBorders>
-              <w:top w:val="single" w:color="BFBFBF" w:sz="4"/>
-              <w:left w:val="single" w:color="BFBFBF" w:sz="4"/>
-              <w:bottom w:val="single" w:color="BFBFBF" w:sz="4"/>
-              <w:right w:val="single" w:color="BFBFBF" w:sz="4"/>
-            </w:tcBorders>
-            <w:tcMar>
-              <w:top w:type="dxa" w:w="40"/>
-              <w:left w:type="dxa" w:w="100"/>
-              <w:bottom w:type="dxa" w:w="40"/>
-              <w:right w:type="dxa" w:w="100"/>
-            </w:tcMar>
-          </w:tcPr>
-          <w:p>
-            <w:pPr>
-              <w:spacing w:after="0"/>
-            </w:pPr>
-            <w:r>
-              <w:rPr>
-                <w:rFonts w:ascii="TH Sarabun New" w:cs="TH Sarabun New" w:eastAsia="TH Sarabun New" w:hAnsi="TH Sarabun New"/>
-                <w:b w:val="false"/>
-                <w:bCs w:val="false"/>
-                <w:sz w:val="28"/>
-                <w:szCs w:val="28"/>
-              </w:rPr>
-              <w:t xml:space="preserve">sf2_03</w:t>
-            </w:r>
-          </w:p>
-        </w:tc>
-        <w:tc>
-          <w:tcPr>
-            <w:tcW w:type="dxa" w:w="2100"/>
-            <w:tcBorders>
-              <w:top w:val="single" w:color="BFBFBF" w:sz="4"/>
-              <w:left w:val="single" w:color="BFBFBF" w:sz="4"/>
-              <w:bottom w:val="single" w:color="BFBFBF" w:sz="4"/>
-              <w:right w:val="single" w:color="BFBFBF" w:sz="4"/>
-            </w:tcBorders>
-            <w:tcMar>
-              <w:top w:type="dxa" w:w="40"/>
-              <w:left w:type="dxa" w:w="100"/>
-              <w:bottom w:type="dxa" w:w="40"/>
-              <w:right w:type="dxa" w:w="100"/>
-            </w:tcMar>
-          </w:tcPr>
-          <w:p>
-            <w:pPr>
-              <w:spacing w:after="0"/>
-            </w:pPr>
-            <w:r>
-              <w:rPr>
-                <w:rFonts w:ascii="TH Sarabun New" w:cs="TH Sarabun New" w:eastAsia="TH Sarabun New" w:hAnsi="TH Sarabun New"/>
-                <w:b w:val="false"/>
-                <w:bCs w:val="false"/>
-                <w:sz w:val="28"/>
-                <w:szCs w:val="28"/>
-              </w:rPr>
-              <w:t xml:space="preserve">sf1_03</w:t>
+            <w:tcW w:type="dxa" w:w="2300"/>
+            <w:tcBorders>
+              <w:top w:val="single" w:color="BFBFBF" w:sz="4"/>
+              <w:left w:val="single" w:color="BFBFBF" w:sz="4"/>
+              <w:bottom w:val="single" w:color="BFBFBF" w:sz="4"/>
+              <w:right w:val="single" w:color="BFBFBF" w:sz="4"/>
+            </w:tcBorders>
+            <w:tcMar>
+              <w:top w:type="dxa" w:w="40"/>
+              <w:left w:type="dxa" w:w="100"/>
+              <w:bottom w:type="dxa" w:w="40"/>
+              <w:right w:type="dxa" w:w="100"/>
+            </w:tcMar>
+          </w:tcPr>
+          <w:p>
+            <w:pPr>
+              <w:spacing w:after="0"/>
+            </w:pPr>
+            <w:r>
+              <w:rPr>
+                <w:rFonts w:ascii="TH Sarabun New" w:cs="TH Sarabun New" w:eastAsia="TH Sarabun New" w:hAnsi="TH Sarabun New"/>
+                <w:b w:val="false"/>
+                <w:bCs w:val="false"/>
+                <w:sz w:val="28"/>
+                <w:szCs w:val="28"/>
+              </w:rPr>
+              <w:t xml:space="preserve">2 · รถส่งผลผลิตถึงตลาด</w:t>
+            </w:r>
+          </w:p>
+        </w:tc>
+        <w:tc>
+          <w:tcPr>
+            <w:tcW w:type="dxa" w:w="1700"/>
+            <w:tcBorders>
+              <w:top w:val="single" w:color="BFBFBF" w:sz="4"/>
+              <w:left w:val="single" w:color="BFBFBF" w:sz="4"/>
+              <w:bottom w:val="single" w:color="BFBFBF" w:sz="4"/>
+              <w:right w:val="single" w:color="BFBFBF" w:sz="4"/>
+            </w:tcBorders>
+            <w:tcMar>
+              <w:top w:type="dxa" w:w="40"/>
+              <w:left w:type="dxa" w:w="100"/>
+              <w:bottom w:type="dxa" w:w="40"/>
+              <w:right w:type="dxa" w:w="100"/>
+            </w:tcMar>
+          </w:tcPr>
+          <w:p>
+            <w:pPr>
+              <w:spacing w:after="0"/>
+            </w:pPr>
+            <w:r>
+              <w:rPr>
+                <w:rFonts w:ascii="TH Sarabun New" w:cs="TH Sarabun New" w:eastAsia="TH Sarabun New" w:hAnsi="TH Sarabun New"/>
+                <w:b w:val="false"/>
+                <w:bCs w:val="false"/>
+                <w:sz w:val="28"/>
+                <w:szCs w:val="28"/>
+              </w:rPr>
+              <w:t xml:space="preserve">sf2_04</w:t>
+            </w:r>
+          </w:p>
+        </w:tc>
+        <w:tc>
+          <w:tcPr>
+            <w:tcW w:type="dxa" w:w="3484"/>
+            <w:tcBorders>
+              <w:top w:val="single" w:color="BFBFBF" w:sz="4"/>
+              <w:left w:val="single" w:color="BFBFBF" w:sz="4"/>
+              <w:bottom w:val="single" w:color="BFBFBF" w:sz="4"/>
+              <w:right w:val="single" w:color="BFBFBF" w:sz="4"/>
+            </w:tcBorders>
+            <w:tcMar>
+              <w:top w:type="dxa" w:w="40"/>
+              <w:left w:type="dxa" w:w="100"/>
+              <w:bottom w:type="dxa" w:w="40"/>
+              <w:right w:type="dxa" w:w="100"/>
+            </w:tcMar>
+          </w:tcPr>
+          <w:p>
+            <w:pPr>
+              <w:spacing w:after="0"/>
+            </w:pPr>
+            <w:r>
+              <w:rPr>
+                <w:rFonts w:ascii="TH Sarabun New" w:cs="TH Sarabun New" w:eastAsia="TH Sarabun New" w:hAnsi="TH Sarabun New"/>
+                <w:b w:val="false"/>
+                <w:bCs w:val="false"/>
+                <w:sz w:val="28"/>
+                <w:szCs w:val="28"/>
+              </w:rPr>
+              <w:t xml:space="preserve">ดูอุณหภูมิกระบะ · ลูกค้ากดรับของ (ack) · มือถือเห็นเวลาส่งมอบ</w:t>
+            </w:r>
+          </w:p>
+        </w:tc>
+        <w:tc>
+          <w:tcPr>
+            <w:tcW w:type="dxa" w:w="2884"/>
+            <w:tcBorders>
+              <w:top w:val="single" w:color="BFBFBF" w:sz="4"/>
+              <w:left w:val="single" w:color="BFBFBF" w:sz="4"/>
+              <w:bottom w:val="single" w:color="BFBFBF" w:sz="4"/>
+              <w:right w:val="single" w:color="BFBFBF" w:sz="4"/>
+            </w:tcBorders>
+            <w:tcMar>
+              <w:top w:type="dxa" w:w="40"/>
+              <w:left w:type="dxa" w:w="100"/>
+              <w:bottom w:type="dxa" w:w="40"/>
+              <w:right w:type="dxa" w:w="100"/>
+            </w:tcMar>
+          </w:tcPr>
+          <w:p>
+            <w:pPr>
+              <w:spacing w:after="0"/>
+            </w:pPr>
+            <w:r>
+              <w:rPr>
+                <w:rFonts w:ascii="TH Sarabun New" w:cs="TH Sarabun New" w:eastAsia="TH Sarabun New" w:hAnsi="TH Sarabun New"/>
+                <w:b w:val="false"/>
+                <w:bCs w:val="false"/>
+                <w:sz w:val="28"/>
+                <w:szCs w:val="28"/>
+              </w:rPr>
+              <w:t xml:space="preserve">นับถนนขรุขระ (sf1_04)</w:t>
             </w:r>
           </w:p>
         </w:tc>
@@ -2075,71 +2111,39 @@
       <w:tr>
         <w:tc>
           <w:tcPr>
-            <w:tcW w:type="dxa" w:w="2700"/>
-            <w:tcBorders>
-              <w:top w:val="single" w:color="BFBFBF" w:sz="4"/>
-              <w:left w:val="single" w:color="BFBFBF" w:sz="4"/>
-              <w:bottom w:val="single" w:color="BFBFBF" w:sz="4"/>
-              <w:right w:val="single" w:color="BFBFBF" w:sz="4"/>
-            </w:tcBorders>
-            <w:tcMar>
-              <w:top w:type="dxa" w:w="40"/>
-              <w:left w:type="dxa" w:w="100"/>
-              <w:bottom w:type="dxa" w:w="40"/>
-              <w:right w:type="dxa" w:w="100"/>
-            </w:tcMar>
-          </w:tcPr>
-          <w:p>
-            <w:pPr>
-              <w:spacing w:after="0"/>
-            </w:pPr>
-            <w:r>
-              <w:rPr>
-                <w:rFonts w:ascii="TH Sarabun New" w:cs="TH Sarabun New" w:eastAsia="TH Sarabun New" w:hAnsi="TH Sarabun New"/>
-                <w:b w:val="false"/>
-                <w:bCs w:val="false"/>
-                <w:sz w:val="28"/>
-                <w:szCs w:val="28"/>
-              </w:rPr>
-              <w:t xml:space="preserve">6 · หอถังน้ำของฟาร์ม</w:t>
-            </w:r>
-          </w:p>
-        </w:tc>
-        <w:tc>
-          <w:tcPr>
-            <w:tcW w:type="dxa" w:w="3168"/>
-            <w:tcBorders>
-              <w:top w:val="single" w:color="BFBFBF" w:sz="4"/>
-              <w:left w:val="single" w:color="BFBFBF" w:sz="4"/>
-              <w:bottom w:val="single" w:color="BFBFBF" w:sz="4"/>
-              <w:right w:val="single" w:color="BFBFBF" w:sz="4"/>
-            </w:tcBorders>
-            <w:tcMar>
-              <w:top w:type="dxa" w:w="40"/>
-              <w:left w:type="dxa" w:w="100"/>
-              <w:bottom w:type="dxa" w:w="40"/>
-              <w:right w:type="dxa" w:w="100"/>
-            </w:tcMar>
-          </w:tcPr>
-          <w:p>
-            <w:pPr>
-              <w:spacing w:after="0"/>
-            </w:pPr>
-            <w:r>
-              <w:rPr>
-                <w:rFonts w:ascii="TH Sarabun New" w:cs="TH Sarabun New" w:eastAsia="TH Sarabun New" w:hAnsi="TH Sarabun New"/>
-                <w:b w:val="false"/>
-                <w:bCs w:val="false"/>
-                <w:sz w:val="28"/>
-                <w:szCs w:val="28"/>
-              </w:rPr>
-              <w:t xml:space="preserve">VR4 ระดับน้ำ · ปั๊มไม่เปิดเมื่อน้ำต่ำ (TANK_MIN)</w:t>
-            </w:r>
-          </w:p>
-        </w:tc>
-        <w:tc>
-          <w:tcPr>
-            <w:tcW w:type="dxa" w:w="2400"/>
+            <w:tcW w:type="dxa" w:w="2300"/>
+            <w:tcBorders>
+              <w:top w:val="single" w:color="BFBFBF" w:sz="4"/>
+              <w:left w:val="single" w:color="BFBFBF" w:sz="4"/>
+              <w:bottom w:val="single" w:color="BFBFBF" w:sz="4"/>
+              <w:right w:val="single" w:color="BFBFBF" w:sz="4"/>
+            </w:tcBorders>
+            <w:tcMar>
+              <w:top w:type="dxa" w:w="40"/>
+              <w:left w:type="dxa" w:w="100"/>
+              <w:bottom w:type="dxa" w:w="40"/>
+              <w:right w:type="dxa" w:w="100"/>
+            </w:tcMar>
+          </w:tcPr>
+          <w:p>
+            <w:pPr>
+              <w:spacing w:after="0"/>
+            </w:pPr>
+            <w:r>
+              <w:rPr>
+                <w:rFonts w:ascii="TH Sarabun New" w:cs="TH Sarabun New" w:eastAsia="TH Sarabun New" w:hAnsi="TH Sarabun New"/>
+                <w:b w:val="false"/>
+                <w:bCs w:val="false"/>
+                <w:sz w:val="28"/>
+                <w:szCs w:val="28"/>
+              </w:rPr>
+              <w:t xml:space="preserve">4 · โรงเรือนอัจฉริยะ</w:t>
+            </w:r>
+          </w:p>
+        </w:tc>
+        <w:tc>
+          <w:tcPr>
+            <w:tcW w:type="dxa" w:w="1700"/>
             <w:tcBorders>
               <w:top w:val="single" w:color="BFBFBF" w:sz="4"/>
               <w:left w:val="single" w:color="BFBFBF" w:sz="4"/>
@@ -2171,33 +2175,65 @@
         </w:tc>
         <w:tc>
           <w:tcPr>
-            <w:tcW w:type="dxa" w:w="2100"/>
-            <w:tcBorders>
-              <w:top w:val="single" w:color="BFBFBF" w:sz="4"/>
-              <w:left w:val="single" w:color="BFBFBF" w:sz="4"/>
-              <w:bottom w:val="single" w:color="BFBFBF" w:sz="4"/>
-              <w:right w:val="single" w:color="BFBFBF" w:sz="4"/>
-            </w:tcBorders>
-            <w:tcMar>
-              <w:top w:type="dxa" w:w="40"/>
-              <w:left w:type="dxa" w:w="100"/>
-              <w:bottom w:type="dxa" w:w="40"/>
-              <w:right w:type="dxa" w:w="100"/>
-            </w:tcMar>
-          </w:tcPr>
-          <w:p>
-            <w:pPr>
-              <w:spacing w:after="0"/>
-            </w:pPr>
-            <w:r>
-              <w:rPr>
-                <w:rFonts w:ascii="TH Sarabun New" w:cs="TH Sarabun New" w:eastAsia="TH Sarabun New" w:hAnsi="TH Sarabun New"/>
-                <w:b w:val="false"/>
-                <w:bCs w:val="false"/>
-                <w:sz w:val="28"/>
-                <w:szCs w:val="28"/>
-              </w:rPr>
-              <w:t xml:space="preserve">sf1_03 · sf1_04</w:t>
+            <w:tcW w:type="dxa" w:w="3484"/>
+            <w:tcBorders>
+              <w:top w:val="single" w:color="BFBFBF" w:sz="4"/>
+              <w:left w:val="single" w:color="BFBFBF" w:sz="4"/>
+              <w:bottom w:val="single" w:color="BFBFBF" w:sz="4"/>
+              <w:right w:val="single" w:color="BFBFBF" w:sz="4"/>
+            </w:tcBorders>
+            <w:tcMar>
+              <w:top w:type="dxa" w:w="40"/>
+              <w:left w:type="dxa" w:w="100"/>
+              <w:bottom w:type="dxa" w:w="40"/>
+              <w:right w:type="dxa" w:w="100"/>
+            </w:tcMar>
+          </w:tcPr>
+          <w:p>
+            <w:pPr>
+              <w:spacing w:after="0"/>
+            </w:pPr>
+            <w:r>
+              <w:rPr>
+                <w:rFonts w:ascii="TH Sarabun New" w:cs="TH Sarabun New" w:eastAsia="TH Sarabun New" w:hAnsi="TH Sarabun New"/>
+                <w:b w:val="false"/>
+                <w:bCs w:val="false"/>
+                <w:sz w:val="28"/>
+                <w:szCs w:val="28"/>
+              </w:rPr>
+              <w:t xml:space="preserve">ดินแห้ง (VR จำลอง) · สั่งรดน้ำจากมือถือ · ปั๊มมีเพดานเวลา</w:t>
+            </w:r>
+          </w:p>
+        </w:tc>
+        <w:tc>
+          <w:tcPr>
+            <w:tcW w:type="dxa" w:w="2884"/>
+            <w:tcBorders>
+              <w:top w:val="single" w:color="BFBFBF" w:sz="4"/>
+              <w:left w:val="single" w:color="BFBFBF" w:sz="4"/>
+              <w:bottom w:val="single" w:color="BFBFBF" w:sz="4"/>
+              <w:right w:val="single" w:color="BFBFBF" w:sz="4"/>
+            </w:tcBorders>
+            <w:tcMar>
+              <w:top w:type="dxa" w:w="40"/>
+              <w:left w:type="dxa" w:w="100"/>
+              <w:bottom w:type="dxa" w:w="40"/>
+              <w:right w:type="dxa" w:w="100"/>
+            </w:tcMar>
+          </w:tcPr>
+          <w:p>
+            <w:pPr>
+              <w:spacing w:after="0"/>
+            </w:pPr>
+            <w:r>
+              <w:rPr>
+                <w:rFonts w:ascii="TH Sarabun New" w:cs="TH Sarabun New" w:eastAsia="TH Sarabun New" w:hAnsi="TH Sarabun New"/>
+                <w:b w:val="false"/>
+                <w:bCs w:val="false"/>
+                <w:sz w:val="28"/>
+                <w:szCs w:val="28"/>
+              </w:rPr>
+              <w:t xml:space="preserve">รดเองอัตโนมัติ (sf1_03)</w:t>
             </w:r>
           </w:p>
         </w:tc>
@@ -2205,129 +2241,129 @@
       <w:tr>
         <w:tc>
           <w:tcPr>
-            <w:tcW w:type="dxa" w:w="2700"/>
-            <w:tcBorders>
-              <w:top w:val="single" w:color="BFBFBF" w:sz="4"/>
-              <w:left w:val="single" w:color="BFBFBF" w:sz="4"/>
-              <w:bottom w:val="single" w:color="BFBFBF" w:sz="4"/>
-              <w:right w:val="single" w:color="BFBFBF" w:sz="4"/>
-            </w:tcBorders>
-            <w:tcMar>
-              <w:top w:type="dxa" w:w="40"/>
-              <w:left w:type="dxa" w:w="100"/>
-              <w:bottom w:type="dxa" w:w="40"/>
-              <w:right w:type="dxa" w:w="100"/>
-            </w:tcMar>
-          </w:tcPr>
-          <w:p>
-            <w:pPr>
-              <w:spacing w:after="0"/>
-            </w:pPr>
-            <w:r>
-              <w:rPr>
-                <w:rFonts w:ascii="TH Sarabun New" w:cs="TH Sarabun New" w:eastAsia="TH Sarabun New" w:hAnsi="TH Sarabun New"/>
-                <w:b w:val="false"/>
-                <w:bCs w:val="false"/>
-                <w:sz w:val="28"/>
-                <w:szCs w:val="28"/>
-              </w:rPr>
-              <w:t xml:space="preserve">7 · หมอฟังปั๊ม/พัดลม</w:t>
-            </w:r>
-          </w:p>
-        </w:tc>
-        <w:tc>
-          <w:tcPr>
-            <w:tcW w:type="dxa" w:w="3168"/>
-            <w:tcBorders>
-              <w:top w:val="single" w:color="BFBFBF" w:sz="4"/>
-              <w:left w:val="single" w:color="BFBFBF" w:sz="4"/>
-              <w:bottom w:val="single" w:color="BFBFBF" w:sz="4"/>
-              <w:right w:val="single" w:color="BFBFBF" w:sz="4"/>
-            </w:tcBorders>
-            <w:tcMar>
-              <w:top w:type="dxa" w:w="40"/>
-              <w:left w:type="dxa" w:w="100"/>
-              <w:bottom w:type="dxa" w:w="40"/>
-              <w:right w:type="dxa" w:w="100"/>
-            </w:tcMar>
-          </w:tcPr>
-          <w:p>
-            <w:pPr>
-              <w:spacing w:after="0"/>
-            </w:pPr>
-            <w:r>
-              <w:rPr>
-                <w:rFonts w:ascii="TH Sarabun New" w:cs="TH Sarabun New" w:eastAsia="TH Sarabun New" w:hAnsi="TH Sarabun New"/>
-                <w:b w:val="false"/>
-                <w:bCs w:val="false"/>
-                <w:sz w:val="28"/>
-                <w:szCs w:val="28"/>
-              </w:rPr>
-              <w:t xml:space="preserve">BMI270 สั่นเกินเกณฑ์ด้วยกฎ (AI = โบนัส)</w:t>
-            </w:r>
-          </w:p>
-        </w:tc>
-        <w:tc>
-          <w:tcPr>
-            <w:tcW w:type="dxa" w:w="2400"/>
-            <w:tcBorders>
-              <w:top w:val="single" w:color="BFBFBF" w:sz="4"/>
-              <w:left w:val="single" w:color="BFBFBF" w:sz="4"/>
-              <w:bottom w:val="single" w:color="BFBFBF" w:sz="4"/>
-              <w:right w:val="single" w:color="BFBFBF" w:sz="4"/>
-            </w:tcBorders>
-            <w:tcMar>
-              <w:top w:type="dxa" w:w="40"/>
-              <w:left w:type="dxa" w:w="100"/>
-              <w:bottom w:type="dxa" w:w="40"/>
-              <w:right w:type="dxa" w:w="100"/>
-            </w:tcMar>
-          </w:tcPr>
-          <w:p>
-            <w:pPr>
-              <w:spacing w:after="0"/>
-            </w:pPr>
-            <w:r>
-              <w:rPr>
-                <w:rFonts w:ascii="TH Sarabun New" w:cs="TH Sarabun New" w:eastAsia="TH Sarabun New" w:hAnsi="TH Sarabun New"/>
-                <w:b w:val="false"/>
-                <w:bCs w:val="false"/>
-                <w:sz w:val="28"/>
-                <w:szCs w:val="28"/>
-              </w:rPr>
-              <w:t xml:space="preserve">sf2_02</w:t>
-            </w:r>
-          </w:p>
-        </w:tc>
-        <w:tc>
-          <w:tcPr>
-            <w:tcW w:type="dxa" w:w="2100"/>
-            <w:tcBorders>
-              <w:top w:val="single" w:color="BFBFBF" w:sz="4"/>
-              <w:left w:val="single" w:color="BFBFBF" w:sz="4"/>
-              <w:bottom w:val="single" w:color="BFBFBF" w:sz="4"/>
-              <w:right w:val="single" w:color="BFBFBF" w:sz="4"/>
-            </w:tcBorders>
-            <w:tcMar>
-              <w:top w:type="dxa" w:w="40"/>
-              <w:left w:type="dxa" w:w="100"/>
-              <w:bottom w:type="dxa" w:w="40"/>
-              <w:right w:type="dxa" w:w="100"/>
-            </w:tcMar>
-          </w:tcPr>
-          <w:p>
-            <w:pPr>
-              <w:spacing w:after="0"/>
-            </w:pPr>
-            <w:r>
-              <w:rPr>
-                <w:rFonts w:ascii="TH Sarabun New" w:cs="TH Sarabun New" w:eastAsia="TH Sarabun New" w:hAnsi="TH Sarabun New"/>
-                <w:b w:val="false"/>
-                <w:bCs w:val="false"/>
-                <w:sz w:val="28"/>
-                <w:szCs w:val="28"/>
-              </w:rPr>
-              <w:t xml:space="preserve">sf1_04</w:t>
+            <w:tcW w:type="dxa" w:w="2300"/>
+            <w:tcBorders>
+              <w:top w:val="single" w:color="BFBFBF" w:sz="4"/>
+              <w:left w:val="single" w:color="BFBFBF" w:sz="4"/>
+              <w:bottom w:val="single" w:color="BFBFBF" w:sz="4"/>
+              <w:right w:val="single" w:color="BFBFBF" w:sz="4"/>
+            </w:tcBorders>
+            <w:tcMar>
+              <w:top w:type="dxa" w:w="40"/>
+              <w:left w:type="dxa" w:w="100"/>
+              <w:bottom w:type="dxa" w:w="40"/>
+              <w:right w:type="dxa" w:w="100"/>
+            </w:tcMar>
+          </w:tcPr>
+          <w:p>
+            <w:pPr>
+              <w:spacing w:after="0"/>
+            </w:pPr>
+            <w:r>
+              <w:rPr>
+                <w:rFonts w:ascii="TH Sarabun New" w:cs="TH Sarabun New" w:eastAsia="TH Sarabun New" w:hAnsi="TH Sarabun New"/>
+                <w:b w:val="false"/>
+                <w:bCs w:val="false"/>
+                <w:sz w:val="28"/>
+                <w:szCs w:val="28"/>
+              </w:rPr>
+              <w:t xml:space="preserve">6 · หอถังน้ำของฟาร์ม</w:t>
+            </w:r>
+          </w:p>
+        </w:tc>
+        <w:tc>
+          <w:tcPr>
+            <w:tcW w:type="dxa" w:w="1700"/>
+            <w:tcBorders>
+              <w:top w:val="single" w:color="BFBFBF" w:sz="4"/>
+              <w:left w:val="single" w:color="BFBFBF" w:sz="4"/>
+              <w:bottom w:val="single" w:color="BFBFBF" w:sz="4"/>
+              <w:right w:val="single" w:color="BFBFBF" w:sz="4"/>
+            </w:tcBorders>
+            <w:tcMar>
+              <w:top w:type="dxa" w:w="40"/>
+              <w:left w:type="dxa" w:w="100"/>
+              <w:bottom w:type="dxa" w:w="40"/>
+              <w:right w:type="dxa" w:w="100"/>
+            </w:tcMar>
+          </w:tcPr>
+          <w:p>
+            <w:pPr>
+              <w:spacing w:after="0"/>
+            </w:pPr>
+            <w:r>
+              <w:rPr>
+                <w:rFonts w:ascii="TH Sarabun New" w:cs="TH Sarabun New" w:eastAsia="TH Sarabun New" w:hAnsi="TH Sarabun New"/>
+                <w:b w:val="false"/>
+                <w:bCs w:val="false"/>
+                <w:sz w:val="28"/>
+                <w:szCs w:val="28"/>
+              </w:rPr>
+              <w:t xml:space="preserve">sf2_03</w:t>
+            </w:r>
+          </w:p>
+        </w:tc>
+        <w:tc>
+          <w:tcPr>
+            <w:tcW w:type="dxa" w:w="3484"/>
+            <w:tcBorders>
+              <w:top w:val="single" w:color="BFBFBF" w:sz="4"/>
+              <w:left w:val="single" w:color="BFBFBF" w:sz="4"/>
+              <w:bottom w:val="single" w:color="BFBFBF" w:sz="4"/>
+              <w:right w:val="single" w:color="BFBFBF" w:sz="4"/>
+            </w:tcBorders>
+            <w:tcMar>
+              <w:top w:type="dxa" w:w="40"/>
+              <w:left w:type="dxa" w:w="100"/>
+              <w:bottom w:type="dxa" w:w="40"/>
+              <w:right w:type="dxa" w:w="100"/>
+            </w:tcMar>
+          </w:tcPr>
+          <w:p>
+            <w:pPr>
+              <w:spacing w:after="0"/>
+            </w:pPr>
+            <w:r>
+              <w:rPr>
+                <w:rFonts w:ascii="TH Sarabun New" w:cs="TH Sarabun New" w:eastAsia="TH Sarabun New" w:hAnsi="TH Sarabun New"/>
+                <w:b w:val="false"/>
+                <w:bCs w:val="false"/>
+                <w:sz w:val="28"/>
+                <w:szCs w:val="28"/>
+              </w:rPr>
+              <w:t xml:space="preserve">ระดับน้ำ (VR4 จำลอง) · ปั๊มไม่เปิดเมื่อน้ำต่ำ · สั่งจากมือถือ</w:t>
+            </w:r>
+          </w:p>
+        </w:tc>
+        <w:tc>
+          <w:tcPr>
+            <w:tcW w:type="dxa" w:w="2884"/>
+            <w:tcBorders>
+              <w:top w:val="single" w:color="BFBFBF" w:sz="4"/>
+              <w:left w:val="single" w:color="BFBFBF" w:sz="4"/>
+              <w:bottom w:val="single" w:color="BFBFBF" w:sz="4"/>
+              <w:right w:val="single" w:color="BFBFBF" w:sz="4"/>
+            </w:tcBorders>
+            <w:tcMar>
+              <w:top w:type="dxa" w:w="40"/>
+              <w:left w:type="dxa" w:w="100"/>
+              <w:bottom w:type="dxa" w:w="40"/>
+              <w:right w:type="dxa" w:w="100"/>
+            </w:tcMar>
+          </w:tcPr>
+          <w:p>
+            <w:pPr>
+              <w:spacing w:after="0"/>
+            </w:pPr>
+            <w:r>
+              <w:rPr>
+                <w:rFonts w:ascii="TH Sarabun New" w:cs="TH Sarabun New" w:eastAsia="TH Sarabun New" w:hAnsi="TH Sarabun New"/>
+                <w:b w:val="false"/>
+                <w:bCs w:val="false"/>
+                <w:sz w:val="28"/>
+                <w:szCs w:val="28"/>
+              </w:rPr>
+              <w:t xml:space="preserve">เตือนหอถังเอียง (sf1_04)</w:t>
             </w:r>
           </w:p>
         </w:tc>
@@ -2335,129 +2371,139 @@
       <w:tr>
         <w:tc>
           <w:tcPr>
-            <w:tcW w:type="dxa" w:w="2700"/>
-            <w:tcBorders>
-              <w:top w:val="single" w:color="BFBFBF" w:sz="4"/>
-              <w:left w:val="single" w:color="BFBFBF" w:sz="4"/>
-              <w:bottom w:val="single" w:color="BFBFBF" w:sz="4"/>
-              <w:right w:val="single" w:color="BFBFBF" w:sz="4"/>
-            </w:tcBorders>
-            <w:tcMar>
-              <w:top w:type="dxa" w:w="40"/>
-              <w:left w:type="dxa" w:w="100"/>
-              <w:bottom w:type="dxa" w:w="40"/>
-              <w:right w:type="dxa" w:w="100"/>
-            </w:tcMar>
-          </w:tcPr>
-          <w:p>
-            <w:pPr>
-              <w:spacing w:after="0"/>
-            </w:pPr>
-            <w:r>
-              <w:rPr>
-                <w:rFonts w:ascii="TH Sarabun New" w:cs="TH Sarabun New" w:eastAsia="TH Sarabun New" w:hAnsi="TH Sarabun New"/>
-                <w:b w:val="false"/>
-                <w:bCs w:val="false"/>
-                <w:sz w:val="28"/>
-                <w:szCs w:val="28"/>
-              </w:rPr>
-              <w:t xml:space="preserve">8 · เล้าไก่กันเครียดฝูง</w:t>
-            </w:r>
-          </w:p>
-        </w:tc>
-        <w:tc>
-          <w:tcPr>
-            <w:tcW w:type="dxa" w:w="3168"/>
-            <w:tcBorders>
-              <w:top w:val="single" w:color="BFBFBF" w:sz="4"/>
-              <w:left w:val="single" w:color="BFBFBF" w:sz="4"/>
-              <w:bottom w:val="single" w:color="BFBFBF" w:sz="4"/>
-              <w:right w:val="single" w:color="BFBFBF" w:sz="4"/>
-            </w:tcBorders>
-            <w:tcMar>
-              <w:top w:type="dxa" w:w="40"/>
-              <w:left w:type="dxa" w:w="100"/>
-              <w:bottom w:type="dxa" w:w="40"/>
-              <w:right w:type="dxa" w:w="100"/>
-            </w:tcMar>
-          </w:tcPr>
-          <w:p>
-            <w:pPr>
-              <w:spacing w:after="0"/>
-            </w:pPr>
-            <w:r>
-              <w:rPr>
-                <w:rFonts w:ascii="TH Sarabun New" w:cs="TH Sarabun New" w:eastAsia="TH Sarabun New" w:hAnsi="TH Sarabun New"/>
-                <w:b w:val="false"/>
-                <w:bCs w:val="false"/>
-                <w:sz w:val="28"/>
-                <w:szCs w:val="28"/>
-              </w:rPr>
-              <w:t xml:space="preserve">ร้อน/ชื้นเกินด้วย SHT40 (ไมค์ = โบนัส)</w:t>
-            </w:r>
-          </w:p>
-        </w:tc>
-        <w:tc>
-          <w:tcPr>
-            <w:tcW w:type="dxa" w:w="2400"/>
-            <w:tcBorders>
-              <w:top w:val="single" w:color="BFBFBF" w:sz="4"/>
-              <w:left w:val="single" w:color="BFBFBF" w:sz="4"/>
-              <w:bottom w:val="single" w:color="BFBFBF" w:sz="4"/>
-              <w:right w:val="single" w:color="BFBFBF" w:sz="4"/>
-            </w:tcBorders>
-            <w:tcMar>
-              <w:top w:type="dxa" w:w="40"/>
-              <w:left w:type="dxa" w:w="100"/>
-              <w:bottom w:type="dxa" w:w="40"/>
-              <w:right w:type="dxa" w:w="100"/>
-            </w:tcMar>
-          </w:tcPr>
-          <w:p>
-            <w:pPr>
-              <w:spacing w:after="0"/>
-            </w:pPr>
-            <w:r>
-              <w:rPr>
-                <w:rFonts w:ascii="TH Sarabun New" w:cs="TH Sarabun New" w:eastAsia="TH Sarabun New" w:hAnsi="TH Sarabun New"/>
-                <w:b w:val="false"/>
-                <w:bCs w:val="false"/>
-                <w:sz w:val="28"/>
-                <w:szCs w:val="28"/>
-              </w:rPr>
-              <w:t xml:space="preserve">sf2_04</w:t>
-            </w:r>
-          </w:p>
-        </w:tc>
-        <w:tc>
-          <w:tcPr>
-            <w:tcW w:type="dxa" w:w="2100"/>
-            <w:tcBorders>
-              <w:top w:val="single" w:color="BFBFBF" w:sz="4"/>
-              <w:left w:val="single" w:color="BFBFBF" w:sz="4"/>
-              <w:bottom w:val="single" w:color="BFBFBF" w:sz="4"/>
-              <w:right w:val="single" w:color="BFBFBF" w:sz="4"/>
-            </w:tcBorders>
-            <w:tcMar>
-              <w:top w:type="dxa" w:w="40"/>
-              <w:left w:type="dxa" w:w="100"/>
-              <w:bottom w:type="dxa" w:w="40"/>
-              <w:right w:type="dxa" w:w="100"/>
-            </w:tcMar>
-          </w:tcPr>
-          <w:p>
-            <w:pPr>
-              <w:spacing w:after="0"/>
-            </w:pPr>
-            <w:r>
-              <w:rPr>
-                <w:rFonts w:ascii="TH Sarabun New" w:cs="TH Sarabun New" w:eastAsia="TH Sarabun New" w:hAnsi="TH Sarabun New"/>
-                <w:b w:val="false"/>
-                <w:bCs w:val="false"/>
-                <w:sz w:val="28"/>
-                <w:szCs w:val="28"/>
-              </w:rPr>
-              <w:t xml:space="preserve">sf1_02</w:t>
+            <w:tcW w:type="dxa" w:w="2300"/>
+            <w:tcBorders>
+              <w:top w:val="single" w:color="BFBFBF" w:sz="4"/>
+              <w:left w:val="single" w:color="BFBFBF" w:sz="4"/>
+              <w:bottom w:val="single" w:color="BFBFBF" w:sz="4"/>
+              <w:right w:val="single" w:color="BFBFBF" w:sz="4"/>
+            </w:tcBorders>
+            <w:tcMar>
+              <w:top w:type="dxa" w:w="40"/>
+              <w:left w:type="dxa" w:w="100"/>
+              <w:bottom w:type="dxa" w:w="40"/>
+              <w:right w:type="dxa" w:w="100"/>
+            </w:tcMar>
+          </w:tcPr>
+          <w:p>
+            <w:pPr>
+              <w:spacing w:after="0"/>
+            </w:pPr>
+            <w:r>
+              <w:rPr>
+                <w:rFonts w:ascii="TH Sarabun New" w:cs="TH Sarabun New" w:eastAsia="TH Sarabun New" w:hAnsi="TH Sarabun New"/>
+                <w:b w:val="false"/>
+                <w:bCs w:val="false"/>
+                <w:sz w:val="28"/>
+                <w:szCs w:val="28"/>
+              </w:rPr>
+              <w:t xml:space="preserve">7 · หมอฟังปั๊ม</w:t>
+            </w:r>
+          </w:p>
+        </w:tc>
+        <w:tc>
+          <w:tcPr>
+            <w:tcW w:type="dxa" w:w="1700"/>
+            <w:tcBorders>
+              <w:top w:val="single" w:color="BFBFBF" w:sz="4"/>
+              <w:left w:val="single" w:color="BFBFBF" w:sz="4"/>
+              <w:bottom w:val="single" w:color="BFBFBF" w:sz="4"/>
+              <w:right w:val="single" w:color="BFBFBF" w:sz="4"/>
+            </w:tcBorders>
+            <w:tcMar>
+              <w:top w:type="dxa" w:w="40"/>
+              <w:left w:type="dxa" w:w="100"/>
+              <w:bottom w:type="dxa" w:w="40"/>
+              <w:right w:type="dxa" w:w="100"/>
+            </w:tcMar>
+          </w:tcPr>
+          <w:p>
+            <w:pPr>
+              <w:spacing w:after="0"/>
+            </w:pPr>
+            <w:r>
+              <w:rPr>
+                <w:rFonts w:ascii="TH Sarabun New" w:cs="TH Sarabun New" w:eastAsia="TH Sarabun New" w:hAnsi="TH Sarabun New"/>
+                <w:b w:val="false"/>
+                <w:bCs w:val="false"/>
+                <w:sz w:val="28"/>
+                <w:szCs w:val="28"/>
+              </w:rPr>
+              <w:t xml:space="preserve">sf2_03</w:t>
+            </w:r>
+          </w:p>
+        </w:tc>
+        <w:tc>
+          <w:tcPr>
+            <w:tcW w:type="dxa" w:w="3484"/>
+            <w:tcBorders>
+              <w:top w:val="single" w:color="BFBFBF" w:sz="4"/>
+              <w:left w:val="single" w:color="BFBFBF" w:sz="4"/>
+              <w:bottom w:val="single" w:color="BFBFBF" w:sz="4"/>
+              <w:right w:val="single" w:color="BFBFBF" w:sz="4"/>
+            </w:tcBorders>
+            <w:tcMar>
+              <w:top w:type="dxa" w:w="40"/>
+              <w:left w:type="dxa" w:w="100"/>
+              <w:bottom w:type="dxa" w:w="40"/>
+              <w:right w:type="dxa" w:w="100"/>
+            </w:tcMar>
+          </w:tcPr>
+          <w:p>
+            <w:pPr>
+              <w:spacing w:after="0"/>
+            </w:pPr>
+            <w:r>
+              <w:rPr>
+                <w:rFonts w:ascii="TH Sarabun New" w:cs="TH Sarabun New" w:eastAsia="TH Sarabun New" w:hAnsi="TH Sarabun New"/>
+                <w:b/>
+                <w:bCs/>
+                <w:sz w:val="28"/>
+                <w:szCs w:val="28"/>
+              </w:rPr>
+              <w:t xml:space="preserve">ต้องทำระดับ 2</w:t>
+            </w:r>
+            <w:r>
+              <w:rPr>
+                <w:rFonts w:ascii="TH Sarabun New" w:cs="TH Sarabun New" w:eastAsia="TH Sarabun New" w:hAnsi="TH Sarabun New"/>
+                <w:b w:val="false"/>
+                <w:bCs w:val="false"/>
+                <w:sz w:val="28"/>
+                <w:szCs w:val="28"/>
+              </w:rPr>
+              <w:t xml:space="preserve"> (ไฟล์ตั้งต้นยังไม่มีการวัดการสั่น)</w:t>
+            </w:r>
+          </w:p>
+        </w:tc>
+        <w:tc>
+          <w:tcPr>
+            <w:tcW w:type="dxa" w:w="2884"/>
+            <w:tcBorders>
+              <w:top w:val="single" w:color="BFBFBF" w:sz="4"/>
+              <w:left w:val="single" w:color="BFBFBF" w:sz="4"/>
+              <w:bottom w:val="single" w:color="BFBFBF" w:sz="4"/>
+              <w:right w:val="single" w:color="BFBFBF" w:sz="4"/>
+            </w:tcBorders>
+            <w:tcMar>
+              <w:top w:type="dxa" w:w="40"/>
+              <w:left w:type="dxa" w:w="100"/>
+              <w:bottom w:type="dxa" w:w="40"/>
+              <w:right w:type="dxa" w:w="100"/>
+            </w:tcMar>
+          </w:tcPr>
+          <w:p>
+            <w:pPr>
+              <w:spacing w:after="0"/>
+            </w:pPr>
+            <w:r>
+              <w:rPr>
+                <w:rFonts w:ascii="TH Sarabun New" w:cs="TH Sarabun New" w:eastAsia="TH Sarabun New" w:hAnsi="TH Sarabun New"/>
+                <w:b w:val="false"/>
+                <w:bCs w:val="false"/>
+                <w:sz w:val="28"/>
+                <w:szCs w:val="28"/>
+              </w:rPr>
+              <w:t xml:space="preserve">จับการสั่นผิดปกติ (sf3_03)</w:t>
             </w:r>
           </w:p>
         </w:tc>
@@ -2465,7 +2511,7 @@
       <w:tr>
         <w:tc>
           <w:tcPr>
-            <w:tcW w:type="dxa" w:w="2700"/>
+            <w:tcW w:type="dxa" w:w="2300"/>
             <w:tcBorders>
               <w:top w:val="single" w:color="BFBFBF" w:sz="4"/>
               <w:left w:val="single" w:color="BFBFBF" w:sz="4"/>
@@ -2497,7 +2543,39 @@
         </w:tc>
         <w:tc>
           <w:tcPr>
-            <w:tcW w:type="dxa" w:w="3168"/>
+            <w:tcW w:type="dxa" w:w="1700"/>
+            <w:tcBorders>
+              <w:top w:val="single" w:color="BFBFBF" w:sz="4"/>
+              <w:left w:val="single" w:color="BFBFBF" w:sz="4"/>
+              <w:bottom w:val="single" w:color="BFBFBF" w:sz="4"/>
+              <w:right w:val="single" w:color="BFBFBF" w:sz="4"/>
+            </w:tcBorders>
+            <w:tcMar>
+              <w:top w:type="dxa" w:w="40"/>
+              <w:left w:type="dxa" w:w="100"/>
+              <w:bottom w:type="dxa" w:w="40"/>
+              <w:right w:type="dxa" w:w="100"/>
+            </w:tcMar>
+          </w:tcPr>
+          <w:p>
+            <w:pPr>
+              <w:spacing w:after="0"/>
+            </w:pPr>
+            <w:r>
+              <w:rPr>
+                <w:rFonts w:ascii="TH Sarabun New" w:cs="TH Sarabun New" w:eastAsia="TH Sarabun New" w:hAnsi="TH Sarabun New"/>
+                <w:b w:val="false"/>
+                <w:bCs w:val="false"/>
+                <w:sz w:val="28"/>
+                <w:szCs w:val="28"/>
+              </w:rPr>
+              <w:t xml:space="preserve">sf3_01</w:t>
+            </w:r>
+          </w:p>
+        </w:tc>
+        <w:tc>
+          <w:tcPr>
+            <w:tcW w:type="dxa" w:w="3484"/>
             <w:tcBorders>
               <w:top w:val="single" w:color="BFBFBF" w:sz="4"/>
               <w:left w:val="single" w:color="BFBFBF" w:sz="4"/>
@@ -2533,45 +2611,13 @@
                 <w:sz w:val="28"/>
                 <w:szCs w:val="28"/>
               </w:rPr>
-              <w:t xml:space="preserve"> ต้องใช้เรดาร์ + ไมค์ (คาบ 3)</w:t>
-            </w:r>
-          </w:p>
-        </w:tc>
-        <w:tc>
-          <w:tcPr>
-            <w:tcW w:type="dxa" w:w="2400"/>
-            <w:tcBorders>
-              <w:top w:val="single" w:color="BFBFBF" w:sz="4"/>
-              <w:left w:val="single" w:color="BFBFBF" w:sz="4"/>
-              <w:bottom w:val="single" w:color="BFBFBF" w:sz="4"/>
-              <w:right w:val="single" w:color="BFBFBF" w:sz="4"/>
-            </w:tcBorders>
-            <w:tcMar>
-              <w:top w:type="dxa" w:w="40"/>
-              <w:left w:type="dxa" w:w="100"/>
-              <w:bottom w:type="dxa" w:w="40"/>
-              <w:right w:type="dxa" w:w="100"/>
-            </w:tcMar>
-          </w:tcPr>
-          <w:p>
-            <w:pPr>
-              <w:spacing w:after="0"/>
-            </w:pPr>
-            <w:r>
-              <w:rPr>
-                <w:rFonts w:ascii="TH Sarabun New" w:cs="TH Sarabun New" w:eastAsia="TH Sarabun New" w:hAnsi="TH Sarabun New"/>
-                <w:b w:val="false"/>
-                <w:bCs w:val="false"/>
-                <w:sz w:val="28"/>
-                <w:szCs w:val="28"/>
-              </w:rPr>
-              <w:t xml:space="preserve">sf3_01 · sf3_02</w:t>
-            </w:r>
-          </w:p>
-        </w:tc>
-        <w:tc>
-          <w:tcPr>
-            <w:tcW w:type="dxa" w:w="2100"/>
+              <w:t xml:space="preserve"> ต้องใช้เรดาร์และต่อ MQTT เอง</w:t>
+            </w:r>
+          </w:p>
+        </w:tc>
+        <w:tc>
+          <w:tcPr>
+            <w:tcW w:type="dxa" w:w="2884"/>
             <w:tcBorders>
               <w:top w:val="single" w:color="BFBFBF" w:sz="4"/>
               <w:left w:val="single" w:color="BFBFBF" w:sz="4"/>
@@ -2620,7 +2666,671 @@
           <w:sz w:val="24"/>
           <w:szCs w:val="24"/>
         </w:rPr>
-        <w:t xml:space="preserve">แต่ละไอเดียมีได้ไม่เกิน 3 ทีม และต้องแก้ปัญหาคนละมุม · ไฟล์ sf3_08 เป็นตัวอย่างสาธิตของผู้สอน ไม่ใช้ในโปรเจกต์นี้</w:t>
+        <w:t xml:space="preserve">กลุ่มที่ไม่มั่นใจเรื่องโค้ด ให้เลือกไอเดีย 3 · 8 · 1 · 2 · 4 · 6 ซึ่งระดับ 1 ก็ครบ · แต่ละไอเดียมีได้ไม่เกิน 3 ทีม และต้องแก้ปัญหาคนละมุม</w:t>
+      </w:r>
+    </w:p>
+    <w:p>
+      <w:pPr>
+        <w:pStyle w:val="Heading1"/>
+      </w:pPr>
+      <w:r>
+        <w:rPr>
+          <w:rFonts w:ascii="TH Sarabun New" w:cs="TH Sarabun New" w:eastAsia="TH Sarabun New" w:hAnsi="TH Sarabun New"/>
+          <w:b/>
+          <w:bCs/>
+          <w:color w:val="365F91"/>
+          <w:sz w:val="40"/>
+          <w:szCs w:val="40"/>
+        </w:rPr>
+        <w:t xml:space="preserve">ถ้าทำไม่ได้ จะไปต่ออย่างไร</w:t>
+      </w:r>
+    </w:p>
+    <w:tbl>
+      <w:tblPr>
+        <w:tblW w:type="dxa" w:w="10368"/>
+        <w:tblBorders>
+          <w:top w:val="single" w:color="auto" w:sz="4"/>
+          <w:left w:val="single" w:color="auto" w:sz="4"/>
+          <w:bottom w:val="single" w:color="auto" w:sz="4"/>
+          <w:right w:val="single" w:color="auto" w:sz="4"/>
+          <w:insideH w:val="single" w:color="auto" w:sz="4"/>
+          <w:insideV w:val="single" w:color="auto" w:sz="4"/>
+        </w:tblBorders>
+      </w:tblPr>
+      <w:tblGrid>
+        <w:gridCol w:w="3000"/>
+        <w:gridCol w:w="4168"/>
+        <w:gridCol w:w="3200"/>
+      </w:tblGrid>
+      <w:tr>
+        <w:trPr>
+          <w:tblHeader/>
+        </w:trPr>
+        <w:tc>
+          <w:tcPr>
+            <w:tcW w:type="dxa" w:w="3000"/>
+            <w:tcBorders>
+              <w:top w:val="single" w:color="BFBFBF" w:sz="4"/>
+              <w:left w:val="single" w:color="BFBFBF" w:sz="4"/>
+              <w:bottom w:val="single" w:color="BFBFBF" w:sz="4"/>
+              <w:right w:val="single" w:color="BFBFBF" w:sz="4"/>
+            </w:tcBorders>
+            <w:shd w:fill="D9EAF7" w:color="auto" w:val="clear"/>
+            <w:tcMar>
+              <w:top w:type="dxa" w:w="40"/>
+              <w:left w:type="dxa" w:w="100"/>
+              <w:bottom w:type="dxa" w:w="40"/>
+              <w:right w:type="dxa" w:w="100"/>
+            </w:tcMar>
+          </w:tcPr>
+          <w:p>
+            <w:pPr>
+              <w:spacing w:after="0"/>
+            </w:pPr>
+            <w:r>
+              <w:rPr>
+                <w:rFonts w:ascii="TH Sarabun New" w:cs="TH Sarabun New" w:eastAsia="TH Sarabun New" w:hAnsi="TH Sarabun New"/>
+                <w:b/>
+                <w:bCs/>
+                <w:sz w:val="28"/>
+                <w:szCs w:val="28"/>
+              </w:rPr>
+              <w:t xml:space="preserve">ถ้า…</w:t>
+            </w:r>
+          </w:p>
+        </w:tc>
+        <w:tc>
+          <w:tcPr>
+            <w:tcW w:type="dxa" w:w="4168"/>
+            <w:tcBorders>
+              <w:top w:val="single" w:color="BFBFBF" w:sz="4"/>
+              <w:left w:val="single" w:color="BFBFBF" w:sz="4"/>
+              <w:bottom w:val="single" w:color="BFBFBF" w:sz="4"/>
+              <w:right w:val="single" w:color="BFBFBF" w:sz="4"/>
+            </w:tcBorders>
+            <w:shd w:fill="D9EAF7" w:color="auto" w:val="clear"/>
+            <w:tcMar>
+              <w:top w:type="dxa" w:w="40"/>
+              <w:left w:type="dxa" w:w="100"/>
+              <w:bottom w:type="dxa" w:w="40"/>
+              <w:right w:type="dxa" w:w="100"/>
+            </w:tcMar>
+          </w:tcPr>
+          <w:p>
+            <w:pPr>
+              <w:spacing w:after="0"/>
+            </w:pPr>
+            <w:r>
+              <w:rPr>
+                <w:rFonts w:ascii="TH Sarabun New" w:cs="TH Sarabun New" w:eastAsia="TH Sarabun New" w:hAnsi="TH Sarabun New"/>
+                <w:b/>
+                <w:bCs/>
+                <w:sz w:val="28"/>
+                <w:szCs w:val="28"/>
+              </w:rPr>
+              <w:t xml:space="preserve">ให้ทำแบบนี้</w:t>
+            </w:r>
+          </w:p>
+        </w:tc>
+        <w:tc>
+          <w:tcPr>
+            <w:tcW w:type="dxa" w:w="3200"/>
+            <w:tcBorders>
+              <w:top w:val="single" w:color="BFBFBF" w:sz="4"/>
+              <w:left w:val="single" w:color="BFBFBF" w:sz="4"/>
+              <w:bottom w:val="single" w:color="BFBFBF" w:sz="4"/>
+              <w:right w:val="single" w:color="BFBFBF" w:sz="4"/>
+            </w:tcBorders>
+            <w:shd w:fill="D9EAF7" w:color="auto" w:val="clear"/>
+            <w:tcMar>
+              <w:top w:type="dxa" w:w="40"/>
+              <w:left w:type="dxa" w:w="100"/>
+              <w:bottom w:type="dxa" w:w="40"/>
+              <w:right w:type="dxa" w:w="100"/>
+            </w:tcMar>
+          </w:tcPr>
+          <w:p>
+            <w:pPr>
+              <w:spacing w:after="0"/>
+            </w:pPr>
+            <w:r>
+              <w:rPr>
+                <w:rFonts w:ascii="TH Sarabun New" w:cs="TH Sarabun New" w:eastAsia="TH Sarabun New" w:hAnsi="TH Sarabun New"/>
+                <w:b/>
+                <w:bCs/>
+                <w:sz w:val="28"/>
+                <w:szCs w:val="28"/>
+              </w:rPr>
+              <w:t xml:space="preserve">ผลต่อคะแนน</w:t>
+            </w:r>
+          </w:p>
+        </w:tc>
+      </w:tr>
+      <w:tr>
+        <w:tc>
+          <w:tcPr>
+            <w:tcW w:type="dxa" w:w="3000"/>
+            <w:tcBorders>
+              <w:top w:val="single" w:color="BFBFBF" w:sz="4"/>
+              <w:left w:val="single" w:color="BFBFBF" w:sz="4"/>
+              <w:bottom w:val="single" w:color="BFBFBF" w:sz="4"/>
+              <w:right w:val="single" w:color="BFBFBF" w:sz="4"/>
+            </w:tcBorders>
+            <w:tcMar>
+              <w:top w:type="dxa" w:w="40"/>
+              <w:left w:type="dxa" w:w="100"/>
+              <w:bottom w:type="dxa" w:w="40"/>
+              <w:right w:type="dxa" w:w="100"/>
+            </w:tcMar>
+          </w:tcPr>
+          <w:p>
+            <w:pPr>
+              <w:spacing w:after="0"/>
+            </w:pPr>
+            <w:r>
+              <w:rPr>
+                <w:rFonts w:ascii="TH Sarabun New" w:cs="TH Sarabun New" w:eastAsia="TH Sarabun New" w:hAnsi="TH Sarabun New"/>
+                <w:b w:val="false"/>
+                <w:bCs w:val="false"/>
+                <w:sz w:val="28"/>
+                <w:szCs w:val="28"/>
+              </w:rPr>
+              <w:t xml:space="preserve">ทำระดับ 2 ไม่ทัน</w:t>
+            </w:r>
+          </w:p>
+        </w:tc>
+        <w:tc>
+          <w:tcPr>
+            <w:tcW w:type="dxa" w:w="4168"/>
+            <w:tcBorders>
+              <w:top w:val="single" w:color="BFBFBF" w:sz="4"/>
+              <w:left w:val="single" w:color="BFBFBF" w:sz="4"/>
+              <w:bottom w:val="single" w:color="BFBFBF" w:sz="4"/>
+              <w:right w:val="single" w:color="BFBFBF" w:sz="4"/>
+            </w:tcBorders>
+            <w:tcMar>
+              <w:top w:type="dxa" w:w="40"/>
+              <w:left w:type="dxa" w:w="100"/>
+              <w:bottom w:type="dxa" w:w="40"/>
+              <w:right w:type="dxa" w:w="100"/>
+            </w:tcMar>
+          </w:tcPr>
+          <w:p>
+            <w:pPr>
+              <w:spacing w:after="0"/>
+            </w:pPr>
+            <w:r>
+              <w:rPr>
+                <w:rFonts w:ascii="TH Sarabun New" w:cs="TH Sarabun New" w:eastAsia="TH Sarabun New" w:hAnsi="TH Sarabun New"/>
+                <w:b w:val="false"/>
+                <w:bCs w:val="false"/>
+                <w:sz w:val="28"/>
+                <w:szCs w:val="28"/>
+              </w:rPr>
+              <w:t xml:space="preserve">ส่งงานระดับ 1</w:t>
+            </w:r>
+          </w:p>
+        </w:tc>
+        <w:tc>
+          <w:tcPr>
+            <w:tcW w:type="dxa" w:w="3200"/>
+            <w:tcBorders>
+              <w:top w:val="single" w:color="BFBFBF" w:sz="4"/>
+              <w:left w:val="single" w:color="BFBFBF" w:sz="4"/>
+              <w:bottom w:val="single" w:color="BFBFBF" w:sz="4"/>
+              <w:right w:val="single" w:color="BFBFBF" w:sz="4"/>
+            </w:tcBorders>
+            <w:tcMar>
+              <w:top w:type="dxa" w:w="40"/>
+              <w:left w:type="dxa" w:w="100"/>
+              <w:bottom w:type="dxa" w:w="40"/>
+              <w:right w:type="dxa" w:w="100"/>
+            </w:tcMar>
+          </w:tcPr>
+          <w:p>
+            <w:pPr>
+              <w:spacing w:after="0"/>
+            </w:pPr>
+            <w:r>
+              <w:rPr>
+                <w:rFonts w:ascii="TH Sarabun New" w:cs="TH Sarabun New" w:eastAsia="TH Sarabun New" w:hAnsi="TH Sarabun New"/>
+                <w:b w:val="false"/>
+                <w:bCs w:val="false"/>
+                <w:sz w:val="28"/>
+                <w:szCs w:val="28"/>
+              </w:rPr>
+              <w:t xml:space="preserve">ยังได้เต็มหมวดจอ · หมวดเซนเซอร์และกฎได้ตามที่ไฟล์ตั้งต้นมี</w:t>
+            </w:r>
+          </w:p>
+        </w:tc>
+      </w:tr>
+      <w:tr>
+        <w:tc>
+          <w:tcPr>
+            <w:tcW w:type="dxa" w:w="3000"/>
+            <w:tcBorders>
+              <w:top w:val="single" w:color="BFBFBF" w:sz="4"/>
+              <w:left w:val="single" w:color="BFBFBF" w:sz="4"/>
+              <w:bottom w:val="single" w:color="BFBFBF" w:sz="4"/>
+              <w:right w:val="single" w:color="BFBFBF" w:sz="4"/>
+            </w:tcBorders>
+            <w:tcMar>
+              <w:top w:type="dxa" w:w="40"/>
+              <w:left w:type="dxa" w:w="100"/>
+              <w:bottom w:type="dxa" w:w="40"/>
+              <w:right w:type="dxa" w:w="100"/>
+            </w:tcMar>
+          </w:tcPr>
+          <w:p>
+            <w:pPr>
+              <w:spacing w:after="0"/>
+            </w:pPr>
+            <w:r>
+              <w:rPr>
+                <w:rFonts w:ascii="TH Sarabun New" w:cs="TH Sarabun New" w:eastAsia="TH Sarabun New" w:hAnsi="TH Sarabun New"/>
+                <w:b w:val="false"/>
+                <w:bCs w:val="false"/>
+                <w:sz w:val="28"/>
+                <w:szCs w:val="28"/>
+              </w:rPr>
+              <w:t xml:space="preserve">แก้ระดับ 1 แล้วบอร์ด error</w:t>
+            </w:r>
+          </w:p>
+        </w:tc>
+        <w:tc>
+          <w:tcPr>
+            <w:tcW w:type="dxa" w:w="4168"/>
+            <w:tcBorders>
+              <w:top w:val="single" w:color="BFBFBF" w:sz="4"/>
+              <w:left w:val="single" w:color="BFBFBF" w:sz="4"/>
+              <w:bottom w:val="single" w:color="BFBFBF" w:sz="4"/>
+              <w:right w:val="single" w:color="BFBFBF" w:sz="4"/>
+            </w:tcBorders>
+            <w:tcMar>
+              <w:top w:type="dxa" w:w="40"/>
+              <w:left w:type="dxa" w:w="100"/>
+              <w:bottom w:type="dxa" w:w="40"/>
+              <w:right w:type="dxa" w:w="100"/>
+            </w:tcMar>
+          </w:tcPr>
+          <w:p>
+            <w:pPr>
+              <w:spacing w:after="0"/>
+            </w:pPr>
+            <w:r>
+              <w:rPr>
+                <w:rFonts w:ascii="TH Sarabun New" w:cs="TH Sarabun New" w:eastAsia="TH Sarabun New" w:hAnsi="TH Sarabun New"/>
+                <w:b w:val="false"/>
+                <w:bCs w:val="false"/>
+                <w:sz w:val="28"/>
+                <w:szCs w:val="28"/>
+              </w:rPr>
+              <w:t xml:space="preserve">กลับไปใช้ไฟล์ที่รันได้ล่าสุด (เซฟสำเนาก่อนแก้ทุกครั้ง) แล้วแก้ทีละจุดใหม่</w:t>
+            </w:r>
+          </w:p>
+        </w:tc>
+        <w:tc>
+          <w:tcPr>
+            <w:tcW w:type="dxa" w:w="3200"/>
+            <w:tcBorders>
+              <w:top w:val="single" w:color="BFBFBF" w:sz="4"/>
+              <w:left w:val="single" w:color="BFBFBF" w:sz="4"/>
+              <w:bottom w:val="single" w:color="BFBFBF" w:sz="4"/>
+              <w:right w:val="single" w:color="BFBFBF" w:sz="4"/>
+            </w:tcBorders>
+            <w:tcMar>
+              <w:top w:type="dxa" w:w="40"/>
+              <w:left w:type="dxa" w:w="100"/>
+              <w:bottom w:type="dxa" w:w="40"/>
+              <w:right w:type="dxa" w:w="100"/>
+            </w:tcMar>
+          </w:tcPr>
+          <w:p>
+            <w:pPr>
+              <w:spacing w:after="0"/>
+            </w:pPr>
+            <w:r>
+              <w:rPr>
+                <w:rFonts w:ascii="TH Sarabun New" w:cs="TH Sarabun New" w:eastAsia="TH Sarabun New" w:hAnsi="TH Sarabun New"/>
+                <w:b w:val="false"/>
+                <w:bCs w:val="false"/>
+                <w:sz w:val="28"/>
+                <w:szCs w:val="28"/>
+              </w:rPr>
+              <w:t xml:space="preserve">ไม่เสียคะแนน ถ้าวันนำเสนอรันได้</w:t>
+            </w:r>
+          </w:p>
+        </w:tc>
+      </w:tr>
+      <w:tr>
+        <w:tc>
+          <w:tcPr>
+            <w:tcW w:type="dxa" w:w="3000"/>
+            <w:tcBorders>
+              <w:top w:val="single" w:color="BFBFBF" w:sz="4"/>
+              <w:left w:val="single" w:color="BFBFBF" w:sz="4"/>
+              <w:bottom w:val="single" w:color="BFBFBF" w:sz="4"/>
+              <w:right w:val="single" w:color="BFBFBF" w:sz="4"/>
+            </w:tcBorders>
+            <w:tcMar>
+              <w:top w:type="dxa" w:w="40"/>
+              <w:left w:type="dxa" w:w="100"/>
+              <w:bottom w:type="dxa" w:w="40"/>
+              <w:right w:type="dxa" w:w="100"/>
+            </w:tcMar>
+          </w:tcPr>
+          <w:p>
+            <w:pPr>
+              <w:spacing w:after="0"/>
+            </w:pPr>
+            <w:r>
+              <w:rPr>
+                <w:rFonts w:ascii="TH Sarabun New" w:cs="TH Sarabun New" w:eastAsia="TH Sarabun New" w:hAnsi="TH Sarabun New"/>
+                <w:b w:val="false"/>
+                <w:bCs w:val="false"/>
+                <w:sz w:val="28"/>
+                <w:szCs w:val="28"/>
+              </w:rPr>
+              <w:t xml:space="preserve">แก้ระดับ 1 ไม่ได้เลย</w:t>
+            </w:r>
+          </w:p>
+        </w:tc>
+        <w:tc>
+          <w:tcPr>
+            <w:tcW w:type="dxa" w:w="4168"/>
+            <w:tcBorders>
+              <w:top w:val="single" w:color="BFBFBF" w:sz="4"/>
+              <w:left w:val="single" w:color="BFBFBF" w:sz="4"/>
+              <w:bottom w:val="single" w:color="BFBFBF" w:sz="4"/>
+              <w:right w:val="single" w:color="BFBFBF" w:sz="4"/>
+            </w:tcBorders>
+            <w:tcMar>
+              <w:top w:type="dxa" w:w="40"/>
+              <w:left w:type="dxa" w:w="100"/>
+              <w:bottom w:type="dxa" w:w="40"/>
+              <w:right w:type="dxa" w:w="100"/>
+            </w:tcMar>
+          </w:tcPr>
+          <w:p>
+            <w:pPr>
+              <w:spacing w:after="0"/>
+            </w:pPr>
+            <w:r>
+              <w:rPr>
+                <w:rFonts w:ascii="TH Sarabun New" w:cs="TH Sarabun New" w:eastAsia="TH Sarabun New" w:hAnsi="TH Sarabun New"/>
+                <w:b w:val="false"/>
+                <w:bCs w:val="false"/>
+                <w:sz w:val="28"/>
+                <w:szCs w:val="28"/>
+              </w:rPr>
+              <w:t xml:space="preserve">ใช้ไฟล์ตั้งต้นเดิม แก้แค่ TEAM แล้วเล่าเรื่องของทีมด้วยสไลด์</w:t>
+            </w:r>
+          </w:p>
+        </w:tc>
+        <w:tc>
+          <w:tcPr>
+            <w:tcW w:type="dxa" w:w="3200"/>
+            <w:tcBorders>
+              <w:top w:val="single" w:color="BFBFBF" w:sz="4"/>
+              <w:left w:val="single" w:color="BFBFBF" w:sz="4"/>
+              <w:bottom w:val="single" w:color="BFBFBF" w:sz="4"/>
+              <w:right w:val="single" w:color="BFBFBF" w:sz="4"/>
+            </w:tcBorders>
+            <w:tcMar>
+              <w:top w:type="dxa" w:w="40"/>
+              <w:left w:type="dxa" w:w="100"/>
+              <w:bottom w:type="dxa" w:w="40"/>
+              <w:right w:type="dxa" w:w="100"/>
+            </w:tcMar>
+          </w:tcPr>
+          <w:p>
+            <w:pPr>
+              <w:spacing w:after="0"/>
+            </w:pPr>
+            <w:r>
+              <w:rPr>
+                <w:rFonts w:ascii="TH Sarabun New" w:cs="TH Sarabun New" w:eastAsia="TH Sarabun New" w:hAnsi="TH Sarabun New"/>
+                <w:b w:val="false"/>
+                <w:bCs w:val="false"/>
+                <w:sz w:val="28"/>
+                <w:szCs w:val="28"/>
+              </w:rPr>
+              <w:t xml:space="preserve">ผ่านขั้นต่ำ (ประมาณครึ่งหนึ่ง)</w:t>
+            </w:r>
+          </w:p>
+        </w:tc>
+      </w:tr>
+      <w:tr>
+        <w:tc>
+          <w:tcPr>
+            <w:tcW w:type="dxa" w:w="3000"/>
+            <w:tcBorders>
+              <w:top w:val="single" w:color="BFBFBF" w:sz="4"/>
+              <w:left w:val="single" w:color="BFBFBF" w:sz="4"/>
+              <w:bottom w:val="single" w:color="BFBFBF" w:sz="4"/>
+              <w:right w:val="single" w:color="BFBFBF" w:sz="4"/>
+            </w:tcBorders>
+            <w:tcMar>
+              <w:top w:type="dxa" w:w="40"/>
+              <w:left w:type="dxa" w:w="100"/>
+              <w:bottom w:type="dxa" w:w="40"/>
+              <w:right w:type="dxa" w:w="100"/>
+            </w:tcMar>
+          </w:tcPr>
+          <w:p>
+            <w:pPr>
+              <w:spacing w:after="0"/>
+            </w:pPr>
+            <w:r>
+              <w:rPr>
+                <w:rFonts w:ascii="TH Sarabun New" w:cs="TH Sarabun New" w:eastAsia="TH Sarabun New" w:hAnsi="TH Sarabun New"/>
+                <w:b w:val="false"/>
+                <w:bCs w:val="false"/>
+                <w:sz w:val="28"/>
+                <w:szCs w:val="28"/>
+              </w:rPr>
+              <w:t xml:space="preserve">ทำหน้าเว็บด้วย vibe coding ไม่สำเร็จ</w:t>
+            </w:r>
+          </w:p>
+        </w:tc>
+        <w:tc>
+          <w:tcPr>
+            <w:tcW w:type="dxa" w:w="4168"/>
+            <w:tcBorders>
+              <w:top w:val="single" w:color="BFBFBF" w:sz="4"/>
+              <w:left w:val="single" w:color="BFBFBF" w:sz="4"/>
+              <w:bottom w:val="single" w:color="BFBFBF" w:sz="4"/>
+              <w:right w:val="single" w:color="BFBFBF" w:sz="4"/>
+            </w:tcBorders>
+            <w:tcMar>
+              <w:top w:type="dxa" w:w="40"/>
+              <w:left w:type="dxa" w:w="100"/>
+              <w:bottom w:type="dxa" w:w="40"/>
+              <w:right w:type="dxa" w:w="100"/>
+            </w:tcMar>
+          </w:tcPr>
+          <w:p>
+            <w:pPr>
+              <w:spacing w:after="0"/>
+            </w:pPr>
+            <w:r>
+              <w:rPr>
+                <w:rFonts w:ascii="TH Sarabun New" w:cs="TH Sarabun New" w:eastAsia="TH Sarabun New" w:hAnsi="TH Sarabun New"/>
+                <w:b w:val="false"/>
+                <w:bCs w:val="false"/>
+                <w:sz w:val="28"/>
+                <w:szCs w:val="28"/>
+              </w:rPr>
+              <w:t xml:space="preserve">เปิด farm_web.html?team=teamXX แทน (เห็นทุกค่า · ส่งคำสั่ง ack/pump ได้ · จด CSV ได้)</w:t>
+            </w:r>
+          </w:p>
+        </w:tc>
+        <w:tc>
+          <w:tcPr>
+            <w:tcW w:type="dxa" w:w="3200"/>
+            <w:tcBorders>
+              <w:top w:val="single" w:color="BFBFBF" w:sz="4"/>
+              <w:left w:val="single" w:color="BFBFBF" w:sz="4"/>
+              <w:bottom w:val="single" w:color="BFBFBF" w:sz="4"/>
+              <w:right w:val="single" w:color="BFBFBF" w:sz="4"/>
+            </w:tcBorders>
+            <w:tcMar>
+              <w:top w:type="dxa" w:w="40"/>
+              <w:left w:type="dxa" w:w="100"/>
+              <w:bottom w:type="dxa" w:w="40"/>
+              <w:right w:type="dxa" w:w="100"/>
+            </w:tcMar>
+          </w:tcPr>
+          <w:p>
+            <w:pPr>
+              <w:spacing w:after="0"/>
+            </w:pPr>
+            <w:r>
+              <w:rPr>
+                <w:rFonts w:ascii="TH Sarabun New" w:cs="TH Sarabun New" w:eastAsia="TH Sarabun New" w:hAnsi="TH Sarabun New"/>
+                <w:b w:val="false"/>
+                <w:bCs w:val="false"/>
+                <w:sz w:val="28"/>
+                <w:szCs w:val="28"/>
+              </w:rPr>
+              <w:t xml:space="preserve">หักเฉพาะหมวดเว็บ ประมาณครึ่ง</w:t>
+            </w:r>
+          </w:p>
+        </w:tc>
+      </w:tr>
+      <w:tr>
+        <w:tc>
+          <w:tcPr>
+            <w:tcW w:type="dxa" w:w="3000"/>
+            <w:tcBorders>
+              <w:top w:val="single" w:color="BFBFBF" w:sz="4"/>
+              <w:left w:val="single" w:color="BFBFBF" w:sz="4"/>
+              <w:bottom w:val="single" w:color="BFBFBF" w:sz="4"/>
+              <w:right w:val="single" w:color="BFBFBF" w:sz="4"/>
+            </w:tcBorders>
+            <w:tcMar>
+              <w:top w:type="dxa" w:w="40"/>
+              <w:left w:type="dxa" w:w="100"/>
+              <w:bottom w:type="dxa" w:w="40"/>
+              <w:right w:type="dxa" w:w="100"/>
+            </w:tcMar>
+          </w:tcPr>
+          <w:p>
+            <w:pPr>
+              <w:spacing w:after="0"/>
+            </w:pPr>
+            <w:r>
+              <w:rPr>
+                <w:rFonts w:ascii="TH Sarabun New" w:cs="TH Sarabun New" w:eastAsia="TH Sarabun New" w:hAnsi="TH Sarabun New"/>
+                <w:b w:val="false"/>
+                <w:bCs w:val="false"/>
+                <w:sz w:val="28"/>
+                <w:szCs w:val="28"/>
+              </w:rPr>
+              <w:t xml:space="preserve">ติดจนไปต่อไม่ได้</w:t>
+            </w:r>
+          </w:p>
+        </w:tc>
+        <w:tc>
+          <w:tcPr>
+            <w:tcW w:type="dxa" w:w="4168"/>
+            <w:tcBorders>
+              <w:top w:val="single" w:color="BFBFBF" w:sz="4"/>
+              <w:left w:val="single" w:color="BFBFBF" w:sz="4"/>
+              <w:bottom w:val="single" w:color="BFBFBF" w:sz="4"/>
+              <w:right w:val="single" w:color="BFBFBF" w:sz="4"/>
+            </w:tcBorders>
+            <w:tcMar>
+              <w:top w:type="dxa" w:w="40"/>
+              <w:left w:type="dxa" w:w="100"/>
+              <w:bottom w:type="dxa" w:w="40"/>
+              <w:right w:type="dxa" w:w="100"/>
+            </w:tcMar>
+          </w:tcPr>
+          <w:p>
+            <w:pPr>
+              <w:spacing w:after="0"/>
+            </w:pPr>
+            <w:r>
+              <w:rPr>
+                <w:rFonts w:ascii="TH Sarabun New" w:cs="TH Sarabun New" w:eastAsia="TH Sarabun New" w:hAnsi="TH Sarabun New"/>
+                <w:b w:val="false"/>
+                <w:bCs w:val="false"/>
+                <w:sz w:val="28"/>
+                <w:szCs w:val="28"/>
+              </w:rPr>
+              <w:t xml:space="preserve">ส่งภาพหน้าจอบอร์ดและ error ในกลุ่มแชทของคอร์ส ผู้ช่วยสอนช่วยภายในวันนั้น</w:t>
+            </w:r>
+          </w:p>
+        </w:tc>
+        <w:tc>
+          <w:tcPr>
+            <w:tcW w:type="dxa" w:w="3200"/>
+            <w:tcBorders>
+              <w:top w:val="single" w:color="BFBFBF" w:sz="4"/>
+              <w:left w:val="single" w:color="BFBFBF" w:sz="4"/>
+              <w:bottom w:val="single" w:color="BFBFBF" w:sz="4"/>
+              <w:right w:val="single" w:color="BFBFBF" w:sz="4"/>
+            </w:tcBorders>
+            <w:tcMar>
+              <w:top w:type="dxa" w:w="40"/>
+              <w:left w:type="dxa" w:w="100"/>
+              <w:bottom w:type="dxa" w:w="40"/>
+              <w:right w:type="dxa" w:w="100"/>
+            </w:tcMar>
+          </w:tcPr>
+          <w:p>
+            <w:pPr>
+              <w:spacing w:after="0"/>
+            </w:pPr>
+            <w:r>
+              <w:rPr>
+                <w:rFonts w:ascii="TH Sarabun New" w:cs="TH Sarabun New" w:eastAsia="TH Sarabun New" w:hAnsi="TH Sarabun New"/>
+                <w:b w:val="false"/>
+                <w:bCs w:val="false"/>
+                <w:sz w:val="28"/>
+                <w:szCs w:val="28"/>
+              </w:rPr>
+              <w:t xml:space="preserve">ไม่เสียคะแนน</w:t>
+            </w:r>
+          </w:p>
+        </w:tc>
+      </w:tr>
+    </w:tbl>
+    <w:p>
+      <w:pPr>
+        <w:spacing w:after="60"/>
+      </w:pPr>
+    </w:p>
+    <w:p>
+      <w:pPr>
+        <w:spacing w:after="80"/>
+      </w:pPr>
+      <w:r>
+        <w:rPr>
+          <w:rFonts w:ascii="TH Sarabun New" w:cs="TH Sarabun New" w:eastAsia="TH Sarabun New" w:hAnsi="TH Sarabun New"/>
+          <w:sz w:val="30"/>
+          <w:szCs w:val="30"/>
+        </w:rPr>
+        <w:t xml:space="preserve">☐ </w:t>
+      </w:r>
+      <w:r>
+        <w:rPr>
+          <w:rFonts w:ascii="TH Sarabun New" w:cs="TH Sarabun New" w:eastAsia="TH Sarabun New" w:hAnsi="TH Sarabun New"/>
+          <w:b/>
+          <w:bCs/>
+          <w:sz w:val="30"/>
+          <w:szCs w:val="30"/>
+        </w:rPr>
+        <w:t xml:space="preserve">จุดตรวจกลางสัปดาห์ (วันที่ 3):</w:t>
+      </w:r>
+      <w:r>
+        <w:rPr>
+          <w:rFonts w:ascii="TH Sarabun New" w:cs="TH Sarabun New" w:eastAsia="TH Sarabun New" w:hAnsi="TH Sarabun New"/>
+          <w:sz w:val="30"/>
+          <w:szCs w:val="30"/>
+        </w:rPr>
+        <w:t xml:space="preserve"> ส่งภาพจอบอร์ดของทีม + ภาพ farm_web ที่เห็นค่าของกลุ่ม ในกลุ่มแชทของคอร์ส</w:t>
       </w:r>
     </w:p>
     <w:p>
@@ -3017,7 +3727,7 @@
                 <w:sz w:val="28"/>
                 <w:szCs w:val="28"/>
               </w:rPr>
-              <w:t xml:space="preserve">ระดับ 2: กฎกันเตือนผิด · ปุ่ม · เสียง + matrix</w:t>
+              <w:t xml:space="preserve">ส่งภาพจุดตรวจ · ระดับ 2 ถ้าทำได้</w:t>
             </w:r>
           </w:p>
         </w:tc>
@@ -3049,7 +3759,7 @@
                 <w:sz w:val="28"/>
                 <w:szCs w:val="28"/>
               </w:rPr>
-              <w:t xml:space="preserve">ต่อบอร์ดจริง · ปุ่มสั่งกลับ · CSV</w:t>
+              <w:t xml:space="preserve">ต่อบอร์ดจริง · ปุ่มสั่งกลับ · CSV · ส่งภาพจุดตรวจ</w:t>
             </w:r>
           </w:p>
         </w:tc>
@@ -7505,7 +8215,7 @@
         </w:rPr>
         <w:t xml:space="preserve">ไฟล์คาบ 2 (ไฟล์ตั้งต้น): </w:t>
       </w:r>
-      <w:hyperlink w:history="1" r:id="rIdtlkice0cjcucbwmpr4xqy">
+      <w:hyperlink w:history="1" r:id="rIdk0edk2zkn4nfuac_dv8wp">
         <w:r>
           <w:rPr>
             <w:rFonts w:ascii="TH Sarabun New" w:cs="TH Sarabun New" w:eastAsia="TH Sarabun New" w:hAnsi="TH Sarabun New"/>
@@ -7530,7 +8240,7 @@
         </w:rPr>
         <w:t xml:space="preserve">farm_web.html (หน้าเว็บสำรองของห้อง): </w:t>
       </w:r>
-      <w:hyperlink w:history="1" r:id="rId5fuk84ijno1qnzeqiqq0y">
+      <w:hyperlink w:history="1" r:id="rIdkzr4swn7vqo3613iczgji">
         <w:r>
           <w:rPr>
             <w:rFonts w:ascii="TH Sarabun New" w:cs="TH Sarabun New" w:eastAsia="TH Sarabun New" w:hAnsi="TH Sarabun New"/>
@@ -7555,7 +8265,7 @@
         </w:rPr>
         <w:t xml:space="preserve">สัญญา MQTT (วางให้ AI ก่อน vibe coding): </w:t>
       </w:r>
-      <w:hyperlink w:history="1" r:id="rId7tk6_7nny_ca3yrvexf0q">
+      <w:hyperlink w:history="1" r:id="rIdrpvc4fnd5xzekavmzient">
         <w:r>
           <w:rPr>
             <w:rFonts w:ascii="TH Sarabun New" w:cs="TH Sarabun New" w:eastAsia="TH Sarabun New" w:hAnsi="TH Sarabun New"/>
@@ -7580,7 +8290,7 @@
         </w:rPr>
         <w:t xml:space="preserve">fake_board.html (บอร์ดจำลองสำหรับทดสอบเว็บ): </w:t>
       </w:r>
-      <w:hyperlink w:history="1" r:id="rIdswmqsw5_mj7kbzhxeevih">
+      <w:hyperlink w:history="1" r:id="rIdpij9mgeggdv2cy4kujsgm">
         <w:r>
           <w:rPr>
             <w:rFonts w:ascii="TH Sarabun New" w:cs="TH Sarabun New" w:eastAsia="TH Sarabun New" w:hAnsi="TH Sarabun New"/>
@@ -7605,7 +8315,7 @@
         </w:rPr>
         <w:t xml:space="preserve">ai_farm.html (หน้าเว็บคาบ 3 คู่กับ sf3_08 · ดูเป็นแรงบันดาลใจฝั่งเว็บ หรือใช้กับโบนัส AI เท่านั้น): </w:t>
       </w:r>
-      <w:hyperlink w:history="1" r:id="rId2qpnsbmfcmqy0szrfzjyf">
+      <w:hyperlink w:history="1" r:id="rIdatqkef0f5ejejxngr_6qq">
         <w:r>
           <w:rPr>
             <w:rFonts w:ascii="TH Sarabun New" w:cs="TH Sarabun New" w:eastAsia="TH Sarabun New" w:hAnsi="TH Sarabun New"/>

</xml_diff>

<commit_message>
feat(project): 25 stories with full starter code, a first-come signup page, and three future Edge AI examples
project/: stories 9-25 are generated from four tested templates (environment alert, remote actuator, vibration, radar), each with its board file and an idea_web.html entry; every starter file states it must be extended, not submitted as is. All 25 run in the BENTO Emulator without a traceback and pass the board-font glyph gate and mpy-cross.

project/signup.html: each team claims one story over the course MQTT broker; a team writes only its own retained topic and the earliest claim wins, so a reload keeps the state. Teacher view (?teacher=1) can close sign-up and export CSV.

project/ai_future/: three Edge AI examples (pump anomaly, siren, voice go/stop) kept outside this term's project.

The brief, the kickoff slides and the session 3 worksheet now describe 25 stories, one team each.
</commit_message>
<xml_diff>
--- a/PROJECT_BRIEF_lite_th.docx
+++ b/PROJECT_BRIEF_lite_th.docx
@@ -45,7 +45,7 @@
           <w:sz w:val="32"/>
           <w:szCs w:val="32"/>
         </w:rPr>
-        <w:t xml:space="preserve">เลือก 1 ใน 8 ไอเดีย → รับชุดเริ่มต้น (บอร์ด + เว็บ) ที่รันได้แล้ว → ต่อยอดให้เป็นเรื่องของทีม</w:t>
+        <w:t xml:space="preserve">เลือก 1 ใน 25 เรื่อง → รับโค้ดเริ่มต้น (บอร์ด + เว็บ) ที่รันได้แล้ว → ต่อยอดเองอย่างน้อย 3 อย่าง</w:t>
       </w:r>
     </w:p>
     <w:p>
@@ -376,7 +376,7 @@
                 <w:sz w:val="28"/>
                 <w:szCs w:val="28"/>
               </w:rPr>
-              <w:t xml:space="preserve">ไอเดียที่เลือก (1–8)</w:t>
+              <w:t xml:space="preserve">เรื่องที่เลือก (1–25)</w:t>
             </w:r>
           </w:p>
         </w:tc>
@@ -442,7 +442,7 @@
                 <w:sz w:val="28"/>
                 <w:szCs w:val="28"/>
               </w:rPr>
-              <w:t xml:space="preserve">ผู้ใช้ / สถานที่ของทีม (ห้ามซ้ำทีมอื่น)</w:t>
+              <w:t xml:space="preserve">ผู้ใช้หน้างานของทีม</w:t>
             </w:r>
           </w:p>
         </w:tc>
@@ -515,7 +515,7 @@
           <w:sz w:val="30"/>
           <w:szCs w:val="30"/>
         </w:rPr>
-        <w:t xml:space="preserve">ไอเดียหนึ่งข้อ</w:t>
+        <w:t xml:space="preserve">เรื่องหนึ่งเรื่อง</w:t>
       </w:r>
       <w:r>
         <w:rPr>
@@ -533,7 +533,7 @@
           <w:sz w:val="30"/>
           <w:szCs w:val="30"/>
         </w:rPr>
-        <w:t xml:space="preserve">ชุดเริ่มต้น</w:t>
+        <w:t xml:space="preserve">โค้ดเริ่มต้น</w:t>
       </w:r>
       <w:r>
         <w:rPr>
@@ -541,7 +541,7 @@
           <w:sz w:val="30"/>
           <w:szCs w:val="30"/>
         </w:rPr>
-        <w:t xml:space="preserve"> ของไอเดียนั้น (ไฟล์บอร์ด + หน้าเว็บ ที่รันได้แล้ว) ไป </w:t>
+        <w:t xml:space="preserve"> ของเรื่องนั้น (ไฟล์บอร์ด + หน้าเว็บ ที่รันได้แล้ว) ไป </w:t>
       </w:r>
       <w:r>
         <w:rPr>
@@ -590,7 +590,7 @@
           <w:sz w:val="40"/>
           <w:szCs w:val="40"/>
         </w:rPr>
-        <w:t xml:space="preserve">1. ชุดเริ่มต้นของแต่ละไอเดีย</w:t>
+        <w:t xml:space="preserve">1. เลือก 1 ใน 25 เรื่อง (เรื่องละ 1 ทีม)</w:t>
       </w:r>
     </w:p>
     <w:p>
@@ -603,7 +603,7 @@
           <w:sz w:val="30"/>
           <w:szCs w:val="30"/>
         </w:rPr>
-        <w:t xml:space="preserve">ทุกไอเดียมีชุดเริ่มต้นในโฟลเดอร์ </w:t>
+        <w:t xml:space="preserve">ทุกเรื่องมีโค้ดเริ่มต้นครบในโฟลเดอร์ </w:t>
       </w:r>
       <w:r>
         <w:rPr>
@@ -621,7 +621,7 @@
           <w:sz w:val="30"/>
           <w:szCs w:val="30"/>
         </w:rPr>
-        <w:t xml:space="preserve"> ของคอร์ส: </w:t>
+        <w:t xml:space="preserve">: </w:t>
       </w:r>
       <w:r>
         <w:rPr>
@@ -639,7 +639,7 @@
           <w:sz w:val="30"/>
           <w:szCs w:val="30"/>
         </w:rPr>
-        <w:t xml:space="preserve"> 1 ไฟล์ (จอ ปุ่ม เสียง RGB matrix MQTT และรับคำสั่งจากมือถือครบแล้ว) และ </w:t>
+        <w:t xml:space="preserve"> (จอ ปุ่ม เสียง RGB matrix MQTT รับคำสั่งจากมือถือ) และ </w:t>
       </w:r>
       <w:r>
         <w:rPr>
@@ -657,7 +657,34 @@
           <w:sz w:val="30"/>
           <w:szCs w:val="30"/>
         </w:rPr>
-        <w:t xml:space="preserve"> idea_web.html ที่ตั้งค่าไว้สำหรับไอเดียนั้น</w:t>
+        <w:t xml:space="preserve"> idea_web.html ที่ตั้งค่าไว้สำหรับเรื่องนั้น · เรื่องที่ใช้ชุดเดียวกันมีโครงโค้ดเหมือนกัน ต่างกันที่เรื่องและค่าตั้ง</w:t>
+      </w:r>
+    </w:p>
+    <w:p>
+      <w:pPr>
+        <w:spacing w:before="60"/>
+      </w:pPr>
+      <w:r>
+        <w:rPr>
+          <w:rFonts w:ascii="TH Sarabun New" w:cs="TH Sarabun New" w:eastAsia="TH Sarabun New" w:hAnsi="TH Sarabun New"/>
+          <w:b/>
+          <w:bCs/>
+          <w:i/>
+          <w:iCs/>
+          <w:sz w:val="24"/>
+          <w:szCs w:val="24"/>
+        </w:rPr>
+        <w:t xml:space="preserve">ไฟล์เริ่มต้นเป็นจุดเริ่มเท่านั้น ห้ามส่งตามที่ได้ไป</w:t>
+      </w:r>
+      <w:r>
+        <w:rPr>
+          <w:rFonts w:ascii="TH Sarabun New" w:cs="TH Sarabun New" w:eastAsia="TH Sarabun New" w:hAnsi="TH Sarabun New"/>
+          <w:i/>
+          <w:iCs/>
+          <w:sz w:val="24"/>
+          <w:szCs w:val="24"/>
+        </w:rPr>
+        <w:t xml:space="preserve"> ทีมต้องต่อยอดเองอย่างน้อย 3 อย่าง (ข้อ 3) ไม่อย่างนั้นหมวดต่อยอดได้ศูนย์</w:t>
       </w:r>
     </w:p>
     <w:tbl>
@@ -673,10 +700,10 @@
         </w:tblBorders>
       </w:tblPr>
       <w:tblGrid>
+        <w:gridCol w:w="900"/>
+        <w:gridCol w:w="3600"/>
+        <w:gridCol w:w="3368"/>
         <w:gridCol w:w="2500"/>
-        <w:gridCol w:w="2900"/>
-        <w:gridCol w:w="2668"/>
-        <w:gridCol w:w="2300"/>
       </w:tblGrid>
       <w:tr>
         <w:trPr>
@@ -684,7 +711,7 @@
         </w:trPr>
         <w:tc>
           <w:tcPr>
-            <w:tcW w:type="dxa" w:w="2500"/>
+            <w:tcW w:type="dxa" w:w="900"/>
             <w:tcBorders>
               <w:top w:val="single" w:color="BFBFBF" w:sz="4"/>
               <w:left w:val="single" w:color="BFBFBF" w:sz="4"/>
@@ -711,13 +738,13 @@
                 <w:sz w:val="28"/>
                 <w:szCs w:val="28"/>
               </w:rPr>
-              <w:t xml:space="preserve">ไอเดีย</w:t>
-            </w:r>
-          </w:p>
-        </w:tc>
-        <w:tc>
-          <w:tcPr>
-            <w:tcW w:type="dxa" w:w="2900"/>
+              <w:t xml:space="preserve">#</w:t>
+            </w:r>
+          </w:p>
+        </w:tc>
+        <w:tc>
+          <w:tcPr>
+            <w:tcW w:type="dxa" w:w="3600"/>
             <w:tcBorders>
               <w:top w:val="single" w:color="BFBFBF" w:sz="4"/>
               <w:left w:val="single" w:color="BFBFBF" w:sz="4"/>
@@ -744,13 +771,13 @@
                 <w:sz w:val="28"/>
                 <w:szCs w:val="28"/>
               </w:rPr>
-              <w:t xml:space="preserve">ไฟล์บอร์ด (project/)</w:t>
-            </w:r>
-          </w:p>
-        </w:tc>
-        <w:tc>
-          <w:tcPr>
-            <w:tcW w:type="dxa" w:w="2668"/>
+              <w:t xml:space="preserve">เรื่อง</w:t>
+            </w:r>
+          </w:p>
+        </w:tc>
+        <w:tc>
+          <w:tcPr>
+            <w:tcW w:type="dxa" w:w="3368"/>
             <w:tcBorders>
               <w:top w:val="single" w:color="BFBFBF" w:sz="4"/>
               <w:left w:val="single" w:color="BFBFBF" w:sz="4"/>
@@ -777,13 +804,13 @@
                 <w:sz w:val="28"/>
                 <w:szCs w:val="28"/>
               </w:rPr>
-              <w:t xml:space="preserve">ชุดเริ่มต้นทำอะไรได้แล้ว</w:t>
-            </w:r>
-          </w:p>
-        </w:tc>
-        <w:tc>
-          <w:tcPr>
-            <w:tcW w:type="dxa" w:w="2300"/>
+              <w:t xml:space="preserve">ชุดเริ่มต้น</w:t>
+            </w:r>
+          </w:p>
+        </w:tc>
+        <w:tc>
+          <w:tcPr>
+            <w:tcW w:type="dxa" w:w="2500"/>
             <w:tcBorders>
               <w:top w:val="single" w:color="BFBFBF" w:sz="4"/>
               <w:left w:val="single" w:color="BFBFBF" w:sz="4"/>
@@ -810,7 +837,7 @@
                 <w:sz w:val="28"/>
                 <w:szCs w:val="28"/>
               </w:rPr>
-              <w:t xml:space="preserve">หน้าเว็บ</w:t>
+              <w:t xml:space="preserve">ไฟล์ (project/)</w:t>
             </w:r>
           </w:p>
         </w:tc>
@@ -818,6 +845,102 @@
       <w:tr>
         <w:tc>
           <w:tcPr>
+            <w:tcW w:type="dxa" w:w="900"/>
+            <w:tcBorders>
+              <w:top w:val="single" w:color="BFBFBF" w:sz="4"/>
+              <w:left w:val="single" w:color="BFBFBF" w:sz="4"/>
+              <w:bottom w:val="single" w:color="BFBFBF" w:sz="4"/>
+              <w:right w:val="single" w:color="BFBFBF" w:sz="4"/>
+            </w:tcBorders>
+            <w:tcMar>
+              <w:top w:type="dxa" w:w="40"/>
+              <w:left w:type="dxa" w:w="100"/>
+              <w:bottom w:type="dxa" w:w="40"/>
+              <w:right w:type="dxa" w:w="100"/>
+            </w:tcMar>
+          </w:tcPr>
+          <w:p>
+            <w:pPr>
+              <w:spacing w:after="0"/>
+            </w:pPr>
+            <w:r>
+              <w:rPr>
+                <w:rFonts w:ascii="TH Sarabun New" w:cs="TH Sarabun New" w:eastAsia="TH Sarabun New" w:hAnsi="TH Sarabun New"/>
+                <w:b w:val="false"/>
+                <w:bCs w:val="false"/>
+                <w:sz w:val="28"/>
+                <w:szCs w:val="28"/>
+              </w:rPr>
+              <w:t xml:space="preserve">1</w:t>
+            </w:r>
+          </w:p>
+        </w:tc>
+        <w:tc>
+          <w:tcPr>
+            <w:tcW w:type="dxa" w:w="3600"/>
+            <w:tcBorders>
+              <w:top w:val="single" w:color="BFBFBF" w:sz="4"/>
+              <w:left w:val="single" w:color="BFBFBF" w:sz="4"/>
+              <w:bottom w:val="single" w:color="BFBFBF" w:sz="4"/>
+              <w:right w:val="single" w:color="BFBFBF" w:sz="4"/>
+            </w:tcBorders>
+            <w:tcMar>
+              <w:top w:type="dxa" w:w="40"/>
+              <w:left w:type="dxa" w:w="100"/>
+              <w:bottom w:type="dxa" w:w="40"/>
+              <w:right w:type="dxa" w:w="100"/>
+            </w:tcMar>
+          </w:tcPr>
+          <w:p>
+            <w:pPr>
+              <w:spacing w:after="0"/>
+            </w:pPr>
+            <w:r>
+              <w:rPr>
+                <w:rFonts w:ascii="TH Sarabun New" w:cs="TH Sarabun New" w:eastAsia="TH Sarabun New" w:hAnsi="TH Sarabun New"/>
+                <w:b w:val="false"/>
+                <w:bCs w:val="false"/>
+                <w:sz w:val="28"/>
+                <w:szCs w:val="28"/>
+              </w:rPr>
+              <w:t xml:space="preserve">กล่องขนส่งผลไม้ห้องเย็น</w:t>
+            </w:r>
+          </w:p>
+        </w:tc>
+        <w:tc>
+          <w:tcPr>
+            <w:tcW w:type="dxa" w:w="3368"/>
+            <w:tcBorders>
+              <w:top w:val="single" w:color="BFBFBF" w:sz="4"/>
+              <w:left w:val="single" w:color="BFBFBF" w:sz="4"/>
+              <w:bottom w:val="single" w:color="BFBFBF" w:sz="4"/>
+              <w:right w:val="single" w:color="BFBFBF" w:sz="4"/>
+            </w:tcBorders>
+            <w:tcMar>
+              <w:top w:type="dxa" w:w="40"/>
+              <w:left w:type="dxa" w:w="100"/>
+              <w:bottom w:type="dxa" w:w="40"/>
+              <w:right w:type="dxa" w:w="100"/>
+            </w:tcMar>
+          </w:tcPr>
+          <w:p>
+            <w:pPr>
+              <w:spacing w:after="0"/>
+            </w:pPr>
+            <w:r>
+              <w:rPr>
+                <w:rFonts w:ascii="TH Sarabun New" w:cs="TH Sarabun New" w:eastAsia="TH Sarabun New" w:hAnsi="TH Sarabun New"/>
+                <w:b w:val="false"/>
+                <w:bCs w:val="false"/>
+                <w:sz w:val="28"/>
+                <w:szCs w:val="28"/>
+              </w:rPr>
+              <w:t xml:space="preserve">A · เฝ้าอากาศ + เตือน + รับทราบ</w:t>
+            </w:r>
+          </w:p>
+        </w:tc>
+        <w:tc>
+          <w:tcPr>
             <w:tcW w:type="dxa" w:w="2500"/>
             <w:tcBorders>
               <w:top w:val="single" w:color="BFBFBF" w:sz="4"/>
@@ -844,103 +967,7 @@
                 <w:sz w:val="28"/>
                 <w:szCs w:val="28"/>
               </w:rPr>
-              <w:t xml:space="preserve">1 · กล่องขนส่งผลไม้ห้องเย็น</w:t>
-            </w:r>
-          </w:p>
-        </w:tc>
-        <w:tc>
-          <w:tcPr>
-            <w:tcW w:type="dxa" w:w="2900"/>
-            <w:tcBorders>
-              <w:top w:val="single" w:color="BFBFBF" w:sz="4"/>
-              <w:left w:val="single" w:color="BFBFBF" w:sz="4"/>
-              <w:bottom w:val="single" w:color="BFBFBF" w:sz="4"/>
-              <w:right w:val="single" w:color="BFBFBF" w:sz="4"/>
-            </w:tcBorders>
-            <w:tcMar>
-              <w:top w:type="dxa" w:w="40"/>
-              <w:left w:type="dxa" w:w="100"/>
-              <w:bottom w:type="dxa" w:w="40"/>
-              <w:right w:type="dxa" w:w="100"/>
-            </w:tcMar>
-          </w:tcPr>
-          <w:p>
-            <w:pPr>
-              <w:spacing w:after="0"/>
-            </w:pPr>
-            <w:r>
-              <w:rPr>
-                <w:rFonts w:ascii="TH Sarabun New" w:cs="TH Sarabun New" w:eastAsia="TH Sarabun New" w:hAnsi="TH Sarabun New"/>
-                <w:b w:val="false"/>
-                <w:bCs w:val="false"/>
-                <w:sz w:val="28"/>
-                <w:szCs w:val="28"/>
-              </w:rPr>
-              <w:t xml:space="preserve">idea_1_cold_chain.py</w:t>
-            </w:r>
-          </w:p>
-        </w:tc>
-        <w:tc>
-          <w:tcPr>
-            <w:tcW w:type="dxa" w:w="2668"/>
-            <w:tcBorders>
-              <w:top w:val="single" w:color="BFBFBF" w:sz="4"/>
-              <w:left w:val="single" w:color="BFBFBF" w:sz="4"/>
-              <w:bottom w:val="single" w:color="BFBFBF" w:sz="4"/>
-              <w:right w:val="single" w:color="BFBFBF" w:sz="4"/>
-            </w:tcBorders>
-            <w:tcMar>
-              <w:top w:type="dxa" w:w="40"/>
-              <w:left w:type="dxa" w:w="100"/>
-              <w:bottom w:type="dxa" w:w="40"/>
-              <w:right w:type="dxa" w:w="100"/>
-            </w:tcMar>
-          </w:tcPr>
-          <w:p>
-            <w:pPr>
-              <w:spacing w:after="0"/>
-            </w:pPr>
-            <w:r>
-              <w:rPr>
-                <w:rFonts w:ascii="TH Sarabun New" w:cs="TH Sarabun New" w:eastAsia="TH Sarabun New" w:hAnsi="TH Sarabun New"/>
-                <w:b w:val="false"/>
-                <w:bCs w:val="false"/>
-                <w:sz w:val="28"/>
-                <w:szCs w:val="28"/>
-              </w:rPr>
-              <w:t xml:space="preserve">เตือนกล่องร้อนเกิน · กดรับทราบ</w:t>
-            </w:r>
-          </w:p>
-        </w:tc>
-        <w:tc>
-          <w:tcPr>
-            <w:tcW w:type="dxa" w:w="2300"/>
-            <w:tcBorders>
-              <w:top w:val="single" w:color="BFBFBF" w:sz="4"/>
-              <w:left w:val="single" w:color="BFBFBF" w:sz="4"/>
-              <w:bottom w:val="single" w:color="BFBFBF" w:sz="4"/>
-              <w:right w:val="single" w:color="BFBFBF" w:sz="4"/>
-            </w:tcBorders>
-            <w:tcMar>
-              <w:top w:type="dxa" w:w="40"/>
-              <w:left w:type="dxa" w:w="100"/>
-              <w:bottom w:type="dxa" w:w="40"/>
-              <w:right w:type="dxa" w:w="100"/>
-            </w:tcMar>
-          </w:tcPr>
-          <w:p>
-            <w:pPr>
-              <w:spacing w:after="0"/>
-            </w:pPr>
-            <w:r>
-              <w:rPr>
-                <w:rFonts w:ascii="TH Sarabun New" w:cs="TH Sarabun New" w:eastAsia="TH Sarabun New" w:hAnsi="TH Sarabun New"/>
-                <w:b w:val="false"/>
-                <w:bCs w:val="false"/>
-                <w:sz w:val="28"/>
-                <w:szCs w:val="28"/>
-              </w:rPr>
-              <w:t xml:space="preserve">idea_web.html?idea=1</w:t>
+              <w:t xml:space="preserve">idea_1 · idea_web.html?idea=1</w:t>
             </w:r>
           </w:p>
         </w:tc>
@@ -948,6 +975,102 @@
       <w:tr>
         <w:tc>
           <w:tcPr>
+            <w:tcW w:type="dxa" w:w="900"/>
+            <w:tcBorders>
+              <w:top w:val="single" w:color="BFBFBF" w:sz="4"/>
+              <w:left w:val="single" w:color="BFBFBF" w:sz="4"/>
+              <w:bottom w:val="single" w:color="BFBFBF" w:sz="4"/>
+              <w:right w:val="single" w:color="BFBFBF" w:sz="4"/>
+            </w:tcBorders>
+            <w:tcMar>
+              <w:top w:type="dxa" w:w="40"/>
+              <w:left w:type="dxa" w:w="100"/>
+              <w:bottom w:type="dxa" w:w="40"/>
+              <w:right w:type="dxa" w:w="100"/>
+            </w:tcMar>
+          </w:tcPr>
+          <w:p>
+            <w:pPr>
+              <w:spacing w:after="0"/>
+            </w:pPr>
+            <w:r>
+              <w:rPr>
+                <w:rFonts w:ascii="TH Sarabun New" w:cs="TH Sarabun New" w:eastAsia="TH Sarabun New" w:hAnsi="TH Sarabun New"/>
+                <w:b w:val="false"/>
+                <w:bCs w:val="false"/>
+                <w:sz w:val="28"/>
+                <w:szCs w:val="28"/>
+              </w:rPr>
+              <w:t xml:space="preserve">2</w:t>
+            </w:r>
+          </w:p>
+        </w:tc>
+        <w:tc>
+          <w:tcPr>
+            <w:tcW w:type="dxa" w:w="3600"/>
+            <w:tcBorders>
+              <w:top w:val="single" w:color="BFBFBF" w:sz="4"/>
+              <w:left w:val="single" w:color="BFBFBF" w:sz="4"/>
+              <w:bottom w:val="single" w:color="BFBFBF" w:sz="4"/>
+              <w:right w:val="single" w:color="BFBFBF" w:sz="4"/>
+            </w:tcBorders>
+            <w:tcMar>
+              <w:top w:type="dxa" w:w="40"/>
+              <w:left w:type="dxa" w:w="100"/>
+              <w:bottom w:type="dxa" w:w="40"/>
+              <w:right w:type="dxa" w:w="100"/>
+            </w:tcMar>
+          </w:tcPr>
+          <w:p>
+            <w:pPr>
+              <w:spacing w:after="0"/>
+            </w:pPr>
+            <w:r>
+              <w:rPr>
+                <w:rFonts w:ascii="TH Sarabun New" w:cs="TH Sarabun New" w:eastAsia="TH Sarabun New" w:hAnsi="TH Sarabun New"/>
+                <w:b w:val="false"/>
+                <w:bCs w:val="false"/>
+                <w:sz w:val="28"/>
+                <w:szCs w:val="28"/>
+              </w:rPr>
+              <w:t xml:space="preserve">รถส่งผลผลิตถึงตลาด</w:t>
+            </w:r>
+          </w:p>
+        </w:tc>
+        <w:tc>
+          <w:tcPr>
+            <w:tcW w:type="dxa" w:w="3368"/>
+            <w:tcBorders>
+              <w:top w:val="single" w:color="BFBFBF" w:sz="4"/>
+              <w:left w:val="single" w:color="BFBFBF" w:sz="4"/>
+              <w:bottom w:val="single" w:color="BFBFBF" w:sz="4"/>
+              <w:right w:val="single" w:color="BFBFBF" w:sz="4"/>
+            </w:tcBorders>
+            <w:tcMar>
+              <w:top w:type="dxa" w:w="40"/>
+              <w:left w:type="dxa" w:w="100"/>
+              <w:bottom w:type="dxa" w:w="40"/>
+              <w:right w:type="dxa" w:w="100"/>
+            </w:tcMar>
+          </w:tcPr>
+          <w:p>
+            <w:pPr>
+              <w:spacing w:after="0"/>
+            </w:pPr>
+            <w:r>
+              <w:rPr>
+                <w:rFonts w:ascii="TH Sarabun New" w:cs="TH Sarabun New" w:eastAsia="TH Sarabun New" w:hAnsi="TH Sarabun New"/>
+                <w:b w:val="false"/>
+                <w:bCs w:val="false"/>
+                <w:sz w:val="28"/>
+                <w:szCs w:val="28"/>
+              </w:rPr>
+              <w:t xml:space="preserve">A · เฝ้าอากาศ + เตือน + รับทราบ</w:t>
+            </w:r>
+          </w:p>
+        </w:tc>
+        <w:tc>
+          <w:tcPr>
             <w:tcW w:type="dxa" w:w="2500"/>
             <w:tcBorders>
               <w:top w:val="single" w:color="BFBFBF" w:sz="4"/>
@@ -974,103 +1097,7 @@
                 <w:sz w:val="28"/>
                 <w:szCs w:val="28"/>
               </w:rPr>
-              <w:t xml:space="preserve">2 · รถส่งผลผลิตถึงตลาด</w:t>
-            </w:r>
-          </w:p>
-        </w:tc>
-        <w:tc>
-          <w:tcPr>
-            <w:tcW w:type="dxa" w:w="2900"/>
-            <w:tcBorders>
-              <w:top w:val="single" w:color="BFBFBF" w:sz="4"/>
-              <w:left w:val="single" w:color="BFBFBF" w:sz="4"/>
-              <w:bottom w:val="single" w:color="BFBFBF" w:sz="4"/>
-              <w:right w:val="single" w:color="BFBFBF" w:sz="4"/>
-            </w:tcBorders>
-            <w:tcMar>
-              <w:top w:type="dxa" w:w="40"/>
-              <w:left w:type="dxa" w:w="100"/>
-              <w:bottom w:type="dxa" w:w="40"/>
-              <w:right w:type="dxa" w:w="100"/>
-            </w:tcMar>
-          </w:tcPr>
-          <w:p>
-            <w:pPr>
-              <w:spacing w:after="0"/>
-            </w:pPr>
-            <w:r>
-              <w:rPr>
-                <w:rFonts w:ascii="TH Sarabun New" w:cs="TH Sarabun New" w:eastAsia="TH Sarabun New" w:hAnsi="TH Sarabun New"/>
-                <w:b w:val="false"/>
-                <w:bCs w:val="false"/>
-                <w:sz w:val="28"/>
-                <w:szCs w:val="28"/>
-              </w:rPr>
-              <w:t xml:space="preserve">idea_2_delivery.py</w:t>
-            </w:r>
-          </w:p>
-        </w:tc>
-        <w:tc>
-          <w:tcPr>
-            <w:tcW w:type="dxa" w:w="2668"/>
-            <w:tcBorders>
-              <w:top w:val="single" w:color="BFBFBF" w:sz="4"/>
-              <w:left w:val="single" w:color="BFBFBF" w:sz="4"/>
-              <w:bottom w:val="single" w:color="BFBFBF" w:sz="4"/>
-              <w:right w:val="single" w:color="BFBFBF" w:sz="4"/>
-            </w:tcBorders>
-            <w:tcMar>
-              <w:top w:type="dxa" w:w="40"/>
-              <w:left w:type="dxa" w:w="100"/>
-              <w:bottom w:type="dxa" w:w="40"/>
-              <w:right w:type="dxa" w:w="100"/>
-            </w:tcMar>
-          </w:tcPr>
-          <w:p>
-            <w:pPr>
-              <w:spacing w:after="0"/>
-            </w:pPr>
-            <w:r>
-              <w:rPr>
-                <w:rFonts w:ascii="TH Sarabun New" w:cs="TH Sarabun New" w:eastAsia="TH Sarabun New" w:hAnsi="TH Sarabun New"/>
-                <w:b w:val="false"/>
-                <w:bCs w:val="false"/>
-                <w:sz w:val="28"/>
-                <w:szCs w:val="28"/>
-              </w:rPr>
-              <w:t xml:space="preserve">ดูอุณหภูมิกระบะ · ลูกค้ากดรับของ</w:t>
-            </w:r>
-          </w:p>
-        </w:tc>
-        <w:tc>
-          <w:tcPr>
-            <w:tcW w:type="dxa" w:w="2300"/>
-            <w:tcBorders>
-              <w:top w:val="single" w:color="BFBFBF" w:sz="4"/>
-              <w:left w:val="single" w:color="BFBFBF" w:sz="4"/>
-              <w:bottom w:val="single" w:color="BFBFBF" w:sz="4"/>
-              <w:right w:val="single" w:color="BFBFBF" w:sz="4"/>
-            </w:tcBorders>
-            <w:tcMar>
-              <w:top w:type="dxa" w:w="40"/>
-              <w:left w:type="dxa" w:w="100"/>
-              <w:bottom w:type="dxa" w:w="40"/>
-              <w:right w:type="dxa" w:w="100"/>
-            </w:tcMar>
-          </w:tcPr>
-          <w:p>
-            <w:pPr>
-              <w:spacing w:after="0"/>
-            </w:pPr>
-            <w:r>
-              <w:rPr>
-                <w:rFonts w:ascii="TH Sarabun New" w:cs="TH Sarabun New" w:eastAsia="TH Sarabun New" w:hAnsi="TH Sarabun New"/>
-                <w:b w:val="false"/>
-                <w:bCs w:val="false"/>
-                <w:sz w:val="28"/>
-                <w:szCs w:val="28"/>
-              </w:rPr>
-              <w:t xml:space="preserve">idea_web.html?idea=2</w:t>
+              <w:t xml:space="preserve">idea_2 · idea_web.html?idea=2</w:t>
             </w:r>
           </w:p>
         </w:tc>
@@ -1078,6 +1105,102 @@
       <w:tr>
         <w:tc>
           <w:tcPr>
+            <w:tcW w:type="dxa" w:w="900"/>
+            <w:tcBorders>
+              <w:top w:val="single" w:color="BFBFBF" w:sz="4"/>
+              <w:left w:val="single" w:color="BFBFBF" w:sz="4"/>
+              <w:bottom w:val="single" w:color="BFBFBF" w:sz="4"/>
+              <w:right w:val="single" w:color="BFBFBF" w:sz="4"/>
+            </w:tcBorders>
+            <w:tcMar>
+              <w:top w:type="dxa" w:w="40"/>
+              <w:left w:type="dxa" w:w="100"/>
+              <w:bottom w:type="dxa" w:w="40"/>
+              <w:right w:type="dxa" w:w="100"/>
+            </w:tcMar>
+          </w:tcPr>
+          <w:p>
+            <w:pPr>
+              <w:spacing w:after="0"/>
+            </w:pPr>
+            <w:r>
+              <w:rPr>
+                <w:rFonts w:ascii="TH Sarabun New" w:cs="TH Sarabun New" w:eastAsia="TH Sarabun New" w:hAnsi="TH Sarabun New"/>
+                <w:b w:val="false"/>
+                <w:bCs w:val="false"/>
+                <w:sz w:val="28"/>
+                <w:szCs w:val="28"/>
+              </w:rPr>
+              <w:t xml:space="preserve">3</w:t>
+            </w:r>
+          </w:p>
+        </w:tc>
+        <w:tc>
+          <w:tcPr>
+            <w:tcW w:type="dxa" w:w="3600"/>
+            <w:tcBorders>
+              <w:top w:val="single" w:color="BFBFBF" w:sz="4"/>
+              <w:left w:val="single" w:color="BFBFBF" w:sz="4"/>
+              <w:bottom w:val="single" w:color="BFBFBF" w:sz="4"/>
+              <w:right w:val="single" w:color="BFBFBF" w:sz="4"/>
+            </w:tcBorders>
+            <w:tcMar>
+              <w:top w:type="dxa" w:w="40"/>
+              <w:left w:type="dxa" w:w="100"/>
+              <w:bottom w:type="dxa" w:w="40"/>
+              <w:right w:type="dxa" w:w="100"/>
+            </w:tcMar>
+          </w:tcPr>
+          <w:p>
+            <w:pPr>
+              <w:spacing w:after="0"/>
+            </w:pPr>
+            <w:r>
+              <w:rPr>
+                <w:rFonts w:ascii="TH Sarabun New" w:cs="TH Sarabun New" w:eastAsia="TH Sarabun New" w:hAnsi="TH Sarabun New"/>
+                <w:b w:val="false"/>
+                <w:bCs w:val="false"/>
+                <w:sz w:val="28"/>
+                <w:szCs w:val="28"/>
+              </w:rPr>
+              <w:t xml:space="preserve">ไซโลข้าวเปลือก</w:t>
+            </w:r>
+          </w:p>
+        </w:tc>
+        <w:tc>
+          <w:tcPr>
+            <w:tcW w:type="dxa" w:w="3368"/>
+            <w:tcBorders>
+              <w:top w:val="single" w:color="BFBFBF" w:sz="4"/>
+              <w:left w:val="single" w:color="BFBFBF" w:sz="4"/>
+              <w:bottom w:val="single" w:color="BFBFBF" w:sz="4"/>
+              <w:right w:val="single" w:color="BFBFBF" w:sz="4"/>
+            </w:tcBorders>
+            <w:tcMar>
+              <w:top w:type="dxa" w:w="40"/>
+              <w:left w:type="dxa" w:w="100"/>
+              <w:bottom w:type="dxa" w:w="40"/>
+              <w:right w:type="dxa" w:w="100"/>
+            </w:tcMar>
+          </w:tcPr>
+          <w:p>
+            <w:pPr>
+              <w:spacing w:after="0"/>
+            </w:pPr>
+            <w:r>
+              <w:rPr>
+                <w:rFonts w:ascii="TH Sarabun New" w:cs="TH Sarabun New" w:eastAsia="TH Sarabun New" w:hAnsi="TH Sarabun New"/>
+                <w:b w:val="false"/>
+                <w:bCs w:val="false"/>
+                <w:sz w:val="28"/>
+                <w:szCs w:val="28"/>
+              </w:rPr>
+              <w:t xml:space="preserve">A · เฝ้าอากาศ + เตือน + รับทราบ</w:t>
+            </w:r>
+          </w:p>
+        </w:tc>
+        <w:tc>
+          <w:tcPr>
             <w:tcW w:type="dxa" w:w="2500"/>
             <w:tcBorders>
               <w:top w:val="single" w:color="BFBFBF" w:sz="4"/>
@@ -1104,103 +1227,7 @@
                 <w:sz w:val="28"/>
                 <w:szCs w:val="28"/>
               </w:rPr>
-              <w:t xml:space="preserve">3 · ไซโลข้าวเปลือก</w:t>
-            </w:r>
-          </w:p>
-        </w:tc>
-        <w:tc>
-          <w:tcPr>
-            <w:tcW w:type="dxa" w:w="2900"/>
-            <w:tcBorders>
-              <w:top w:val="single" w:color="BFBFBF" w:sz="4"/>
-              <w:left w:val="single" w:color="BFBFBF" w:sz="4"/>
-              <w:bottom w:val="single" w:color="BFBFBF" w:sz="4"/>
-              <w:right w:val="single" w:color="BFBFBF" w:sz="4"/>
-            </w:tcBorders>
-            <w:tcMar>
-              <w:top w:type="dxa" w:w="40"/>
-              <w:left w:type="dxa" w:w="100"/>
-              <w:bottom w:type="dxa" w:w="40"/>
-              <w:right w:type="dxa" w:w="100"/>
-            </w:tcMar>
-          </w:tcPr>
-          <w:p>
-            <w:pPr>
-              <w:spacing w:after="0"/>
-            </w:pPr>
-            <w:r>
-              <w:rPr>
-                <w:rFonts w:ascii="TH Sarabun New" w:cs="TH Sarabun New" w:eastAsia="TH Sarabun New" w:hAnsi="TH Sarabun New"/>
-                <w:b w:val="false"/>
-                <w:bCs w:val="false"/>
-                <w:sz w:val="28"/>
-                <w:szCs w:val="28"/>
-              </w:rPr>
-              <w:t xml:space="preserve">idea_3_silo.py</w:t>
-            </w:r>
-          </w:p>
-        </w:tc>
-        <w:tc>
-          <w:tcPr>
-            <w:tcW w:type="dxa" w:w="2668"/>
-            <w:tcBorders>
-              <w:top w:val="single" w:color="BFBFBF" w:sz="4"/>
-              <w:left w:val="single" w:color="BFBFBF" w:sz="4"/>
-              <w:bottom w:val="single" w:color="BFBFBF" w:sz="4"/>
-              <w:right w:val="single" w:color="BFBFBF" w:sz="4"/>
-            </w:tcBorders>
-            <w:tcMar>
-              <w:top w:type="dxa" w:w="40"/>
-              <w:left w:type="dxa" w:w="100"/>
-              <w:bottom w:type="dxa" w:w="40"/>
-              <w:right w:type="dxa" w:w="100"/>
-            </w:tcMar>
-          </w:tcPr>
-          <w:p>
-            <w:pPr>
-              <w:spacing w:after="0"/>
-            </w:pPr>
-            <w:r>
-              <w:rPr>
-                <w:rFonts w:ascii="TH Sarabun New" w:cs="TH Sarabun New" w:eastAsia="TH Sarabun New" w:hAnsi="TH Sarabun New"/>
-                <w:b w:val="false"/>
-                <w:bCs w:val="false"/>
-                <w:sz w:val="28"/>
-                <w:szCs w:val="28"/>
-              </w:rPr>
-              <w:t xml:space="preserve">เตือนความชื้นในไซโลสูง</w:t>
-            </w:r>
-          </w:p>
-        </w:tc>
-        <w:tc>
-          <w:tcPr>
-            <w:tcW w:type="dxa" w:w="2300"/>
-            <w:tcBorders>
-              <w:top w:val="single" w:color="BFBFBF" w:sz="4"/>
-              <w:left w:val="single" w:color="BFBFBF" w:sz="4"/>
-              <w:bottom w:val="single" w:color="BFBFBF" w:sz="4"/>
-              <w:right w:val="single" w:color="BFBFBF" w:sz="4"/>
-            </w:tcBorders>
-            <w:tcMar>
-              <w:top w:type="dxa" w:w="40"/>
-              <w:left w:type="dxa" w:w="100"/>
-              <w:bottom w:type="dxa" w:w="40"/>
-              <w:right w:type="dxa" w:w="100"/>
-            </w:tcMar>
-          </w:tcPr>
-          <w:p>
-            <w:pPr>
-              <w:spacing w:after="0"/>
-            </w:pPr>
-            <w:r>
-              <w:rPr>
-                <w:rFonts w:ascii="TH Sarabun New" w:cs="TH Sarabun New" w:eastAsia="TH Sarabun New" w:hAnsi="TH Sarabun New"/>
-                <w:b w:val="false"/>
-                <w:bCs w:val="false"/>
-                <w:sz w:val="28"/>
-                <w:szCs w:val="28"/>
-              </w:rPr>
-              <w:t xml:space="preserve">idea_web.html?idea=3</w:t>
+              <w:t xml:space="preserve">idea_3 · idea_web.html?idea=3</w:t>
             </w:r>
           </w:p>
         </w:tc>
@@ -1208,6 +1235,102 @@
       <w:tr>
         <w:tc>
           <w:tcPr>
+            <w:tcW w:type="dxa" w:w="900"/>
+            <w:tcBorders>
+              <w:top w:val="single" w:color="BFBFBF" w:sz="4"/>
+              <w:left w:val="single" w:color="BFBFBF" w:sz="4"/>
+              <w:bottom w:val="single" w:color="BFBFBF" w:sz="4"/>
+              <w:right w:val="single" w:color="BFBFBF" w:sz="4"/>
+            </w:tcBorders>
+            <w:tcMar>
+              <w:top w:type="dxa" w:w="40"/>
+              <w:left w:type="dxa" w:w="100"/>
+              <w:bottom w:type="dxa" w:w="40"/>
+              <w:right w:type="dxa" w:w="100"/>
+            </w:tcMar>
+          </w:tcPr>
+          <w:p>
+            <w:pPr>
+              <w:spacing w:after="0"/>
+            </w:pPr>
+            <w:r>
+              <w:rPr>
+                <w:rFonts w:ascii="TH Sarabun New" w:cs="TH Sarabun New" w:eastAsia="TH Sarabun New" w:hAnsi="TH Sarabun New"/>
+                <w:b w:val="false"/>
+                <w:bCs w:val="false"/>
+                <w:sz w:val="28"/>
+                <w:szCs w:val="28"/>
+              </w:rPr>
+              <w:t xml:space="preserve">8</w:t>
+            </w:r>
+          </w:p>
+        </w:tc>
+        <w:tc>
+          <w:tcPr>
+            <w:tcW w:type="dxa" w:w="3600"/>
+            <w:tcBorders>
+              <w:top w:val="single" w:color="BFBFBF" w:sz="4"/>
+              <w:left w:val="single" w:color="BFBFBF" w:sz="4"/>
+              <w:bottom w:val="single" w:color="BFBFBF" w:sz="4"/>
+              <w:right w:val="single" w:color="BFBFBF" w:sz="4"/>
+            </w:tcBorders>
+            <w:tcMar>
+              <w:top w:type="dxa" w:w="40"/>
+              <w:left w:type="dxa" w:w="100"/>
+              <w:bottom w:type="dxa" w:w="40"/>
+              <w:right w:type="dxa" w:w="100"/>
+            </w:tcMar>
+          </w:tcPr>
+          <w:p>
+            <w:pPr>
+              <w:spacing w:after="0"/>
+            </w:pPr>
+            <w:r>
+              <w:rPr>
+                <w:rFonts w:ascii="TH Sarabun New" w:cs="TH Sarabun New" w:eastAsia="TH Sarabun New" w:hAnsi="TH Sarabun New"/>
+                <w:b w:val="false"/>
+                <w:bCs w:val="false"/>
+                <w:sz w:val="28"/>
+                <w:szCs w:val="28"/>
+              </w:rPr>
+              <w:t xml:space="preserve">เล้าไก่กันความเครียดฝูง</w:t>
+            </w:r>
+          </w:p>
+        </w:tc>
+        <w:tc>
+          <w:tcPr>
+            <w:tcW w:type="dxa" w:w="3368"/>
+            <w:tcBorders>
+              <w:top w:val="single" w:color="BFBFBF" w:sz="4"/>
+              <w:left w:val="single" w:color="BFBFBF" w:sz="4"/>
+              <w:bottom w:val="single" w:color="BFBFBF" w:sz="4"/>
+              <w:right w:val="single" w:color="BFBFBF" w:sz="4"/>
+            </w:tcBorders>
+            <w:tcMar>
+              <w:top w:type="dxa" w:w="40"/>
+              <w:left w:type="dxa" w:w="100"/>
+              <w:bottom w:type="dxa" w:w="40"/>
+              <w:right w:type="dxa" w:w="100"/>
+            </w:tcMar>
+          </w:tcPr>
+          <w:p>
+            <w:pPr>
+              <w:spacing w:after="0"/>
+            </w:pPr>
+            <w:r>
+              <w:rPr>
+                <w:rFonts w:ascii="TH Sarabun New" w:cs="TH Sarabun New" w:eastAsia="TH Sarabun New" w:hAnsi="TH Sarabun New"/>
+                <w:b w:val="false"/>
+                <w:bCs w:val="false"/>
+                <w:sz w:val="28"/>
+                <w:szCs w:val="28"/>
+              </w:rPr>
+              <w:t xml:space="preserve">A · เฝ้าอากาศ + เตือน + รับทราบ</w:t>
+            </w:r>
+          </w:p>
+        </w:tc>
+        <w:tc>
+          <w:tcPr>
             <w:tcW w:type="dxa" w:w="2500"/>
             <w:tcBorders>
               <w:top w:val="single" w:color="BFBFBF" w:sz="4"/>
@@ -1234,103 +1357,7 @@
                 <w:sz w:val="28"/>
                 <w:szCs w:val="28"/>
               </w:rPr>
-              <w:t xml:space="preserve">4 · โรงเรือนอัจฉริยะ</w:t>
-            </w:r>
-          </w:p>
-        </w:tc>
-        <w:tc>
-          <w:tcPr>
-            <w:tcW w:type="dxa" w:w="2900"/>
-            <w:tcBorders>
-              <w:top w:val="single" w:color="BFBFBF" w:sz="4"/>
-              <w:left w:val="single" w:color="BFBFBF" w:sz="4"/>
-              <w:bottom w:val="single" w:color="BFBFBF" w:sz="4"/>
-              <w:right w:val="single" w:color="BFBFBF" w:sz="4"/>
-            </w:tcBorders>
-            <w:tcMar>
-              <w:top w:type="dxa" w:w="40"/>
-              <w:left w:type="dxa" w:w="100"/>
-              <w:bottom w:type="dxa" w:w="40"/>
-              <w:right w:type="dxa" w:w="100"/>
-            </w:tcMar>
-          </w:tcPr>
-          <w:p>
-            <w:pPr>
-              <w:spacing w:after="0"/>
-            </w:pPr>
-            <w:r>
-              <w:rPr>
-                <w:rFonts w:ascii="TH Sarabun New" w:cs="TH Sarabun New" w:eastAsia="TH Sarabun New" w:hAnsi="TH Sarabun New"/>
-                <w:b w:val="false"/>
-                <w:bCs w:val="false"/>
-                <w:sz w:val="28"/>
-                <w:szCs w:val="28"/>
-              </w:rPr>
-              <w:t xml:space="preserve">idea_4_greenhouse.py</w:t>
-            </w:r>
-          </w:p>
-        </w:tc>
-        <w:tc>
-          <w:tcPr>
-            <w:tcW w:type="dxa" w:w="2668"/>
-            <w:tcBorders>
-              <w:top w:val="single" w:color="BFBFBF" w:sz="4"/>
-              <w:left w:val="single" w:color="BFBFBF" w:sz="4"/>
-              <w:bottom w:val="single" w:color="BFBFBF" w:sz="4"/>
-              <w:right w:val="single" w:color="BFBFBF" w:sz="4"/>
-            </w:tcBorders>
-            <w:tcMar>
-              <w:top w:type="dxa" w:w="40"/>
-              <w:left w:type="dxa" w:w="100"/>
-              <w:bottom w:type="dxa" w:w="40"/>
-              <w:right w:type="dxa" w:w="100"/>
-            </w:tcMar>
-          </w:tcPr>
-          <w:p>
-            <w:pPr>
-              <w:spacing w:after="0"/>
-            </w:pPr>
-            <w:r>
-              <w:rPr>
-                <w:rFonts w:ascii="TH Sarabun New" w:cs="TH Sarabun New" w:eastAsia="TH Sarabun New" w:hAnsi="TH Sarabun New"/>
-                <w:b w:val="false"/>
-                <w:bCs w:val="false"/>
-                <w:sz w:val="28"/>
-                <w:szCs w:val="28"/>
-              </w:rPr>
-              <w:t xml:space="preserve">ดินแห้ง (จำลอง) · สั่งรดน้ำจากมือถือ</w:t>
-            </w:r>
-          </w:p>
-        </w:tc>
-        <w:tc>
-          <w:tcPr>
-            <w:tcW w:type="dxa" w:w="2300"/>
-            <w:tcBorders>
-              <w:top w:val="single" w:color="BFBFBF" w:sz="4"/>
-              <w:left w:val="single" w:color="BFBFBF" w:sz="4"/>
-              <w:bottom w:val="single" w:color="BFBFBF" w:sz="4"/>
-              <w:right w:val="single" w:color="BFBFBF" w:sz="4"/>
-            </w:tcBorders>
-            <w:tcMar>
-              <w:top w:type="dxa" w:w="40"/>
-              <w:left w:type="dxa" w:w="100"/>
-              <w:bottom w:type="dxa" w:w="40"/>
-              <w:right w:type="dxa" w:w="100"/>
-            </w:tcMar>
-          </w:tcPr>
-          <w:p>
-            <w:pPr>
-              <w:spacing w:after="0"/>
-            </w:pPr>
-            <w:r>
-              <w:rPr>
-                <w:rFonts w:ascii="TH Sarabun New" w:cs="TH Sarabun New" w:eastAsia="TH Sarabun New" w:hAnsi="TH Sarabun New"/>
-                <w:b w:val="false"/>
-                <w:bCs w:val="false"/>
-                <w:sz w:val="28"/>
-                <w:szCs w:val="28"/>
-              </w:rPr>
-              <w:t xml:space="preserve">idea_web.html?idea=4</w:t>
+              <w:t xml:space="preserve">idea_8 · idea_web.html?idea=8</w:t>
             </w:r>
           </w:p>
         </w:tc>
@@ -1338,6 +1365,102 @@
       <w:tr>
         <w:tc>
           <w:tcPr>
+            <w:tcW w:type="dxa" w:w="900"/>
+            <w:tcBorders>
+              <w:top w:val="single" w:color="BFBFBF" w:sz="4"/>
+              <w:left w:val="single" w:color="BFBFBF" w:sz="4"/>
+              <w:bottom w:val="single" w:color="BFBFBF" w:sz="4"/>
+              <w:right w:val="single" w:color="BFBFBF" w:sz="4"/>
+            </w:tcBorders>
+            <w:tcMar>
+              <w:top w:type="dxa" w:w="40"/>
+              <w:left w:type="dxa" w:w="100"/>
+              <w:bottom w:type="dxa" w:w="40"/>
+              <w:right w:type="dxa" w:w="100"/>
+            </w:tcMar>
+          </w:tcPr>
+          <w:p>
+            <w:pPr>
+              <w:spacing w:after="0"/>
+            </w:pPr>
+            <w:r>
+              <w:rPr>
+                <w:rFonts w:ascii="TH Sarabun New" w:cs="TH Sarabun New" w:eastAsia="TH Sarabun New" w:hAnsi="TH Sarabun New"/>
+                <w:b w:val="false"/>
+                <w:bCs w:val="false"/>
+                <w:sz w:val="28"/>
+                <w:szCs w:val="28"/>
+              </w:rPr>
+              <w:t xml:space="preserve">9</w:t>
+            </w:r>
+          </w:p>
+        </w:tc>
+        <w:tc>
+          <w:tcPr>
+            <w:tcW w:type="dxa" w:w="3600"/>
+            <w:tcBorders>
+              <w:top w:val="single" w:color="BFBFBF" w:sz="4"/>
+              <w:left w:val="single" w:color="BFBFBF" w:sz="4"/>
+              <w:bottom w:val="single" w:color="BFBFBF" w:sz="4"/>
+              <w:right w:val="single" w:color="BFBFBF" w:sz="4"/>
+            </w:tcBorders>
+            <w:tcMar>
+              <w:top w:type="dxa" w:w="40"/>
+              <w:left w:type="dxa" w:w="100"/>
+              <w:bottom w:type="dxa" w:w="40"/>
+              <w:right w:type="dxa" w:w="100"/>
+            </w:tcMar>
+          </w:tcPr>
+          <w:p>
+            <w:pPr>
+              <w:spacing w:after="0"/>
+            </w:pPr>
+            <w:r>
+              <w:rPr>
+                <w:rFonts w:ascii="TH Sarabun New" w:cs="TH Sarabun New" w:eastAsia="TH Sarabun New" w:hAnsi="TH Sarabun New"/>
+                <w:b w:val="false"/>
+                <w:bCs w:val="false"/>
+                <w:sz w:val="28"/>
+                <w:szCs w:val="28"/>
+              </w:rPr>
+              <w:t xml:space="preserve">โรงเพาะเห็ด</w:t>
+            </w:r>
+          </w:p>
+        </w:tc>
+        <w:tc>
+          <w:tcPr>
+            <w:tcW w:type="dxa" w:w="3368"/>
+            <w:tcBorders>
+              <w:top w:val="single" w:color="BFBFBF" w:sz="4"/>
+              <w:left w:val="single" w:color="BFBFBF" w:sz="4"/>
+              <w:bottom w:val="single" w:color="BFBFBF" w:sz="4"/>
+              <w:right w:val="single" w:color="BFBFBF" w:sz="4"/>
+            </w:tcBorders>
+            <w:tcMar>
+              <w:top w:type="dxa" w:w="40"/>
+              <w:left w:type="dxa" w:w="100"/>
+              <w:bottom w:type="dxa" w:w="40"/>
+              <w:right w:type="dxa" w:w="100"/>
+            </w:tcMar>
+          </w:tcPr>
+          <w:p>
+            <w:pPr>
+              <w:spacing w:after="0"/>
+            </w:pPr>
+            <w:r>
+              <w:rPr>
+                <w:rFonts w:ascii="TH Sarabun New" w:cs="TH Sarabun New" w:eastAsia="TH Sarabun New" w:hAnsi="TH Sarabun New"/>
+                <w:b w:val="false"/>
+                <w:bCs w:val="false"/>
+                <w:sz w:val="28"/>
+                <w:szCs w:val="28"/>
+              </w:rPr>
+              <w:t xml:space="preserve">A · เฝ้าอากาศ + เตือน + รับทราบ</w:t>
+            </w:r>
+          </w:p>
+        </w:tc>
+        <w:tc>
+          <w:tcPr>
             <w:tcW w:type="dxa" w:w="2500"/>
             <w:tcBorders>
               <w:top w:val="single" w:color="BFBFBF" w:sz="4"/>
@@ -1364,103 +1487,7 @@
                 <w:sz w:val="28"/>
                 <w:szCs w:val="28"/>
               </w:rPr>
-              <w:t xml:space="preserve">5 · คอกปศุสัตว์กลางคืน</w:t>
-            </w:r>
-          </w:p>
-        </w:tc>
-        <w:tc>
-          <w:tcPr>
-            <w:tcW w:type="dxa" w:w="2900"/>
-            <w:tcBorders>
-              <w:top w:val="single" w:color="BFBFBF" w:sz="4"/>
-              <w:left w:val="single" w:color="BFBFBF" w:sz="4"/>
-              <w:bottom w:val="single" w:color="BFBFBF" w:sz="4"/>
-              <w:right w:val="single" w:color="BFBFBF" w:sz="4"/>
-            </w:tcBorders>
-            <w:tcMar>
-              <w:top w:type="dxa" w:w="40"/>
-              <w:left w:type="dxa" w:w="100"/>
-              <w:bottom w:type="dxa" w:w="40"/>
-              <w:right w:type="dxa" w:w="100"/>
-            </w:tcMar>
-          </w:tcPr>
-          <w:p>
-            <w:pPr>
-              <w:spacing w:after="0"/>
-            </w:pPr>
-            <w:r>
-              <w:rPr>
-                <w:rFonts w:ascii="TH Sarabun New" w:cs="TH Sarabun New" w:eastAsia="TH Sarabun New" w:hAnsi="TH Sarabun New"/>
-                <w:b w:val="false"/>
-                <w:bCs w:val="false"/>
-                <w:sz w:val="28"/>
-                <w:szCs w:val="28"/>
-              </w:rPr>
-              <w:t xml:space="preserve">idea_5_night_pen.py</w:t>
-            </w:r>
-          </w:p>
-        </w:tc>
-        <w:tc>
-          <w:tcPr>
-            <w:tcW w:type="dxa" w:w="2668"/>
-            <w:tcBorders>
-              <w:top w:val="single" w:color="BFBFBF" w:sz="4"/>
-              <w:left w:val="single" w:color="BFBFBF" w:sz="4"/>
-              <w:bottom w:val="single" w:color="BFBFBF" w:sz="4"/>
-              <w:right w:val="single" w:color="BFBFBF" w:sz="4"/>
-            </w:tcBorders>
-            <w:tcMar>
-              <w:top w:type="dxa" w:w="40"/>
-              <w:left w:type="dxa" w:w="100"/>
-              <w:bottom w:type="dxa" w:w="40"/>
-              <w:right w:type="dxa" w:w="100"/>
-            </w:tcMar>
-          </w:tcPr>
-          <w:p>
-            <w:pPr>
-              <w:spacing w:after="0"/>
-            </w:pPr>
-            <w:r>
-              <w:rPr>
-                <w:rFonts w:ascii="TH Sarabun New" w:cs="TH Sarabun New" w:eastAsia="TH Sarabun New" w:hAnsi="TH Sarabun New"/>
-                <w:b w:val="false"/>
-                <w:bCs w:val="false"/>
-                <w:sz w:val="28"/>
-                <w:szCs w:val="28"/>
-              </w:rPr>
-              <w:t xml:space="preserve">เรดาร์จับผู้บุกรุก · ส่ง event</w:t>
-            </w:r>
-          </w:p>
-        </w:tc>
-        <w:tc>
-          <w:tcPr>
-            <w:tcW w:type="dxa" w:w="2300"/>
-            <w:tcBorders>
-              <w:top w:val="single" w:color="BFBFBF" w:sz="4"/>
-              <w:left w:val="single" w:color="BFBFBF" w:sz="4"/>
-              <w:bottom w:val="single" w:color="BFBFBF" w:sz="4"/>
-              <w:right w:val="single" w:color="BFBFBF" w:sz="4"/>
-            </w:tcBorders>
-            <w:tcMar>
-              <w:top w:type="dxa" w:w="40"/>
-              <w:left w:type="dxa" w:w="100"/>
-              <w:bottom w:type="dxa" w:w="40"/>
-              <w:right w:type="dxa" w:w="100"/>
-            </w:tcMar>
-          </w:tcPr>
-          <w:p>
-            <w:pPr>
-              <w:spacing w:after="0"/>
-            </w:pPr>
-            <w:r>
-              <w:rPr>
-                <w:rFonts w:ascii="TH Sarabun New" w:cs="TH Sarabun New" w:eastAsia="TH Sarabun New" w:hAnsi="TH Sarabun New"/>
-                <w:b w:val="false"/>
-                <w:bCs w:val="false"/>
-                <w:sz w:val="28"/>
-                <w:szCs w:val="28"/>
-              </w:rPr>
-              <w:t xml:space="preserve">idea_web.html?idea=5</w:t>
+              <w:t xml:space="preserve">idea_9 · idea_web.html?idea=9</w:t>
             </w:r>
           </w:p>
         </w:tc>
@@ -1468,6 +1495,102 @@
       <w:tr>
         <w:tc>
           <w:tcPr>
+            <w:tcW w:type="dxa" w:w="900"/>
+            <w:tcBorders>
+              <w:top w:val="single" w:color="BFBFBF" w:sz="4"/>
+              <w:left w:val="single" w:color="BFBFBF" w:sz="4"/>
+              <w:bottom w:val="single" w:color="BFBFBF" w:sz="4"/>
+              <w:right w:val="single" w:color="BFBFBF" w:sz="4"/>
+            </w:tcBorders>
+            <w:tcMar>
+              <w:top w:type="dxa" w:w="40"/>
+              <w:left w:type="dxa" w:w="100"/>
+              <w:bottom w:type="dxa" w:w="40"/>
+              <w:right w:type="dxa" w:w="100"/>
+            </w:tcMar>
+          </w:tcPr>
+          <w:p>
+            <w:pPr>
+              <w:spacing w:after="0"/>
+            </w:pPr>
+            <w:r>
+              <w:rPr>
+                <w:rFonts w:ascii="TH Sarabun New" w:cs="TH Sarabun New" w:eastAsia="TH Sarabun New" w:hAnsi="TH Sarabun New"/>
+                <w:b w:val="false"/>
+                <w:bCs w:val="false"/>
+                <w:sz w:val="28"/>
+                <w:szCs w:val="28"/>
+              </w:rPr>
+              <w:t xml:space="preserve">10</w:t>
+            </w:r>
+          </w:p>
+        </w:tc>
+        <w:tc>
+          <w:tcPr>
+            <w:tcW w:type="dxa" w:w="3600"/>
+            <w:tcBorders>
+              <w:top w:val="single" w:color="BFBFBF" w:sz="4"/>
+              <w:left w:val="single" w:color="BFBFBF" w:sz="4"/>
+              <w:bottom w:val="single" w:color="BFBFBF" w:sz="4"/>
+              <w:right w:val="single" w:color="BFBFBF" w:sz="4"/>
+            </w:tcBorders>
+            <w:tcMar>
+              <w:top w:type="dxa" w:w="40"/>
+              <w:left w:type="dxa" w:w="100"/>
+              <w:bottom w:type="dxa" w:w="40"/>
+              <w:right w:type="dxa" w:w="100"/>
+            </w:tcMar>
+          </w:tcPr>
+          <w:p>
+            <w:pPr>
+              <w:spacing w:after="0"/>
+            </w:pPr>
+            <w:r>
+              <w:rPr>
+                <w:rFonts w:ascii="TH Sarabun New" w:cs="TH Sarabun New" w:eastAsia="TH Sarabun New" w:hAnsi="TH Sarabun New"/>
+                <w:b w:val="false"/>
+                <w:bCs w:val="false"/>
+                <w:sz w:val="28"/>
+                <w:szCs w:val="28"/>
+              </w:rPr>
+              <w:t xml:space="preserve">ห้องบ่มกล้วย</w:t>
+            </w:r>
+          </w:p>
+        </w:tc>
+        <w:tc>
+          <w:tcPr>
+            <w:tcW w:type="dxa" w:w="3368"/>
+            <w:tcBorders>
+              <w:top w:val="single" w:color="BFBFBF" w:sz="4"/>
+              <w:left w:val="single" w:color="BFBFBF" w:sz="4"/>
+              <w:bottom w:val="single" w:color="BFBFBF" w:sz="4"/>
+              <w:right w:val="single" w:color="BFBFBF" w:sz="4"/>
+            </w:tcBorders>
+            <w:tcMar>
+              <w:top w:type="dxa" w:w="40"/>
+              <w:left w:type="dxa" w:w="100"/>
+              <w:bottom w:type="dxa" w:w="40"/>
+              <w:right w:type="dxa" w:w="100"/>
+            </w:tcMar>
+          </w:tcPr>
+          <w:p>
+            <w:pPr>
+              <w:spacing w:after="0"/>
+            </w:pPr>
+            <w:r>
+              <w:rPr>
+                <w:rFonts w:ascii="TH Sarabun New" w:cs="TH Sarabun New" w:eastAsia="TH Sarabun New" w:hAnsi="TH Sarabun New"/>
+                <w:b w:val="false"/>
+                <w:bCs w:val="false"/>
+                <w:sz w:val="28"/>
+                <w:szCs w:val="28"/>
+              </w:rPr>
+              <w:t xml:space="preserve">A · เฝ้าอากาศ + เตือน + รับทราบ</w:t>
+            </w:r>
+          </w:p>
+        </w:tc>
+        <w:tc>
+          <w:tcPr>
             <w:tcW w:type="dxa" w:w="2500"/>
             <w:tcBorders>
               <w:top w:val="single" w:color="BFBFBF" w:sz="4"/>
@@ -1494,103 +1617,7 @@
                 <w:sz w:val="28"/>
                 <w:szCs w:val="28"/>
               </w:rPr>
-              <w:t xml:space="preserve">6 · หอถังน้ำของฟาร์ม</w:t>
-            </w:r>
-          </w:p>
-        </w:tc>
-        <w:tc>
-          <w:tcPr>
-            <w:tcW w:type="dxa" w:w="2900"/>
-            <w:tcBorders>
-              <w:top w:val="single" w:color="BFBFBF" w:sz="4"/>
-              <w:left w:val="single" w:color="BFBFBF" w:sz="4"/>
-              <w:bottom w:val="single" w:color="BFBFBF" w:sz="4"/>
-              <w:right w:val="single" w:color="BFBFBF" w:sz="4"/>
-            </w:tcBorders>
-            <w:tcMar>
-              <w:top w:type="dxa" w:w="40"/>
-              <w:left w:type="dxa" w:w="100"/>
-              <w:bottom w:type="dxa" w:w="40"/>
-              <w:right w:type="dxa" w:w="100"/>
-            </w:tcMar>
-          </w:tcPr>
-          <w:p>
-            <w:pPr>
-              <w:spacing w:after="0"/>
-            </w:pPr>
-            <w:r>
-              <w:rPr>
-                <w:rFonts w:ascii="TH Sarabun New" w:cs="TH Sarabun New" w:eastAsia="TH Sarabun New" w:hAnsi="TH Sarabun New"/>
-                <w:b w:val="false"/>
-                <w:bCs w:val="false"/>
-                <w:sz w:val="28"/>
-                <w:szCs w:val="28"/>
-              </w:rPr>
-              <w:t xml:space="preserve">idea_6_water_tower.py</w:t>
-            </w:r>
-          </w:p>
-        </w:tc>
-        <w:tc>
-          <w:tcPr>
-            <w:tcW w:type="dxa" w:w="2668"/>
-            <w:tcBorders>
-              <w:top w:val="single" w:color="BFBFBF" w:sz="4"/>
-              <w:left w:val="single" w:color="BFBFBF" w:sz="4"/>
-              <w:bottom w:val="single" w:color="BFBFBF" w:sz="4"/>
-              <w:right w:val="single" w:color="BFBFBF" w:sz="4"/>
-            </w:tcBorders>
-            <w:tcMar>
-              <w:top w:type="dxa" w:w="40"/>
-              <w:left w:type="dxa" w:w="100"/>
-              <w:bottom w:type="dxa" w:w="40"/>
-              <w:right w:type="dxa" w:w="100"/>
-            </w:tcMar>
-          </w:tcPr>
-          <w:p>
-            <w:pPr>
-              <w:spacing w:after="0"/>
-            </w:pPr>
-            <w:r>
-              <w:rPr>
-                <w:rFonts w:ascii="TH Sarabun New" w:cs="TH Sarabun New" w:eastAsia="TH Sarabun New" w:hAnsi="TH Sarabun New"/>
-                <w:b w:val="false"/>
-                <w:bCs w:val="false"/>
-                <w:sz w:val="28"/>
-                <w:szCs w:val="28"/>
-              </w:rPr>
-              <w:t xml:space="preserve">ระดับน้ำ (จำลอง) · ปั๊มไม่เปิดเมื่อน้ำต่ำ</w:t>
-            </w:r>
-          </w:p>
-        </w:tc>
-        <w:tc>
-          <w:tcPr>
-            <w:tcW w:type="dxa" w:w="2300"/>
-            <w:tcBorders>
-              <w:top w:val="single" w:color="BFBFBF" w:sz="4"/>
-              <w:left w:val="single" w:color="BFBFBF" w:sz="4"/>
-              <w:bottom w:val="single" w:color="BFBFBF" w:sz="4"/>
-              <w:right w:val="single" w:color="BFBFBF" w:sz="4"/>
-            </w:tcBorders>
-            <w:tcMar>
-              <w:top w:type="dxa" w:w="40"/>
-              <w:left w:type="dxa" w:w="100"/>
-              <w:bottom w:type="dxa" w:w="40"/>
-              <w:right w:type="dxa" w:w="100"/>
-            </w:tcMar>
-          </w:tcPr>
-          <w:p>
-            <w:pPr>
-              <w:spacing w:after="0"/>
-            </w:pPr>
-            <w:r>
-              <w:rPr>
-                <w:rFonts w:ascii="TH Sarabun New" w:cs="TH Sarabun New" w:eastAsia="TH Sarabun New" w:hAnsi="TH Sarabun New"/>
-                <w:b w:val="false"/>
-                <w:bCs w:val="false"/>
-                <w:sz w:val="28"/>
-                <w:szCs w:val="28"/>
-              </w:rPr>
-              <w:t xml:space="preserve">idea_web.html?idea=6</w:t>
+              <w:t xml:space="preserve">idea_10 · idea_web.html?idea=10</w:t>
             </w:r>
           </w:p>
         </w:tc>
@@ -1598,6 +1625,102 @@
       <w:tr>
         <w:tc>
           <w:tcPr>
+            <w:tcW w:type="dxa" w:w="900"/>
+            <w:tcBorders>
+              <w:top w:val="single" w:color="BFBFBF" w:sz="4"/>
+              <w:left w:val="single" w:color="BFBFBF" w:sz="4"/>
+              <w:bottom w:val="single" w:color="BFBFBF" w:sz="4"/>
+              <w:right w:val="single" w:color="BFBFBF" w:sz="4"/>
+            </w:tcBorders>
+            <w:tcMar>
+              <w:top w:type="dxa" w:w="40"/>
+              <w:left w:type="dxa" w:w="100"/>
+              <w:bottom w:type="dxa" w:w="40"/>
+              <w:right w:type="dxa" w:w="100"/>
+            </w:tcMar>
+          </w:tcPr>
+          <w:p>
+            <w:pPr>
+              <w:spacing w:after="0"/>
+            </w:pPr>
+            <w:r>
+              <w:rPr>
+                <w:rFonts w:ascii="TH Sarabun New" w:cs="TH Sarabun New" w:eastAsia="TH Sarabun New" w:hAnsi="TH Sarabun New"/>
+                <w:b w:val="false"/>
+                <w:bCs w:val="false"/>
+                <w:sz w:val="28"/>
+                <w:szCs w:val="28"/>
+              </w:rPr>
+              <w:t xml:space="preserve">11</w:t>
+            </w:r>
+          </w:p>
+        </w:tc>
+        <w:tc>
+          <w:tcPr>
+            <w:tcW w:type="dxa" w:w="3600"/>
+            <w:tcBorders>
+              <w:top w:val="single" w:color="BFBFBF" w:sz="4"/>
+              <w:left w:val="single" w:color="BFBFBF" w:sz="4"/>
+              <w:bottom w:val="single" w:color="BFBFBF" w:sz="4"/>
+              <w:right w:val="single" w:color="BFBFBF" w:sz="4"/>
+            </w:tcBorders>
+            <w:tcMar>
+              <w:top w:type="dxa" w:w="40"/>
+              <w:left w:type="dxa" w:w="100"/>
+              <w:bottom w:type="dxa" w:w="40"/>
+              <w:right w:type="dxa" w:w="100"/>
+            </w:tcMar>
+          </w:tcPr>
+          <w:p>
+            <w:pPr>
+              <w:spacing w:after="0"/>
+            </w:pPr>
+            <w:r>
+              <w:rPr>
+                <w:rFonts w:ascii="TH Sarabun New" w:cs="TH Sarabun New" w:eastAsia="TH Sarabun New" w:hAnsi="TH Sarabun New"/>
+                <w:b w:val="false"/>
+                <w:bCs w:val="false"/>
+                <w:sz w:val="28"/>
+                <w:szCs w:val="28"/>
+              </w:rPr>
+              <w:t xml:space="preserve">โรงอบลำไย</w:t>
+            </w:r>
+          </w:p>
+        </w:tc>
+        <w:tc>
+          <w:tcPr>
+            <w:tcW w:type="dxa" w:w="3368"/>
+            <w:tcBorders>
+              <w:top w:val="single" w:color="BFBFBF" w:sz="4"/>
+              <w:left w:val="single" w:color="BFBFBF" w:sz="4"/>
+              <w:bottom w:val="single" w:color="BFBFBF" w:sz="4"/>
+              <w:right w:val="single" w:color="BFBFBF" w:sz="4"/>
+            </w:tcBorders>
+            <w:tcMar>
+              <w:top w:type="dxa" w:w="40"/>
+              <w:left w:type="dxa" w:w="100"/>
+              <w:bottom w:type="dxa" w:w="40"/>
+              <w:right w:type="dxa" w:w="100"/>
+            </w:tcMar>
+          </w:tcPr>
+          <w:p>
+            <w:pPr>
+              <w:spacing w:after="0"/>
+            </w:pPr>
+            <w:r>
+              <w:rPr>
+                <w:rFonts w:ascii="TH Sarabun New" w:cs="TH Sarabun New" w:eastAsia="TH Sarabun New" w:hAnsi="TH Sarabun New"/>
+                <w:b w:val="false"/>
+                <w:bCs w:val="false"/>
+                <w:sz w:val="28"/>
+                <w:szCs w:val="28"/>
+              </w:rPr>
+              <w:t xml:space="preserve">A · เฝ้าอากาศ + เตือน + รับทราบ</w:t>
+            </w:r>
+          </w:p>
+        </w:tc>
+        <w:tc>
+          <w:tcPr>
             <w:tcW w:type="dxa" w:w="2500"/>
             <w:tcBorders>
               <w:top w:val="single" w:color="BFBFBF" w:sz="4"/>
@@ -1624,103 +1747,7 @@
                 <w:sz w:val="28"/>
                 <w:szCs w:val="28"/>
               </w:rPr>
-              <w:t xml:space="preserve">7 · หมอฟังปั๊ม/พัดลม</w:t>
-            </w:r>
-          </w:p>
-        </w:tc>
-        <w:tc>
-          <w:tcPr>
-            <w:tcW w:type="dxa" w:w="2900"/>
-            <w:tcBorders>
-              <w:top w:val="single" w:color="BFBFBF" w:sz="4"/>
-              <w:left w:val="single" w:color="BFBFBF" w:sz="4"/>
-              <w:bottom w:val="single" w:color="BFBFBF" w:sz="4"/>
-              <w:right w:val="single" w:color="BFBFBF" w:sz="4"/>
-            </w:tcBorders>
-            <w:tcMar>
-              <w:top w:type="dxa" w:w="40"/>
-              <w:left w:type="dxa" w:w="100"/>
-              <w:bottom w:type="dxa" w:w="40"/>
-              <w:right w:type="dxa" w:w="100"/>
-            </w:tcMar>
-          </w:tcPr>
-          <w:p>
-            <w:pPr>
-              <w:spacing w:after="0"/>
-            </w:pPr>
-            <w:r>
-              <w:rPr>
-                <w:rFonts w:ascii="TH Sarabun New" w:cs="TH Sarabun New" w:eastAsia="TH Sarabun New" w:hAnsi="TH Sarabun New"/>
-                <w:b w:val="false"/>
-                <w:bCs w:val="false"/>
-                <w:sz w:val="28"/>
-                <w:szCs w:val="28"/>
-              </w:rPr>
-              <w:t xml:space="preserve">idea_7_pump_doctor.py</w:t>
-            </w:r>
-          </w:p>
-        </w:tc>
-        <w:tc>
-          <w:tcPr>
-            <w:tcW w:type="dxa" w:w="2668"/>
-            <w:tcBorders>
-              <w:top w:val="single" w:color="BFBFBF" w:sz="4"/>
-              <w:left w:val="single" w:color="BFBFBF" w:sz="4"/>
-              <w:bottom w:val="single" w:color="BFBFBF" w:sz="4"/>
-              <w:right w:val="single" w:color="BFBFBF" w:sz="4"/>
-            </w:tcBorders>
-            <w:tcMar>
-              <w:top w:type="dxa" w:w="40"/>
-              <w:left w:type="dxa" w:w="100"/>
-              <w:bottom w:type="dxa" w:w="40"/>
-              <w:right w:type="dxa" w:w="100"/>
-            </w:tcMar>
-          </w:tcPr>
-          <w:p>
-            <w:pPr>
-              <w:spacing w:after="0"/>
-            </w:pPr>
-            <w:r>
-              <w:rPr>
-                <w:rFonts w:ascii="TH Sarabun New" w:cs="TH Sarabun New" w:eastAsia="TH Sarabun New" w:hAnsi="TH Sarabun New"/>
-                <w:b w:val="false"/>
-                <w:bCs w:val="false"/>
-                <w:sz w:val="28"/>
-                <w:szCs w:val="28"/>
-              </w:rPr>
-              <w:t xml:space="preserve">จับการสั่นผิดปกติ · หยุดปั๊ม</w:t>
-            </w:r>
-          </w:p>
-        </w:tc>
-        <w:tc>
-          <w:tcPr>
-            <w:tcW w:type="dxa" w:w="2300"/>
-            <w:tcBorders>
-              <w:top w:val="single" w:color="BFBFBF" w:sz="4"/>
-              <w:left w:val="single" w:color="BFBFBF" w:sz="4"/>
-              <w:bottom w:val="single" w:color="BFBFBF" w:sz="4"/>
-              <w:right w:val="single" w:color="BFBFBF" w:sz="4"/>
-            </w:tcBorders>
-            <w:tcMar>
-              <w:top w:type="dxa" w:w="40"/>
-              <w:left w:type="dxa" w:w="100"/>
-              <w:bottom w:type="dxa" w:w="40"/>
-              <w:right w:type="dxa" w:w="100"/>
-            </w:tcMar>
-          </w:tcPr>
-          <w:p>
-            <w:pPr>
-              <w:spacing w:after="0"/>
-            </w:pPr>
-            <w:r>
-              <w:rPr>
-                <w:rFonts w:ascii="TH Sarabun New" w:cs="TH Sarabun New" w:eastAsia="TH Sarabun New" w:hAnsi="TH Sarabun New"/>
-                <w:b w:val="false"/>
-                <w:bCs w:val="false"/>
-                <w:sz w:val="28"/>
-                <w:szCs w:val="28"/>
-              </w:rPr>
-              <w:t xml:space="preserve">idea_web.html?idea=7</w:t>
+              <w:t xml:space="preserve">idea_11 · idea_web.html?idea=11</w:t>
             </w:r>
           </w:p>
         </w:tc>
@@ -1728,6 +1755,102 @@
       <w:tr>
         <w:tc>
           <w:tcPr>
+            <w:tcW w:type="dxa" w:w="900"/>
+            <w:tcBorders>
+              <w:top w:val="single" w:color="BFBFBF" w:sz="4"/>
+              <w:left w:val="single" w:color="BFBFBF" w:sz="4"/>
+              <w:bottom w:val="single" w:color="BFBFBF" w:sz="4"/>
+              <w:right w:val="single" w:color="BFBFBF" w:sz="4"/>
+            </w:tcBorders>
+            <w:tcMar>
+              <w:top w:type="dxa" w:w="40"/>
+              <w:left w:type="dxa" w:w="100"/>
+              <w:bottom w:type="dxa" w:w="40"/>
+              <w:right w:type="dxa" w:w="100"/>
+            </w:tcMar>
+          </w:tcPr>
+          <w:p>
+            <w:pPr>
+              <w:spacing w:after="0"/>
+            </w:pPr>
+            <w:r>
+              <w:rPr>
+                <w:rFonts w:ascii="TH Sarabun New" w:cs="TH Sarabun New" w:eastAsia="TH Sarabun New" w:hAnsi="TH Sarabun New"/>
+                <w:b w:val="false"/>
+                <w:bCs w:val="false"/>
+                <w:sz w:val="28"/>
+                <w:szCs w:val="28"/>
+              </w:rPr>
+              <w:t xml:space="preserve">12</w:t>
+            </w:r>
+          </w:p>
+        </w:tc>
+        <w:tc>
+          <w:tcPr>
+            <w:tcW w:type="dxa" w:w="3600"/>
+            <w:tcBorders>
+              <w:top w:val="single" w:color="BFBFBF" w:sz="4"/>
+              <w:left w:val="single" w:color="BFBFBF" w:sz="4"/>
+              <w:bottom w:val="single" w:color="BFBFBF" w:sz="4"/>
+              <w:right w:val="single" w:color="BFBFBF" w:sz="4"/>
+            </w:tcBorders>
+            <w:tcMar>
+              <w:top w:type="dxa" w:w="40"/>
+              <w:left w:type="dxa" w:w="100"/>
+              <w:bottom w:type="dxa" w:w="40"/>
+              <w:right w:type="dxa" w:w="100"/>
+            </w:tcMar>
+          </w:tcPr>
+          <w:p>
+            <w:pPr>
+              <w:spacing w:after="0"/>
+            </w:pPr>
+            <w:r>
+              <w:rPr>
+                <w:rFonts w:ascii="TH Sarabun New" w:cs="TH Sarabun New" w:eastAsia="TH Sarabun New" w:hAnsi="TH Sarabun New"/>
+                <w:b w:val="false"/>
+                <w:bCs w:val="false"/>
+                <w:sz w:val="28"/>
+                <w:szCs w:val="28"/>
+              </w:rPr>
+              <w:t xml:space="preserve">โกดังเก็บเมล็ดพันธุ์</w:t>
+            </w:r>
+          </w:p>
+        </w:tc>
+        <w:tc>
+          <w:tcPr>
+            <w:tcW w:type="dxa" w:w="3368"/>
+            <w:tcBorders>
+              <w:top w:val="single" w:color="BFBFBF" w:sz="4"/>
+              <w:left w:val="single" w:color="BFBFBF" w:sz="4"/>
+              <w:bottom w:val="single" w:color="BFBFBF" w:sz="4"/>
+              <w:right w:val="single" w:color="BFBFBF" w:sz="4"/>
+            </w:tcBorders>
+            <w:tcMar>
+              <w:top w:type="dxa" w:w="40"/>
+              <w:left w:type="dxa" w:w="100"/>
+              <w:bottom w:type="dxa" w:w="40"/>
+              <w:right w:type="dxa" w:w="100"/>
+            </w:tcMar>
+          </w:tcPr>
+          <w:p>
+            <w:pPr>
+              <w:spacing w:after="0"/>
+            </w:pPr>
+            <w:r>
+              <w:rPr>
+                <w:rFonts w:ascii="TH Sarabun New" w:cs="TH Sarabun New" w:eastAsia="TH Sarabun New" w:hAnsi="TH Sarabun New"/>
+                <w:b w:val="false"/>
+                <w:bCs w:val="false"/>
+                <w:sz w:val="28"/>
+                <w:szCs w:val="28"/>
+              </w:rPr>
+              <w:t xml:space="preserve">A · เฝ้าอากาศ + เตือน + รับทราบ</w:t>
+            </w:r>
+          </w:p>
+        </w:tc>
+        <w:tc>
+          <w:tcPr>
             <w:tcW w:type="dxa" w:w="2500"/>
             <w:tcBorders>
               <w:top w:val="single" w:color="BFBFBF" w:sz="4"/>
@@ -1754,103 +1877,2217 @@
                 <w:sz w:val="28"/>
                 <w:szCs w:val="28"/>
               </w:rPr>
-              <w:t xml:space="preserve">8 · เล้าไก่กันความเครียดฝูง</w:t>
-            </w:r>
-          </w:p>
-        </w:tc>
-        <w:tc>
-          <w:tcPr>
-            <w:tcW w:type="dxa" w:w="2900"/>
-            <w:tcBorders>
-              <w:top w:val="single" w:color="BFBFBF" w:sz="4"/>
-              <w:left w:val="single" w:color="BFBFBF" w:sz="4"/>
-              <w:bottom w:val="single" w:color="BFBFBF" w:sz="4"/>
-              <w:right w:val="single" w:color="BFBFBF" w:sz="4"/>
-            </w:tcBorders>
-            <w:tcMar>
-              <w:top w:type="dxa" w:w="40"/>
-              <w:left w:type="dxa" w:w="100"/>
-              <w:bottom w:type="dxa" w:w="40"/>
-              <w:right w:type="dxa" w:w="100"/>
-            </w:tcMar>
-          </w:tcPr>
-          <w:p>
-            <w:pPr>
-              <w:spacing w:after="0"/>
-            </w:pPr>
-            <w:r>
-              <w:rPr>
-                <w:rFonts w:ascii="TH Sarabun New" w:cs="TH Sarabun New" w:eastAsia="TH Sarabun New" w:hAnsi="TH Sarabun New"/>
-                <w:b w:val="false"/>
-                <w:bCs w:val="false"/>
-                <w:sz w:val="28"/>
-                <w:szCs w:val="28"/>
-              </w:rPr>
-              <w:t xml:space="preserve">idea_8_coop.py</w:t>
-            </w:r>
-          </w:p>
-        </w:tc>
-        <w:tc>
-          <w:tcPr>
-            <w:tcW w:type="dxa" w:w="2668"/>
-            <w:tcBorders>
-              <w:top w:val="single" w:color="BFBFBF" w:sz="4"/>
-              <w:left w:val="single" w:color="BFBFBF" w:sz="4"/>
-              <w:bottom w:val="single" w:color="BFBFBF" w:sz="4"/>
-              <w:right w:val="single" w:color="BFBFBF" w:sz="4"/>
-            </w:tcBorders>
-            <w:tcMar>
-              <w:top w:type="dxa" w:w="40"/>
-              <w:left w:type="dxa" w:w="100"/>
-              <w:bottom w:type="dxa" w:w="40"/>
-              <w:right w:type="dxa" w:w="100"/>
-            </w:tcMar>
-          </w:tcPr>
-          <w:p>
-            <w:pPr>
-              <w:spacing w:after="0"/>
-            </w:pPr>
-            <w:r>
-              <w:rPr>
-                <w:rFonts w:ascii="TH Sarabun New" w:cs="TH Sarabun New" w:eastAsia="TH Sarabun New" w:hAnsi="TH Sarabun New"/>
-                <w:b w:val="false"/>
-                <w:bCs w:val="false"/>
-                <w:sz w:val="28"/>
-                <w:szCs w:val="28"/>
-              </w:rPr>
-              <w:t xml:space="preserve">เตือนเล้าร้อน/ชื้นเกิน</w:t>
-            </w:r>
-          </w:p>
-        </w:tc>
-        <w:tc>
-          <w:tcPr>
-            <w:tcW w:type="dxa" w:w="2300"/>
-            <w:tcBorders>
-              <w:top w:val="single" w:color="BFBFBF" w:sz="4"/>
-              <w:left w:val="single" w:color="BFBFBF" w:sz="4"/>
-              <w:bottom w:val="single" w:color="BFBFBF" w:sz="4"/>
-              <w:right w:val="single" w:color="BFBFBF" w:sz="4"/>
-            </w:tcBorders>
-            <w:tcMar>
-              <w:top w:type="dxa" w:w="40"/>
-              <w:left w:type="dxa" w:w="100"/>
-              <w:bottom w:type="dxa" w:w="40"/>
-              <w:right w:type="dxa" w:w="100"/>
-            </w:tcMar>
-          </w:tcPr>
-          <w:p>
-            <w:pPr>
-              <w:spacing w:after="0"/>
-            </w:pPr>
-            <w:r>
-              <w:rPr>
-                <w:rFonts w:ascii="TH Sarabun New" w:cs="TH Sarabun New" w:eastAsia="TH Sarabun New" w:hAnsi="TH Sarabun New"/>
-                <w:b w:val="false"/>
-                <w:bCs w:val="false"/>
-                <w:sz w:val="28"/>
-                <w:szCs w:val="28"/>
-              </w:rPr>
-              <w:t xml:space="preserve">idea_web.html?idea=8</w:t>
+              <w:t xml:space="preserve">idea_12 · idea_web.html?idea=12</w:t>
+            </w:r>
+          </w:p>
+        </w:tc>
+      </w:tr>
+      <w:tr>
+        <w:tc>
+          <w:tcPr>
+            <w:tcW w:type="dxa" w:w="900"/>
+            <w:tcBorders>
+              <w:top w:val="single" w:color="BFBFBF" w:sz="4"/>
+              <w:left w:val="single" w:color="BFBFBF" w:sz="4"/>
+              <w:bottom w:val="single" w:color="BFBFBF" w:sz="4"/>
+              <w:right w:val="single" w:color="BFBFBF" w:sz="4"/>
+            </w:tcBorders>
+            <w:tcMar>
+              <w:top w:type="dxa" w:w="40"/>
+              <w:left w:type="dxa" w:w="100"/>
+              <w:bottom w:type="dxa" w:w="40"/>
+              <w:right w:type="dxa" w:w="100"/>
+            </w:tcMar>
+          </w:tcPr>
+          <w:p>
+            <w:pPr>
+              <w:spacing w:after="0"/>
+            </w:pPr>
+            <w:r>
+              <w:rPr>
+                <w:rFonts w:ascii="TH Sarabun New" w:cs="TH Sarabun New" w:eastAsia="TH Sarabun New" w:hAnsi="TH Sarabun New"/>
+                <w:b w:val="false"/>
+                <w:bCs w:val="false"/>
+                <w:sz w:val="28"/>
+                <w:szCs w:val="28"/>
+              </w:rPr>
+              <w:t xml:space="preserve">13</w:t>
+            </w:r>
+          </w:p>
+        </w:tc>
+        <w:tc>
+          <w:tcPr>
+            <w:tcW w:type="dxa" w:w="3600"/>
+            <w:tcBorders>
+              <w:top w:val="single" w:color="BFBFBF" w:sz="4"/>
+              <w:left w:val="single" w:color="BFBFBF" w:sz="4"/>
+              <w:bottom w:val="single" w:color="BFBFBF" w:sz="4"/>
+              <w:right w:val="single" w:color="BFBFBF" w:sz="4"/>
+            </w:tcBorders>
+            <w:tcMar>
+              <w:top w:type="dxa" w:w="40"/>
+              <w:left w:type="dxa" w:w="100"/>
+              <w:bottom w:type="dxa" w:w="40"/>
+              <w:right w:type="dxa" w:w="100"/>
+            </w:tcMar>
+          </w:tcPr>
+          <w:p>
+            <w:pPr>
+              <w:spacing w:after="0"/>
+            </w:pPr>
+            <w:r>
+              <w:rPr>
+                <w:rFonts w:ascii="TH Sarabun New" w:cs="TH Sarabun New" w:eastAsia="TH Sarabun New" w:hAnsi="TH Sarabun New"/>
+                <w:b w:val="false"/>
+                <w:bCs w:val="false"/>
+                <w:sz w:val="28"/>
+                <w:szCs w:val="28"/>
+              </w:rPr>
+              <w:t xml:space="preserve">โกดังปุ๋ย</w:t>
+            </w:r>
+          </w:p>
+        </w:tc>
+        <w:tc>
+          <w:tcPr>
+            <w:tcW w:type="dxa" w:w="3368"/>
+            <w:tcBorders>
+              <w:top w:val="single" w:color="BFBFBF" w:sz="4"/>
+              <w:left w:val="single" w:color="BFBFBF" w:sz="4"/>
+              <w:bottom w:val="single" w:color="BFBFBF" w:sz="4"/>
+              <w:right w:val="single" w:color="BFBFBF" w:sz="4"/>
+            </w:tcBorders>
+            <w:tcMar>
+              <w:top w:type="dxa" w:w="40"/>
+              <w:left w:type="dxa" w:w="100"/>
+              <w:bottom w:type="dxa" w:w="40"/>
+              <w:right w:type="dxa" w:w="100"/>
+            </w:tcMar>
+          </w:tcPr>
+          <w:p>
+            <w:pPr>
+              <w:spacing w:after="0"/>
+            </w:pPr>
+            <w:r>
+              <w:rPr>
+                <w:rFonts w:ascii="TH Sarabun New" w:cs="TH Sarabun New" w:eastAsia="TH Sarabun New" w:hAnsi="TH Sarabun New"/>
+                <w:b w:val="false"/>
+                <w:bCs w:val="false"/>
+                <w:sz w:val="28"/>
+                <w:szCs w:val="28"/>
+              </w:rPr>
+              <w:t xml:space="preserve">A · เฝ้าอากาศ + เตือน + รับทราบ</w:t>
+            </w:r>
+          </w:p>
+        </w:tc>
+        <w:tc>
+          <w:tcPr>
+            <w:tcW w:type="dxa" w:w="2500"/>
+            <w:tcBorders>
+              <w:top w:val="single" w:color="BFBFBF" w:sz="4"/>
+              <w:left w:val="single" w:color="BFBFBF" w:sz="4"/>
+              <w:bottom w:val="single" w:color="BFBFBF" w:sz="4"/>
+              <w:right w:val="single" w:color="BFBFBF" w:sz="4"/>
+            </w:tcBorders>
+            <w:tcMar>
+              <w:top w:type="dxa" w:w="40"/>
+              <w:left w:type="dxa" w:w="100"/>
+              <w:bottom w:type="dxa" w:w="40"/>
+              <w:right w:type="dxa" w:w="100"/>
+            </w:tcMar>
+          </w:tcPr>
+          <w:p>
+            <w:pPr>
+              <w:spacing w:after="0"/>
+            </w:pPr>
+            <w:r>
+              <w:rPr>
+                <w:rFonts w:ascii="TH Sarabun New" w:cs="TH Sarabun New" w:eastAsia="TH Sarabun New" w:hAnsi="TH Sarabun New"/>
+                <w:b w:val="false"/>
+                <w:bCs w:val="false"/>
+                <w:sz w:val="28"/>
+                <w:szCs w:val="28"/>
+              </w:rPr>
+              <w:t xml:space="preserve">idea_13 · idea_web.html?idea=13</w:t>
+            </w:r>
+          </w:p>
+        </w:tc>
+      </w:tr>
+      <w:tr>
+        <w:tc>
+          <w:tcPr>
+            <w:tcW w:type="dxa" w:w="900"/>
+            <w:tcBorders>
+              <w:top w:val="single" w:color="BFBFBF" w:sz="4"/>
+              <w:left w:val="single" w:color="BFBFBF" w:sz="4"/>
+              <w:bottom w:val="single" w:color="BFBFBF" w:sz="4"/>
+              <w:right w:val="single" w:color="BFBFBF" w:sz="4"/>
+            </w:tcBorders>
+            <w:tcMar>
+              <w:top w:type="dxa" w:w="40"/>
+              <w:left w:type="dxa" w:w="100"/>
+              <w:bottom w:type="dxa" w:w="40"/>
+              <w:right w:type="dxa" w:w="100"/>
+            </w:tcMar>
+          </w:tcPr>
+          <w:p>
+            <w:pPr>
+              <w:spacing w:after="0"/>
+            </w:pPr>
+            <w:r>
+              <w:rPr>
+                <w:rFonts w:ascii="TH Sarabun New" w:cs="TH Sarabun New" w:eastAsia="TH Sarabun New" w:hAnsi="TH Sarabun New"/>
+                <w:b w:val="false"/>
+                <w:bCs w:val="false"/>
+                <w:sz w:val="28"/>
+                <w:szCs w:val="28"/>
+              </w:rPr>
+              <w:t xml:space="preserve">14</w:t>
+            </w:r>
+          </w:p>
+        </w:tc>
+        <w:tc>
+          <w:tcPr>
+            <w:tcW w:type="dxa" w:w="3600"/>
+            <w:tcBorders>
+              <w:top w:val="single" w:color="BFBFBF" w:sz="4"/>
+              <w:left w:val="single" w:color="BFBFBF" w:sz="4"/>
+              <w:bottom w:val="single" w:color="BFBFBF" w:sz="4"/>
+              <w:right w:val="single" w:color="BFBFBF" w:sz="4"/>
+            </w:tcBorders>
+            <w:tcMar>
+              <w:top w:type="dxa" w:w="40"/>
+              <w:left w:type="dxa" w:w="100"/>
+              <w:bottom w:type="dxa" w:w="40"/>
+              <w:right w:type="dxa" w:w="100"/>
+            </w:tcMar>
+          </w:tcPr>
+          <w:p>
+            <w:pPr>
+              <w:spacing w:after="0"/>
+            </w:pPr>
+            <w:r>
+              <w:rPr>
+                <w:rFonts w:ascii="TH Sarabun New" w:cs="TH Sarabun New" w:eastAsia="TH Sarabun New" w:hAnsi="TH Sarabun New"/>
+                <w:b w:val="false"/>
+                <w:bCs w:val="false"/>
+                <w:sz w:val="28"/>
+                <w:szCs w:val="28"/>
+              </w:rPr>
+              <w:t xml:space="preserve">ตู้เก็บยาและวัคซีนสัตว์</w:t>
+            </w:r>
+          </w:p>
+        </w:tc>
+        <w:tc>
+          <w:tcPr>
+            <w:tcW w:type="dxa" w:w="3368"/>
+            <w:tcBorders>
+              <w:top w:val="single" w:color="BFBFBF" w:sz="4"/>
+              <w:left w:val="single" w:color="BFBFBF" w:sz="4"/>
+              <w:bottom w:val="single" w:color="BFBFBF" w:sz="4"/>
+              <w:right w:val="single" w:color="BFBFBF" w:sz="4"/>
+            </w:tcBorders>
+            <w:tcMar>
+              <w:top w:type="dxa" w:w="40"/>
+              <w:left w:type="dxa" w:w="100"/>
+              <w:bottom w:type="dxa" w:w="40"/>
+              <w:right w:type="dxa" w:w="100"/>
+            </w:tcMar>
+          </w:tcPr>
+          <w:p>
+            <w:pPr>
+              <w:spacing w:after="0"/>
+            </w:pPr>
+            <w:r>
+              <w:rPr>
+                <w:rFonts w:ascii="TH Sarabun New" w:cs="TH Sarabun New" w:eastAsia="TH Sarabun New" w:hAnsi="TH Sarabun New"/>
+                <w:b w:val="false"/>
+                <w:bCs w:val="false"/>
+                <w:sz w:val="28"/>
+                <w:szCs w:val="28"/>
+              </w:rPr>
+              <w:t xml:space="preserve">A · เฝ้าอากาศ + เตือน + รับทราบ</w:t>
+            </w:r>
+          </w:p>
+        </w:tc>
+        <w:tc>
+          <w:tcPr>
+            <w:tcW w:type="dxa" w:w="2500"/>
+            <w:tcBorders>
+              <w:top w:val="single" w:color="BFBFBF" w:sz="4"/>
+              <w:left w:val="single" w:color="BFBFBF" w:sz="4"/>
+              <w:bottom w:val="single" w:color="BFBFBF" w:sz="4"/>
+              <w:right w:val="single" w:color="BFBFBF" w:sz="4"/>
+            </w:tcBorders>
+            <w:tcMar>
+              <w:top w:type="dxa" w:w="40"/>
+              <w:left w:type="dxa" w:w="100"/>
+              <w:bottom w:type="dxa" w:w="40"/>
+              <w:right w:type="dxa" w:w="100"/>
+            </w:tcMar>
+          </w:tcPr>
+          <w:p>
+            <w:pPr>
+              <w:spacing w:after="0"/>
+            </w:pPr>
+            <w:r>
+              <w:rPr>
+                <w:rFonts w:ascii="TH Sarabun New" w:cs="TH Sarabun New" w:eastAsia="TH Sarabun New" w:hAnsi="TH Sarabun New"/>
+                <w:b w:val="false"/>
+                <w:bCs w:val="false"/>
+                <w:sz w:val="28"/>
+                <w:szCs w:val="28"/>
+              </w:rPr>
+              <w:t xml:space="preserve">idea_14 · idea_web.html?idea=14</w:t>
+            </w:r>
+          </w:p>
+        </w:tc>
+      </w:tr>
+      <w:tr>
+        <w:tc>
+          <w:tcPr>
+            <w:tcW w:type="dxa" w:w="900"/>
+            <w:tcBorders>
+              <w:top w:val="single" w:color="BFBFBF" w:sz="4"/>
+              <w:left w:val="single" w:color="BFBFBF" w:sz="4"/>
+              <w:bottom w:val="single" w:color="BFBFBF" w:sz="4"/>
+              <w:right w:val="single" w:color="BFBFBF" w:sz="4"/>
+            </w:tcBorders>
+            <w:tcMar>
+              <w:top w:type="dxa" w:w="40"/>
+              <w:left w:type="dxa" w:w="100"/>
+              <w:bottom w:type="dxa" w:w="40"/>
+              <w:right w:type="dxa" w:w="100"/>
+            </w:tcMar>
+          </w:tcPr>
+          <w:p>
+            <w:pPr>
+              <w:spacing w:after="0"/>
+            </w:pPr>
+            <w:r>
+              <w:rPr>
+                <w:rFonts w:ascii="TH Sarabun New" w:cs="TH Sarabun New" w:eastAsia="TH Sarabun New" w:hAnsi="TH Sarabun New"/>
+                <w:b w:val="false"/>
+                <w:bCs w:val="false"/>
+                <w:sz w:val="28"/>
+                <w:szCs w:val="28"/>
+              </w:rPr>
+              <w:t xml:space="preserve">15</w:t>
+            </w:r>
+          </w:p>
+        </w:tc>
+        <w:tc>
+          <w:tcPr>
+            <w:tcW w:type="dxa" w:w="3600"/>
+            <w:tcBorders>
+              <w:top w:val="single" w:color="BFBFBF" w:sz="4"/>
+              <w:left w:val="single" w:color="BFBFBF" w:sz="4"/>
+              <w:bottom w:val="single" w:color="BFBFBF" w:sz="4"/>
+              <w:right w:val="single" w:color="BFBFBF" w:sz="4"/>
+            </w:tcBorders>
+            <w:tcMar>
+              <w:top w:type="dxa" w:w="40"/>
+              <w:left w:type="dxa" w:w="100"/>
+              <w:bottom w:type="dxa" w:w="40"/>
+              <w:right w:type="dxa" w:w="100"/>
+            </w:tcMar>
+          </w:tcPr>
+          <w:p>
+            <w:pPr>
+              <w:spacing w:after="0"/>
+            </w:pPr>
+            <w:r>
+              <w:rPr>
+                <w:rFonts w:ascii="TH Sarabun New" w:cs="TH Sarabun New" w:eastAsia="TH Sarabun New" w:hAnsi="TH Sarabun New"/>
+                <w:b w:val="false"/>
+                <w:bCs w:val="false"/>
+                <w:sz w:val="28"/>
+                <w:szCs w:val="28"/>
+              </w:rPr>
+              <w:t xml:space="preserve">โรงเรือนไฮโดรโปนิกส์</w:t>
+            </w:r>
+          </w:p>
+        </w:tc>
+        <w:tc>
+          <w:tcPr>
+            <w:tcW w:type="dxa" w:w="3368"/>
+            <w:tcBorders>
+              <w:top w:val="single" w:color="BFBFBF" w:sz="4"/>
+              <w:left w:val="single" w:color="BFBFBF" w:sz="4"/>
+              <w:bottom w:val="single" w:color="BFBFBF" w:sz="4"/>
+              <w:right w:val="single" w:color="BFBFBF" w:sz="4"/>
+            </w:tcBorders>
+            <w:tcMar>
+              <w:top w:type="dxa" w:w="40"/>
+              <w:left w:type="dxa" w:w="100"/>
+              <w:bottom w:type="dxa" w:w="40"/>
+              <w:right w:type="dxa" w:w="100"/>
+            </w:tcMar>
+          </w:tcPr>
+          <w:p>
+            <w:pPr>
+              <w:spacing w:after="0"/>
+            </w:pPr>
+            <w:r>
+              <w:rPr>
+                <w:rFonts w:ascii="TH Sarabun New" w:cs="TH Sarabun New" w:eastAsia="TH Sarabun New" w:hAnsi="TH Sarabun New"/>
+                <w:b w:val="false"/>
+                <w:bCs w:val="false"/>
+                <w:sz w:val="28"/>
+                <w:szCs w:val="28"/>
+              </w:rPr>
+              <w:t xml:space="preserve">A · เฝ้าอากาศ + เตือน + รับทราบ</w:t>
+            </w:r>
+          </w:p>
+        </w:tc>
+        <w:tc>
+          <w:tcPr>
+            <w:tcW w:type="dxa" w:w="2500"/>
+            <w:tcBorders>
+              <w:top w:val="single" w:color="BFBFBF" w:sz="4"/>
+              <w:left w:val="single" w:color="BFBFBF" w:sz="4"/>
+              <w:bottom w:val="single" w:color="BFBFBF" w:sz="4"/>
+              <w:right w:val="single" w:color="BFBFBF" w:sz="4"/>
+            </w:tcBorders>
+            <w:tcMar>
+              <w:top w:type="dxa" w:w="40"/>
+              <w:left w:type="dxa" w:w="100"/>
+              <w:bottom w:type="dxa" w:w="40"/>
+              <w:right w:type="dxa" w:w="100"/>
+            </w:tcMar>
+          </w:tcPr>
+          <w:p>
+            <w:pPr>
+              <w:spacing w:after="0"/>
+            </w:pPr>
+            <w:r>
+              <w:rPr>
+                <w:rFonts w:ascii="TH Sarabun New" w:cs="TH Sarabun New" w:eastAsia="TH Sarabun New" w:hAnsi="TH Sarabun New"/>
+                <w:b w:val="false"/>
+                <w:bCs w:val="false"/>
+                <w:sz w:val="28"/>
+                <w:szCs w:val="28"/>
+              </w:rPr>
+              <w:t xml:space="preserve">idea_15 · idea_web.html?idea=15</w:t>
+            </w:r>
+          </w:p>
+        </w:tc>
+      </w:tr>
+      <w:tr>
+        <w:tc>
+          <w:tcPr>
+            <w:tcW w:type="dxa" w:w="900"/>
+            <w:tcBorders>
+              <w:top w:val="single" w:color="BFBFBF" w:sz="4"/>
+              <w:left w:val="single" w:color="BFBFBF" w:sz="4"/>
+              <w:bottom w:val="single" w:color="BFBFBF" w:sz="4"/>
+              <w:right w:val="single" w:color="BFBFBF" w:sz="4"/>
+            </w:tcBorders>
+            <w:tcMar>
+              <w:top w:type="dxa" w:w="40"/>
+              <w:left w:type="dxa" w:w="100"/>
+              <w:bottom w:type="dxa" w:w="40"/>
+              <w:right w:type="dxa" w:w="100"/>
+            </w:tcMar>
+          </w:tcPr>
+          <w:p>
+            <w:pPr>
+              <w:spacing w:after="0"/>
+            </w:pPr>
+            <w:r>
+              <w:rPr>
+                <w:rFonts w:ascii="TH Sarabun New" w:cs="TH Sarabun New" w:eastAsia="TH Sarabun New" w:hAnsi="TH Sarabun New"/>
+                <w:b w:val="false"/>
+                <w:bCs w:val="false"/>
+                <w:sz w:val="28"/>
+                <w:szCs w:val="28"/>
+              </w:rPr>
+              <w:t xml:space="preserve">4</w:t>
+            </w:r>
+          </w:p>
+        </w:tc>
+        <w:tc>
+          <w:tcPr>
+            <w:tcW w:type="dxa" w:w="3600"/>
+            <w:tcBorders>
+              <w:top w:val="single" w:color="BFBFBF" w:sz="4"/>
+              <w:left w:val="single" w:color="BFBFBF" w:sz="4"/>
+              <w:bottom w:val="single" w:color="BFBFBF" w:sz="4"/>
+              <w:right w:val="single" w:color="BFBFBF" w:sz="4"/>
+            </w:tcBorders>
+            <w:tcMar>
+              <w:top w:type="dxa" w:w="40"/>
+              <w:left w:type="dxa" w:w="100"/>
+              <w:bottom w:type="dxa" w:w="40"/>
+              <w:right w:type="dxa" w:w="100"/>
+            </w:tcMar>
+          </w:tcPr>
+          <w:p>
+            <w:pPr>
+              <w:spacing w:after="0"/>
+            </w:pPr>
+            <w:r>
+              <w:rPr>
+                <w:rFonts w:ascii="TH Sarabun New" w:cs="TH Sarabun New" w:eastAsia="TH Sarabun New" w:hAnsi="TH Sarabun New"/>
+                <w:b w:val="false"/>
+                <w:bCs w:val="false"/>
+                <w:sz w:val="28"/>
+                <w:szCs w:val="28"/>
+              </w:rPr>
+              <w:t xml:space="preserve">โรงเรือนอัจฉริยะ (รดน้ำ)</w:t>
+            </w:r>
+          </w:p>
+        </w:tc>
+        <w:tc>
+          <w:tcPr>
+            <w:tcW w:type="dxa" w:w="3368"/>
+            <w:tcBorders>
+              <w:top w:val="single" w:color="BFBFBF" w:sz="4"/>
+              <w:left w:val="single" w:color="BFBFBF" w:sz="4"/>
+              <w:bottom w:val="single" w:color="BFBFBF" w:sz="4"/>
+              <w:right w:val="single" w:color="BFBFBF" w:sz="4"/>
+            </w:tcBorders>
+            <w:tcMar>
+              <w:top w:type="dxa" w:w="40"/>
+              <w:left w:type="dxa" w:w="100"/>
+              <w:bottom w:type="dxa" w:w="40"/>
+              <w:right w:type="dxa" w:w="100"/>
+            </w:tcMar>
+          </w:tcPr>
+          <w:p>
+            <w:pPr>
+              <w:spacing w:after="0"/>
+            </w:pPr>
+            <w:r>
+              <w:rPr>
+                <w:rFonts w:ascii="TH Sarabun New" w:cs="TH Sarabun New" w:eastAsia="TH Sarabun New" w:hAnsi="TH Sarabun New"/>
+                <w:b w:val="false"/>
+                <w:bCs w:val="false"/>
+                <w:sz w:val="28"/>
+                <w:szCs w:val="28"/>
+              </w:rPr>
+              <w:t xml:space="preserve">B · สั่งเครื่องจากมือถือ + กฎปลอดภัย</w:t>
+            </w:r>
+          </w:p>
+        </w:tc>
+        <w:tc>
+          <w:tcPr>
+            <w:tcW w:type="dxa" w:w="2500"/>
+            <w:tcBorders>
+              <w:top w:val="single" w:color="BFBFBF" w:sz="4"/>
+              <w:left w:val="single" w:color="BFBFBF" w:sz="4"/>
+              <w:bottom w:val="single" w:color="BFBFBF" w:sz="4"/>
+              <w:right w:val="single" w:color="BFBFBF" w:sz="4"/>
+            </w:tcBorders>
+            <w:tcMar>
+              <w:top w:type="dxa" w:w="40"/>
+              <w:left w:type="dxa" w:w="100"/>
+              <w:bottom w:type="dxa" w:w="40"/>
+              <w:right w:type="dxa" w:w="100"/>
+            </w:tcMar>
+          </w:tcPr>
+          <w:p>
+            <w:pPr>
+              <w:spacing w:after="0"/>
+            </w:pPr>
+            <w:r>
+              <w:rPr>
+                <w:rFonts w:ascii="TH Sarabun New" w:cs="TH Sarabun New" w:eastAsia="TH Sarabun New" w:hAnsi="TH Sarabun New"/>
+                <w:b w:val="false"/>
+                <w:bCs w:val="false"/>
+                <w:sz w:val="28"/>
+                <w:szCs w:val="28"/>
+              </w:rPr>
+              <w:t xml:space="preserve">idea_4 · idea_web.html?idea=4</w:t>
+            </w:r>
+          </w:p>
+        </w:tc>
+      </w:tr>
+      <w:tr>
+        <w:tc>
+          <w:tcPr>
+            <w:tcW w:type="dxa" w:w="900"/>
+            <w:tcBorders>
+              <w:top w:val="single" w:color="BFBFBF" w:sz="4"/>
+              <w:left w:val="single" w:color="BFBFBF" w:sz="4"/>
+              <w:bottom w:val="single" w:color="BFBFBF" w:sz="4"/>
+              <w:right w:val="single" w:color="BFBFBF" w:sz="4"/>
+            </w:tcBorders>
+            <w:tcMar>
+              <w:top w:type="dxa" w:w="40"/>
+              <w:left w:type="dxa" w:w="100"/>
+              <w:bottom w:type="dxa" w:w="40"/>
+              <w:right w:type="dxa" w:w="100"/>
+            </w:tcMar>
+          </w:tcPr>
+          <w:p>
+            <w:pPr>
+              <w:spacing w:after="0"/>
+            </w:pPr>
+            <w:r>
+              <w:rPr>
+                <w:rFonts w:ascii="TH Sarabun New" w:cs="TH Sarabun New" w:eastAsia="TH Sarabun New" w:hAnsi="TH Sarabun New"/>
+                <w:b w:val="false"/>
+                <w:bCs w:val="false"/>
+                <w:sz w:val="28"/>
+                <w:szCs w:val="28"/>
+              </w:rPr>
+              <w:t xml:space="preserve">6</w:t>
+            </w:r>
+          </w:p>
+        </w:tc>
+        <w:tc>
+          <w:tcPr>
+            <w:tcW w:type="dxa" w:w="3600"/>
+            <w:tcBorders>
+              <w:top w:val="single" w:color="BFBFBF" w:sz="4"/>
+              <w:left w:val="single" w:color="BFBFBF" w:sz="4"/>
+              <w:bottom w:val="single" w:color="BFBFBF" w:sz="4"/>
+              <w:right w:val="single" w:color="BFBFBF" w:sz="4"/>
+            </w:tcBorders>
+            <w:tcMar>
+              <w:top w:type="dxa" w:w="40"/>
+              <w:left w:type="dxa" w:w="100"/>
+              <w:bottom w:type="dxa" w:w="40"/>
+              <w:right w:type="dxa" w:w="100"/>
+            </w:tcMar>
+          </w:tcPr>
+          <w:p>
+            <w:pPr>
+              <w:spacing w:after="0"/>
+            </w:pPr>
+            <w:r>
+              <w:rPr>
+                <w:rFonts w:ascii="TH Sarabun New" w:cs="TH Sarabun New" w:eastAsia="TH Sarabun New" w:hAnsi="TH Sarabun New"/>
+                <w:b w:val="false"/>
+                <w:bCs w:val="false"/>
+                <w:sz w:val="28"/>
+                <w:szCs w:val="28"/>
+              </w:rPr>
+              <w:t xml:space="preserve">หอถังน้ำของฟาร์ม</w:t>
+            </w:r>
+          </w:p>
+        </w:tc>
+        <w:tc>
+          <w:tcPr>
+            <w:tcW w:type="dxa" w:w="3368"/>
+            <w:tcBorders>
+              <w:top w:val="single" w:color="BFBFBF" w:sz="4"/>
+              <w:left w:val="single" w:color="BFBFBF" w:sz="4"/>
+              <w:bottom w:val="single" w:color="BFBFBF" w:sz="4"/>
+              <w:right w:val="single" w:color="BFBFBF" w:sz="4"/>
+            </w:tcBorders>
+            <w:tcMar>
+              <w:top w:type="dxa" w:w="40"/>
+              <w:left w:type="dxa" w:w="100"/>
+              <w:bottom w:type="dxa" w:w="40"/>
+              <w:right w:type="dxa" w:w="100"/>
+            </w:tcMar>
+          </w:tcPr>
+          <w:p>
+            <w:pPr>
+              <w:spacing w:after="0"/>
+            </w:pPr>
+            <w:r>
+              <w:rPr>
+                <w:rFonts w:ascii="TH Sarabun New" w:cs="TH Sarabun New" w:eastAsia="TH Sarabun New" w:hAnsi="TH Sarabun New"/>
+                <w:b w:val="false"/>
+                <w:bCs w:val="false"/>
+                <w:sz w:val="28"/>
+                <w:szCs w:val="28"/>
+              </w:rPr>
+              <w:t xml:space="preserve">B · สั่งเครื่องจากมือถือ + กฎปลอดภัย</w:t>
+            </w:r>
+          </w:p>
+        </w:tc>
+        <w:tc>
+          <w:tcPr>
+            <w:tcW w:type="dxa" w:w="2500"/>
+            <w:tcBorders>
+              <w:top w:val="single" w:color="BFBFBF" w:sz="4"/>
+              <w:left w:val="single" w:color="BFBFBF" w:sz="4"/>
+              <w:bottom w:val="single" w:color="BFBFBF" w:sz="4"/>
+              <w:right w:val="single" w:color="BFBFBF" w:sz="4"/>
+            </w:tcBorders>
+            <w:tcMar>
+              <w:top w:type="dxa" w:w="40"/>
+              <w:left w:type="dxa" w:w="100"/>
+              <w:bottom w:type="dxa" w:w="40"/>
+              <w:right w:type="dxa" w:w="100"/>
+            </w:tcMar>
+          </w:tcPr>
+          <w:p>
+            <w:pPr>
+              <w:spacing w:after="0"/>
+            </w:pPr>
+            <w:r>
+              <w:rPr>
+                <w:rFonts w:ascii="TH Sarabun New" w:cs="TH Sarabun New" w:eastAsia="TH Sarabun New" w:hAnsi="TH Sarabun New"/>
+                <w:b w:val="false"/>
+                <w:bCs w:val="false"/>
+                <w:sz w:val="28"/>
+                <w:szCs w:val="28"/>
+              </w:rPr>
+              <w:t xml:space="preserve">idea_6 · idea_web.html?idea=6</w:t>
+            </w:r>
+          </w:p>
+        </w:tc>
+      </w:tr>
+      <w:tr>
+        <w:tc>
+          <w:tcPr>
+            <w:tcW w:type="dxa" w:w="900"/>
+            <w:tcBorders>
+              <w:top w:val="single" w:color="BFBFBF" w:sz="4"/>
+              <w:left w:val="single" w:color="BFBFBF" w:sz="4"/>
+              <w:bottom w:val="single" w:color="BFBFBF" w:sz="4"/>
+              <w:right w:val="single" w:color="BFBFBF" w:sz="4"/>
+            </w:tcBorders>
+            <w:tcMar>
+              <w:top w:type="dxa" w:w="40"/>
+              <w:left w:type="dxa" w:w="100"/>
+              <w:bottom w:type="dxa" w:w="40"/>
+              <w:right w:type="dxa" w:w="100"/>
+            </w:tcMar>
+          </w:tcPr>
+          <w:p>
+            <w:pPr>
+              <w:spacing w:after="0"/>
+            </w:pPr>
+            <w:r>
+              <w:rPr>
+                <w:rFonts w:ascii="TH Sarabun New" w:cs="TH Sarabun New" w:eastAsia="TH Sarabun New" w:hAnsi="TH Sarabun New"/>
+                <w:b w:val="false"/>
+                <w:bCs w:val="false"/>
+                <w:sz w:val="28"/>
+                <w:szCs w:val="28"/>
+              </w:rPr>
+              <w:t xml:space="preserve">16</w:t>
+            </w:r>
+          </w:p>
+        </w:tc>
+        <w:tc>
+          <w:tcPr>
+            <w:tcW w:type="dxa" w:w="3600"/>
+            <w:tcBorders>
+              <w:top w:val="single" w:color="BFBFBF" w:sz="4"/>
+              <w:left w:val="single" w:color="BFBFBF" w:sz="4"/>
+              <w:bottom w:val="single" w:color="BFBFBF" w:sz="4"/>
+              <w:right w:val="single" w:color="BFBFBF" w:sz="4"/>
+            </w:tcBorders>
+            <w:tcMar>
+              <w:top w:type="dxa" w:w="40"/>
+              <w:left w:type="dxa" w:w="100"/>
+              <w:bottom w:type="dxa" w:w="40"/>
+              <w:right w:type="dxa" w:w="100"/>
+            </w:tcMar>
+          </w:tcPr>
+          <w:p>
+            <w:pPr>
+              <w:spacing w:after="0"/>
+            </w:pPr>
+            <w:r>
+              <w:rPr>
+                <w:rFonts w:ascii="TH Sarabun New" w:cs="TH Sarabun New" w:eastAsia="TH Sarabun New" w:hAnsi="TH Sarabun New"/>
+                <w:b w:val="false"/>
+                <w:bCs w:val="false"/>
+                <w:sz w:val="28"/>
+                <w:szCs w:val="28"/>
+              </w:rPr>
+              <w:t xml:space="preserve">พ่นหมอกโรงกล้วยไม้</w:t>
+            </w:r>
+          </w:p>
+        </w:tc>
+        <w:tc>
+          <w:tcPr>
+            <w:tcW w:type="dxa" w:w="3368"/>
+            <w:tcBorders>
+              <w:top w:val="single" w:color="BFBFBF" w:sz="4"/>
+              <w:left w:val="single" w:color="BFBFBF" w:sz="4"/>
+              <w:bottom w:val="single" w:color="BFBFBF" w:sz="4"/>
+              <w:right w:val="single" w:color="BFBFBF" w:sz="4"/>
+            </w:tcBorders>
+            <w:tcMar>
+              <w:top w:type="dxa" w:w="40"/>
+              <w:left w:type="dxa" w:w="100"/>
+              <w:bottom w:type="dxa" w:w="40"/>
+              <w:right w:type="dxa" w:w="100"/>
+            </w:tcMar>
+          </w:tcPr>
+          <w:p>
+            <w:pPr>
+              <w:spacing w:after="0"/>
+            </w:pPr>
+            <w:r>
+              <w:rPr>
+                <w:rFonts w:ascii="TH Sarabun New" w:cs="TH Sarabun New" w:eastAsia="TH Sarabun New" w:hAnsi="TH Sarabun New"/>
+                <w:b w:val="false"/>
+                <w:bCs w:val="false"/>
+                <w:sz w:val="28"/>
+                <w:szCs w:val="28"/>
+              </w:rPr>
+              <w:t xml:space="preserve">B · สั่งเครื่องจากมือถือ + กฎปลอดภัย</w:t>
+            </w:r>
+          </w:p>
+        </w:tc>
+        <w:tc>
+          <w:tcPr>
+            <w:tcW w:type="dxa" w:w="2500"/>
+            <w:tcBorders>
+              <w:top w:val="single" w:color="BFBFBF" w:sz="4"/>
+              <w:left w:val="single" w:color="BFBFBF" w:sz="4"/>
+              <w:bottom w:val="single" w:color="BFBFBF" w:sz="4"/>
+              <w:right w:val="single" w:color="BFBFBF" w:sz="4"/>
+            </w:tcBorders>
+            <w:tcMar>
+              <w:top w:type="dxa" w:w="40"/>
+              <w:left w:type="dxa" w:w="100"/>
+              <w:bottom w:type="dxa" w:w="40"/>
+              <w:right w:type="dxa" w:w="100"/>
+            </w:tcMar>
+          </w:tcPr>
+          <w:p>
+            <w:pPr>
+              <w:spacing w:after="0"/>
+            </w:pPr>
+            <w:r>
+              <w:rPr>
+                <w:rFonts w:ascii="TH Sarabun New" w:cs="TH Sarabun New" w:eastAsia="TH Sarabun New" w:hAnsi="TH Sarabun New"/>
+                <w:b w:val="false"/>
+                <w:bCs w:val="false"/>
+                <w:sz w:val="28"/>
+                <w:szCs w:val="28"/>
+              </w:rPr>
+              <w:t xml:space="preserve">idea_16 · idea_web.html?idea=16</w:t>
+            </w:r>
+          </w:p>
+        </w:tc>
+      </w:tr>
+      <w:tr>
+        <w:tc>
+          <w:tcPr>
+            <w:tcW w:type="dxa" w:w="900"/>
+            <w:tcBorders>
+              <w:top w:val="single" w:color="BFBFBF" w:sz="4"/>
+              <w:left w:val="single" w:color="BFBFBF" w:sz="4"/>
+              <w:bottom w:val="single" w:color="BFBFBF" w:sz="4"/>
+              <w:right w:val="single" w:color="BFBFBF" w:sz="4"/>
+            </w:tcBorders>
+            <w:tcMar>
+              <w:top w:type="dxa" w:w="40"/>
+              <w:left w:type="dxa" w:w="100"/>
+              <w:bottom w:type="dxa" w:w="40"/>
+              <w:right w:type="dxa" w:w="100"/>
+            </w:tcMar>
+          </w:tcPr>
+          <w:p>
+            <w:pPr>
+              <w:spacing w:after="0"/>
+            </w:pPr>
+            <w:r>
+              <w:rPr>
+                <w:rFonts w:ascii="TH Sarabun New" w:cs="TH Sarabun New" w:eastAsia="TH Sarabun New" w:hAnsi="TH Sarabun New"/>
+                <w:b w:val="false"/>
+                <w:bCs w:val="false"/>
+                <w:sz w:val="28"/>
+                <w:szCs w:val="28"/>
+              </w:rPr>
+              <w:t xml:space="preserve">17</w:t>
+            </w:r>
+          </w:p>
+        </w:tc>
+        <w:tc>
+          <w:tcPr>
+            <w:tcW w:type="dxa" w:w="3600"/>
+            <w:tcBorders>
+              <w:top w:val="single" w:color="BFBFBF" w:sz="4"/>
+              <w:left w:val="single" w:color="BFBFBF" w:sz="4"/>
+              <w:bottom w:val="single" w:color="BFBFBF" w:sz="4"/>
+              <w:right w:val="single" w:color="BFBFBF" w:sz="4"/>
+            </w:tcBorders>
+            <w:tcMar>
+              <w:top w:type="dxa" w:w="40"/>
+              <w:left w:type="dxa" w:w="100"/>
+              <w:bottom w:type="dxa" w:w="40"/>
+              <w:right w:type="dxa" w:w="100"/>
+            </w:tcMar>
+          </w:tcPr>
+          <w:p>
+            <w:pPr>
+              <w:spacing w:after="0"/>
+            </w:pPr>
+            <w:r>
+              <w:rPr>
+                <w:rFonts w:ascii="TH Sarabun New" w:cs="TH Sarabun New" w:eastAsia="TH Sarabun New" w:hAnsi="TH Sarabun New"/>
+                <w:b w:val="false"/>
+                <w:bCs w:val="false"/>
+                <w:sz w:val="28"/>
+                <w:szCs w:val="28"/>
+              </w:rPr>
+              <w:t xml:space="preserve">เติมอากาศบ่อปลา</w:t>
+            </w:r>
+          </w:p>
+        </w:tc>
+        <w:tc>
+          <w:tcPr>
+            <w:tcW w:type="dxa" w:w="3368"/>
+            <w:tcBorders>
+              <w:top w:val="single" w:color="BFBFBF" w:sz="4"/>
+              <w:left w:val="single" w:color="BFBFBF" w:sz="4"/>
+              <w:bottom w:val="single" w:color="BFBFBF" w:sz="4"/>
+              <w:right w:val="single" w:color="BFBFBF" w:sz="4"/>
+            </w:tcBorders>
+            <w:tcMar>
+              <w:top w:type="dxa" w:w="40"/>
+              <w:left w:type="dxa" w:w="100"/>
+              <w:bottom w:type="dxa" w:w="40"/>
+              <w:right w:type="dxa" w:w="100"/>
+            </w:tcMar>
+          </w:tcPr>
+          <w:p>
+            <w:pPr>
+              <w:spacing w:after="0"/>
+            </w:pPr>
+            <w:r>
+              <w:rPr>
+                <w:rFonts w:ascii="TH Sarabun New" w:cs="TH Sarabun New" w:eastAsia="TH Sarabun New" w:hAnsi="TH Sarabun New"/>
+                <w:b w:val="false"/>
+                <w:bCs w:val="false"/>
+                <w:sz w:val="28"/>
+                <w:szCs w:val="28"/>
+              </w:rPr>
+              <w:t xml:space="preserve">B · สั่งเครื่องจากมือถือ + กฎปลอดภัย</w:t>
+            </w:r>
+          </w:p>
+        </w:tc>
+        <w:tc>
+          <w:tcPr>
+            <w:tcW w:type="dxa" w:w="2500"/>
+            <w:tcBorders>
+              <w:top w:val="single" w:color="BFBFBF" w:sz="4"/>
+              <w:left w:val="single" w:color="BFBFBF" w:sz="4"/>
+              <w:bottom w:val="single" w:color="BFBFBF" w:sz="4"/>
+              <w:right w:val="single" w:color="BFBFBF" w:sz="4"/>
+            </w:tcBorders>
+            <w:tcMar>
+              <w:top w:type="dxa" w:w="40"/>
+              <w:left w:type="dxa" w:w="100"/>
+              <w:bottom w:type="dxa" w:w="40"/>
+              <w:right w:type="dxa" w:w="100"/>
+            </w:tcMar>
+          </w:tcPr>
+          <w:p>
+            <w:pPr>
+              <w:spacing w:after="0"/>
+            </w:pPr>
+            <w:r>
+              <w:rPr>
+                <w:rFonts w:ascii="TH Sarabun New" w:cs="TH Sarabun New" w:eastAsia="TH Sarabun New" w:hAnsi="TH Sarabun New"/>
+                <w:b w:val="false"/>
+                <w:bCs w:val="false"/>
+                <w:sz w:val="28"/>
+                <w:szCs w:val="28"/>
+              </w:rPr>
+              <w:t xml:space="preserve">idea_17 · idea_web.html?idea=17</w:t>
+            </w:r>
+          </w:p>
+        </w:tc>
+      </w:tr>
+      <w:tr>
+        <w:tc>
+          <w:tcPr>
+            <w:tcW w:type="dxa" w:w="900"/>
+            <w:tcBorders>
+              <w:top w:val="single" w:color="BFBFBF" w:sz="4"/>
+              <w:left w:val="single" w:color="BFBFBF" w:sz="4"/>
+              <w:bottom w:val="single" w:color="BFBFBF" w:sz="4"/>
+              <w:right w:val="single" w:color="BFBFBF" w:sz="4"/>
+            </w:tcBorders>
+            <w:tcMar>
+              <w:top w:type="dxa" w:w="40"/>
+              <w:left w:type="dxa" w:w="100"/>
+              <w:bottom w:type="dxa" w:w="40"/>
+              <w:right w:type="dxa" w:w="100"/>
+            </w:tcMar>
+          </w:tcPr>
+          <w:p>
+            <w:pPr>
+              <w:spacing w:after="0"/>
+            </w:pPr>
+            <w:r>
+              <w:rPr>
+                <w:rFonts w:ascii="TH Sarabun New" w:cs="TH Sarabun New" w:eastAsia="TH Sarabun New" w:hAnsi="TH Sarabun New"/>
+                <w:b w:val="false"/>
+                <w:bCs w:val="false"/>
+                <w:sz w:val="28"/>
+                <w:szCs w:val="28"/>
+              </w:rPr>
+              <w:t xml:space="preserve">18</w:t>
+            </w:r>
+          </w:p>
+        </w:tc>
+        <w:tc>
+          <w:tcPr>
+            <w:tcW w:type="dxa" w:w="3600"/>
+            <w:tcBorders>
+              <w:top w:val="single" w:color="BFBFBF" w:sz="4"/>
+              <w:left w:val="single" w:color="BFBFBF" w:sz="4"/>
+              <w:bottom w:val="single" w:color="BFBFBF" w:sz="4"/>
+              <w:right w:val="single" w:color="BFBFBF" w:sz="4"/>
+            </w:tcBorders>
+            <w:tcMar>
+              <w:top w:type="dxa" w:w="40"/>
+              <w:left w:type="dxa" w:w="100"/>
+              <w:bottom w:type="dxa" w:w="40"/>
+              <w:right w:type="dxa" w:w="100"/>
+            </w:tcMar>
+          </w:tcPr>
+          <w:p>
+            <w:pPr>
+              <w:spacing w:after="0"/>
+            </w:pPr>
+            <w:r>
+              <w:rPr>
+                <w:rFonts w:ascii="TH Sarabun New" w:cs="TH Sarabun New" w:eastAsia="TH Sarabun New" w:hAnsi="TH Sarabun New"/>
+                <w:b w:val="false"/>
+                <w:bCs w:val="false"/>
+                <w:sz w:val="28"/>
+                <w:szCs w:val="28"/>
+              </w:rPr>
+              <w:t xml:space="preserve">พัดลมเล้าไก่</w:t>
+            </w:r>
+          </w:p>
+        </w:tc>
+        <w:tc>
+          <w:tcPr>
+            <w:tcW w:type="dxa" w:w="3368"/>
+            <w:tcBorders>
+              <w:top w:val="single" w:color="BFBFBF" w:sz="4"/>
+              <w:left w:val="single" w:color="BFBFBF" w:sz="4"/>
+              <w:bottom w:val="single" w:color="BFBFBF" w:sz="4"/>
+              <w:right w:val="single" w:color="BFBFBF" w:sz="4"/>
+            </w:tcBorders>
+            <w:tcMar>
+              <w:top w:type="dxa" w:w="40"/>
+              <w:left w:type="dxa" w:w="100"/>
+              <w:bottom w:type="dxa" w:w="40"/>
+              <w:right w:type="dxa" w:w="100"/>
+            </w:tcMar>
+          </w:tcPr>
+          <w:p>
+            <w:pPr>
+              <w:spacing w:after="0"/>
+            </w:pPr>
+            <w:r>
+              <w:rPr>
+                <w:rFonts w:ascii="TH Sarabun New" w:cs="TH Sarabun New" w:eastAsia="TH Sarabun New" w:hAnsi="TH Sarabun New"/>
+                <w:b w:val="false"/>
+                <w:bCs w:val="false"/>
+                <w:sz w:val="28"/>
+                <w:szCs w:val="28"/>
+              </w:rPr>
+              <w:t xml:space="preserve">B · สั่งเครื่องจากมือถือ + กฎปลอดภัย</w:t>
+            </w:r>
+          </w:p>
+        </w:tc>
+        <w:tc>
+          <w:tcPr>
+            <w:tcW w:type="dxa" w:w="2500"/>
+            <w:tcBorders>
+              <w:top w:val="single" w:color="BFBFBF" w:sz="4"/>
+              <w:left w:val="single" w:color="BFBFBF" w:sz="4"/>
+              <w:bottom w:val="single" w:color="BFBFBF" w:sz="4"/>
+              <w:right w:val="single" w:color="BFBFBF" w:sz="4"/>
+            </w:tcBorders>
+            <w:tcMar>
+              <w:top w:type="dxa" w:w="40"/>
+              <w:left w:type="dxa" w:w="100"/>
+              <w:bottom w:type="dxa" w:w="40"/>
+              <w:right w:type="dxa" w:w="100"/>
+            </w:tcMar>
+          </w:tcPr>
+          <w:p>
+            <w:pPr>
+              <w:spacing w:after="0"/>
+            </w:pPr>
+            <w:r>
+              <w:rPr>
+                <w:rFonts w:ascii="TH Sarabun New" w:cs="TH Sarabun New" w:eastAsia="TH Sarabun New" w:hAnsi="TH Sarabun New"/>
+                <w:b w:val="false"/>
+                <w:bCs w:val="false"/>
+                <w:sz w:val="28"/>
+                <w:szCs w:val="28"/>
+              </w:rPr>
+              <w:t xml:space="preserve">idea_18 · idea_web.html?idea=18</w:t>
+            </w:r>
+          </w:p>
+        </w:tc>
+      </w:tr>
+      <w:tr>
+        <w:tc>
+          <w:tcPr>
+            <w:tcW w:type="dxa" w:w="900"/>
+            <w:tcBorders>
+              <w:top w:val="single" w:color="BFBFBF" w:sz="4"/>
+              <w:left w:val="single" w:color="BFBFBF" w:sz="4"/>
+              <w:bottom w:val="single" w:color="BFBFBF" w:sz="4"/>
+              <w:right w:val="single" w:color="BFBFBF" w:sz="4"/>
+            </w:tcBorders>
+            <w:tcMar>
+              <w:top w:type="dxa" w:w="40"/>
+              <w:left w:type="dxa" w:w="100"/>
+              <w:bottom w:type="dxa" w:w="40"/>
+              <w:right w:type="dxa" w:w="100"/>
+            </w:tcMar>
+          </w:tcPr>
+          <w:p>
+            <w:pPr>
+              <w:spacing w:after="0"/>
+            </w:pPr>
+            <w:r>
+              <w:rPr>
+                <w:rFonts w:ascii="TH Sarabun New" w:cs="TH Sarabun New" w:eastAsia="TH Sarabun New" w:hAnsi="TH Sarabun New"/>
+                <w:b w:val="false"/>
+                <w:bCs w:val="false"/>
+                <w:sz w:val="28"/>
+                <w:szCs w:val="28"/>
+              </w:rPr>
+              <w:t xml:space="preserve">19</w:t>
+            </w:r>
+          </w:p>
+        </w:tc>
+        <w:tc>
+          <w:tcPr>
+            <w:tcW w:type="dxa" w:w="3600"/>
+            <w:tcBorders>
+              <w:top w:val="single" w:color="BFBFBF" w:sz="4"/>
+              <w:left w:val="single" w:color="BFBFBF" w:sz="4"/>
+              <w:bottom w:val="single" w:color="BFBFBF" w:sz="4"/>
+              <w:right w:val="single" w:color="BFBFBF" w:sz="4"/>
+            </w:tcBorders>
+            <w:tcMar>
+              <w:top w:type="dxa" w:w="40"/>
+              <w:left w:type="dxa" w:w="100"/>
+              <w:bottom w:type="dxa" w:w="40"/>
+              <w:right w:type="dxa" w:w="100"/>
+            </w:tcMar>
+          </w:tcPr>
+          <w:p>
+            <w:pPr>
+              <w:spacing w:after="0"/>
+            </w:pPr>
+            <w:r>
+              <w:rPr>
+                <w:rFonts w:ascii="TH Sarabun New" w:cs="TH Sarabun New" w:eastAsia="TH Sarabun New" w:hAnsi="TH Sarabun New"/>
+                <w:b w:val="false"/>
+                <w:bCs w:val="false"/>
+                <w:sz w:val="28"/>
+                <w:szCs w:val="28"/>
+              </w:rPr>
+              <w:t xml:space="preserve">ประตูน้ำแปลงนา</w:t>
+            </w:r>
+          </w:p>
+        </w:tc>
+        <w:tc>
+          <w:tcPr>
+            <w:tcW w:type="dxa" w:w="3368"/>
+            <w:tcBorders>
+              <w:top w:val="single" w:color="BFBFBF" w:sz="4"/>
+              <w:left w:val="single" w:color="BFBFBF" w:sz="4"/>
+              <w:bottom w:val="single" w:color="BFBFBF" w:sz="4"/>
+              <w:right w:val="single" w:color="BFBFBF" w:sz="4"/>
+            </w:tcBorders>
+            <w:tcMar>
+              <w:top w:type="dxa" w:w="40"/>
+              <w:left w:type="dxa" w:w="100"/>
+              <w:bottom w:type="dxa" w:w="40"/>
+              <w:right w:type="dxa" w:w="100"/>
+            </w:tcMar>
+          </w:tcPr>
+          <w:p>
+            <w:pPr>
+              <w:spacing w:after="0"/>
+            </w:pPr>
+            <w:r>
+              <w:rPr>
+                <w:rFonts w:ascii="TH Sarabun New" w:cs="TH Sarabun New" w:eastAsia="TH Sarabun New" w:hAnsi="TH Sarabun New"/>
+                <w:b w:val="false"/>
+                <w:bCs w:val="false"/>
+                <w:sz w:val="28"/>
+                <w:szCs w:val="28"/>
+              </w:rPr>
+              <w:t xml:space="preserve">B · สั่งเครื่องจากมือถือ + กฎปลอดภัย</w:t>
+            </w:r>
+          </w:p>
+        </w:tc>
+        <w:tc>
+          <w:tcPr>
+            <w:tcW w:type="dxa" w:w="2500"/>
+            <w:tcBorders>
+              <w:top w:val="single" w:color="BFBFBF" w:sz="4"/>
+              <w:left w:val="single" w:color="BFBFBF" w:sz="4"/>
+              <w:bottom w:val="single" w:color="BFBFBF" w:sz="4"/>
+              <w:right w:val="single" w:color="BFBFBF" w:sz="4"/>
+            </w:tcBorders>
+            <w:tcMar>
+              <w:top w:type="dxa" w:w="40"/>
+              <w:left w:type="dxa" w:w="100"/>
+              <w:bottom w:type="dxa" w:w="40"/>
+              <w:right w:type="dxa" w:w="100"/>
+            </w:tcMar>
+          </w:tcPr>
+          <w:p>
+            <w:pPr>
+              <w:spacing w:after="0"/>
+            </w:pPr>
+            <w:r>
+              <w:rPr>
+                <w:rFonts w:ascii="TH Sarabun New" w:cs="TH Sarabun New" w:eastAsia="TH Sarabun New" w:hAnsi="TH Sarabun New"/>
+                <w:b w:val="false"/>
+                <w:bCs w:val="false"/>
+                <w:sz w:val="28"/>
+                <w:szCs w:val="28"/>
+              </w:rPr>
+              <w:t xml:space="preserve">idea_19 · idea_web.html?idea=19</w:t>
+            </w:r>
+          </w:p>
+        </w:tc>
+      </w:tr>
+      <w:tr>
+        <w:tc>
+          <w:tcPr>
+            <w:tcW w:type="dxa" w:w="900"/>
+            <w:tcBorders>
+              <w:top w:val="single" w:color="BFBFBF" w:sz="4"/>
+              <w:left w:val="single" w:color="BFBFBF" w:sz="4"/>
+              <w:bottom w:val="single" w:color="BFBFBF" w:sz="4"/>
+              <w:right w:val="single" w:color="BFBFBF" w:sz="4"/>
+            </w:tcBorders>
+            <w:tcMar>
+              <w:top w:type="dxa" w:w="40"/>
+              <w:left w:type="dxa" w:w="100"/>
+              <w:bottom w:type="dxa" w:w="40"/>
+              <w:right w:type="dxa" w:w="100"/>
+            </w:tcMar>
+          </w:tcPr>
+          <w:p>
+            <w:pPr>
+              <w:spacing w:after="0"/>
+            </w:pPr>
+            <w:r>
+              <w:rPr>
+                <w:rFonts w:ascii="TH Sarabun New" w:cs="TH Sarabun New" w:eastAsia="TH Sarabun New" w:hAnsi="TH Sarabun New"/>
+                <w:b w:val="false"/>
+                <w:bCs w:val="false"/>
+                <w:sz w:val="28"/>
+                <w:szCs w:val="28"/>
+              </w:rPr>
+              <w:t xml:space="preserve">20</w:t>
+            </w:r>
+          </w:p>
+        </w:tc>
+        <w:tc>
+          <w:tcPr>
+            <w:tcW w:type="dxa" w:w="3600"/>
+            <w:tcBorders>
+              <w:top w:val="single" w:color="BFBFBF" w:sz="4"/>
+              <w:left w:val="single" w:color="BFBFBF" w:sz="4"/>
+              <w:bottom w:val="single" w:color="BFBFBF" w:sz="4"/>
+              <w:right w:val="single" w:color="BFBFBF" w:sz="4"/>
+            </w:tcBorders>
+            <w:tcMar>
+              <w:top w:type="dxa" w:w="40"/>
+              <w:left w:type="dxa" w:w="100"/>
+              <w:bottom w:type="dxa" w:w="40"/>
+              <w:right w:type="dxa" w:w="100"/>
+            </w:tcMar>
+          </w:tcPr>
+          <w:p>
+            <w:pPr>
+              <w:spacing w:after="0"/>
+            </w:pPr>
+            <w:r>
+              <w:rPr>
+                <w:rFonts w:ascii="TH Sarabun New" w:cs="TH Sarabun New" w:eastAsia="TH Sarabun New" w:hAnsi="TH Sarabun New"/>
+                <w:b w:val="false"/>
+                <w:bCs w:val="false"/>
+                <w:sz w:val="28"/>
+                <w:szCs w:val="28"/>
+              </w:rPr>
+              <w:t xml:space="preserve">เครื่องให้อาหารปลา</w:t>
+            </w:r>
+          </w:p>
+        </w:tc>
+        <w:tc>
+          <w:tcPr>
+            <w:tcW w:type="dxa" w:w="3368"/>
+            <w:tcBorders>
+              <w:top w:val="single" w:color="BFBFBF" w:sz="4"/>
+              <w:left w:val="single" w:color="BFBFBF" w:sz="4"/>
+              <w:bottom w:val="single" w:color="BFBFBF" w:sz="4"/>
+              <w:right w:val="single" w:color="BFBFBF" w:sz="4"/>
+            </w:tcBorders>
+            <w:tcMar>
+              <w:top w:type="dxa" w:w="40"/>
+              <w:left w:type="dxa" w:w="100"/>
+              <w:bottom w:type="dxa" w:w="40"/>
+              <w:right w:type="dxa" w:w="100"/>
+            </w:tcMar>
+          </w:tcPr>
+          <w:p>
+            <w:pPr>
+              <w:spacing w:after="0"/>
+            </w:pPr>
+            <w:r>
+              <w:rPr>
+                <w:rFonts w:ascii="TH Sarabun New" w:cs="TH Sarabun New" w:eastAsia="TH Sarabun New" w:hAnsi="TH Sarabun New"/>
+                <w:b w:val="false"/>
+                <w:bCs w:val="false"/>
+                <w:sz w:val="28"/>
+                <w:szCs w:val="28"/>
+              </w:rPr>
+              <w:t xml:space="preserve">B · สั่งเครื่องจากมือถือ + กฎปลอดภัย</w:t>
+            </w:r>
+          </w:p>
+        </w:tc>
+        <w:tc>
+          <w:tcPr>
+            <w:tcW w:type="dxa" w:w="2500"/>
+            <w:tcBorders>
+              <w:top w:val="single" w:color="BFBFBF" w:sz="4"/>
+              <w:left w:val="single" w:color="BFBFBF" w:sz="4"/>
+              <w:bottom w:val="single" w:color="BFBFBF" w:sz="4"/>
+              <w:right w:val="single" w:color="BFBFBF" w:sz="4"/>
+            </w:tcBorders>
+            <w:tcMar>
+              <w:top w:type="dxa" w:w="40"/>
+              <w:left w:type="dxa" w:w="100"/>
+              <w:bottom w:type="dxa" w:w="40"/>
+              <w:right w:type="dxa" w:w="100"/>
+            </w:tcMar>
+          </w:tcPr>
+          <w:p>
+            <w:pPr>
+              <w:spacing w:after="0"/>
+            </w:pPr>
+            <w:r>
+              <w:rPr>
+                <w:rFonts w:ascii="TH Sarabun New" w:cs="TH Sarabun New" w:eastAsia="TH Sarabun New" w:hAnsi="TH Sarabun New"/>
+                <w:b w:val="false"/>
+                <w:bCs w:val="false"/>
+                <w:sz w:val="28"/>
+                <w:szCs w:val="28"/>
+              </w:rPr>
+              <w:t xml:space="preserve">idea_20 · idea_web.html?idea=20</w:t>
+            </w:r>
+          </w:p>
+        </w:tc>
+      </w:tr>
+      <w:tr>
+        <w:tc>
+          <w:tcPr>
+            <w:tcW w:type="dxa" w:w="900"/>
+            <w:tcBorders>
+              <w:top w:val="single" w:color="BFBFBF" w:sz="4"/>
+              <w:left w:val="single" w:color="BFBFBF" w:sz="4"/>
+              <w:bottom w:val="single" w:color="BFBFBF" w:sz="4"/>
+              <w:right w:val="single" w:color="BFBFBF" w:sz="4"/>
+            </w:tcBorders>
+            <w:tcMar>
+              <w:top w:type="dxa" w:w="40"/>
+              <w:left w:type="dxa" w:w="100"/>
+              <w:bottom w:type="dxa" w:w="40"/>
+              <w:right w:type="dxa" w:w="100"/>
+            </w:tcMar>
+          </w:tcPr>
+          <w:p>
+            <w:pPr>
+              <w:spacing w:after="0"/>
+            </w:pPr>
+            <w:r>
+              <w:rPr>
+                <w:rFonts w:ascii="TH Sarabun New" w:cs="TH Sarabun New" w:eastAsia="TH Sarabun New" w:hAnsi="TH Sarabun New"/>
+                <w:b w:val="false"/>
+                <w:bCs w:val="false"/>
+                <w:sz w:val="28"/>
+                <w:szCs w:val="28"/>
+              </w:rPr>
+              <w:t xml:space="preserve">7</w:t>
+            </w:r>
+          </w:p>
+        </w:tc>
+        <w:tc>
+          <w:tcPr>
+            <w:tcW w:type="dxa" w:w="3600"/>
+            <w:tcBorders>
+              <w:top w:val="single" w:color="BFBFBF" w:sz="4"/>
+              <w:left w:val="single" w:color="BFBFBF" w:sz="4"/>
+              <w:bottom w:val="single" w:color="BFBFBF" w:sz="4"/>
+              <w:right w:val="single" w:color="BFBFBF" w:sz="4"/>
+            </w:tcBorders>
+            <w:tcMar>
+              <w:top w:type="dxa" w:w="40"/>
+              <w:left w:type="dxa" w:w="100"/>
+              <w:bottom w:type="dxa" w:w="40"/>
+              <w:right w:type="dxa" w:w="100"/>
+            </w:tcMar>
+          </w:tcPr>
+          <w:p>
+            <w:pPr>
+              <w:spacing w:after="0"/>
+            </w:pPr>
+            <w:r>
+              <w:rPr>
+                <w:rFonts w:ascii="TH Sarabun New" w:cs="TH Sarabun New" w:eastAsia="TH Sarabun New" w:hAnsi="TH Sarabun New"/>
+                <w:b w:val="false"/>
+                <w:bCs w:val="false"/>
+                <w:sz w:val="28"/>
+                <w:szCs w:val="28"/>
+              </w:rPr>
+              <w:t xml:space="preserve">หมอฟังปั๊มน้ำ</w:t>
+            </w:r>
+          </w:p>
+        </w:tc>
+        <w:tc>
+          <w:tcPr>
+            <w:tcW w:type="dxa" w:w="3368"/>
+            <w:tcBorders>
+              <w:top w:val="single" w:color="BFBFBF" w:sz="4"/>
+              <w:left w:val="single" w:color="BFBFBF" w:sz="4"/>
+              <w:bottom w:val="single" w:color="BFBFBF" w:sz="4"/>
+              <w:right w:val="single" w:color="BFBFBF" w:sz="4"/>
+            </w:tcBorders>
+            <w:tcMar>
+              <w:top w:type="dxa" w:w="40"/>
+              <w:left w:type="dxa" w:w="100"/>
+              <w:bottom w:type="dxa" w:w="40"/>
+              <w:right w:type="dxa" w:w="100"/>
+            </w:tcMar>
+          </w:tcPr>
+          <w:p>
+            <w:pPr>
+              <w:spacing w:after="0"/>
+            </w:pPr>
+            <w:r>
+              <w:rPr>
+                <w:rFonts w:ascii="TH Sarabun New" w:cs="TH Sarabun New" w:eastAsia="TH Sarabun New" w:hAnsi="TH Sarabun New"/>
+                <w:b w:val="false"/>
+                <w:bCs w:val="false"/>
+                <w:sz w:val="28"/>
+                <w:szCs w:val="28"/>
+              </w:rPr>
+              <w:t xml:space="preserve">C · การสั่นผิดปกติ + หยุดเครื่อง</w:t>
+            </w:r>
+          </w:p>
+        </w:tc>
+        <w:tc>
+          <w:tcPr>
+            <w:tcW w:type="dxa" w:w="2500"/>
+            <w:tcBorders>
+              <w:top w:val="single" w:color="BFBFBF" w:sz="4"/>
+              <w:left w:val="single" w:color="BFBFBF" w:sz="4"/>
+              <w:bottom w:val="single" w:color="BFBFBF" w:sz="4"/>
+              <w:right w:val="single" w:color="BFBFBF" w:sz="4"/>
+            </w:tcBorders>
+            <w:tcMar>
+              <w:top w:type="dxa" w:w="40"/>
+              <w:left w:type="dxa" w:w="100"/>
+              <w:bottom w:type="dxa" w:w="40"/>
+              <w:right w:type="dxa" w:w="100"/>
+            </w:tcMar>
+          </w:tcPr>
+          <w:p>
+            <w:pPr>
+              <w:spacing w:after="0"/>
+            </w:pPr>
+            <w:r>
+              <w:rPr>
+                <w:rFonts w:ascii="TH Sarabun New" w:cs="TH Sarabun New" w:eastAsia="TH Sarabun New" w:hAnsi="TH Sarabun New"/>
+                <w:b w:val="false"/>
+                <w:bCs w:val="false"/>
+                <w:sz w:val="28"/>
+                <w:szCs w:val="28"/>
+              </w:rPr>
+              <w:t xml:space="preserve">idea_7 · idea_web.html?idea=7</w:t>
+            </w:r>
+          </w:p>
+        </w:tc>
+      </w:tr>
+      <w:tr>
+        <w:tc>
+          <w:tcPr>
+            <w:tcW w:type="dxa" w:w="900"/>
+            <w:tcBorders>
+              <w:top w:val="single" w:color="BFBFBF" w:sz="4"/>
+              <w:left w:val="single" w:color="BFBFBF" w:sz="4"/>
+              <w:bottom w:val="single" w:color="BFBFBF" w:sz="4"/>
+              <w:right w:val="single" w:color="BFBFBF" w:sz="4"/>
+            </w:tcBorders>
+            <w:tcMar>
+              <w:top w:type="dxa" w:w="40"/>
+              <w:left w:type="dxa" w:w="100"/>
+              <w:bottom w:type="dxa" w:w="40"/>
+              <w:right w:type="dxa" w:w="100"/>
+            </w:tcMar>
+          </w:tcPr>
+          <w:p>
+            <w:pPr>
+              <w:spacing w:after="0"/>
+            </w:pPr>
+            <w:r>
+              <w:rPr>
+                <w:rFonts w:ascii="TH Sarabun New" w:cs="TH Sarabun New" w:eastAsia="TH Sarabun New" w:hAnsi="TH Sarabun New"/>
+                <w:b w:val="false"/>
+                <w:bCs w:val="false"/>
+                <w:sz w:val="28"/>
+                <w:szCs w:val="28"/>
+              </w:rPr>
+              <w:t xml:space="preserve">21</w:t>
+            </w:r>
+          </w:p>
+        </w:tc>
+        <w:tc>
+          <w:tcPr>
+            <w:tcW w:type="dxa" w:w="3600"/>
+            <w:tcBorders>
+              <w:top w:val="single" w:color="BFBFBF" w:sz="4"/>
+              <w:left w:val="single" w:color="BFBFBF" w:sz="4"/>
+              <w:bottom w:val="single" w:color="BFBFBF" w:sz="4"/>
+              <w:right w:val="single" w:color="BFBFBF" w:sz="4"/>
+            </w:tcBorders>
+            <w:tcMar>
+              <w:top w:type="dxa" w:w="40"/>
+              <w:left w:type="dxa" w:w="100"/>
+              <w:bottom w:type="dxa" w:w="40"/>
+              <w:right w:type="dxa" w:w="100"/>
+            </w:tcMar>
+          </w:tcPr>
+          <w:p>
+            <w:pPr>
+              <w:spacing w:after="0"/>
+            </w:pPr>
+            <w:r>
+              <w:rPr>
+                <w:rFonts w:ascii="TH Sarabun New" w:cs="TH Sarabun New" w:eastAsia="TH Sarabun New" w:hAnsi="TH Sarabun New"/>
+                <w:b w:val="false"/>
+                <w:bCs w:val="false"/>
+                <w:sz w:val="28"/>
+                <w:szCs w:val="28"/>
+              </w:rPr>
+              <w:t xml:space="preserve">พัดลมโรงเรือนสั่นผิดปกติ</w:t>
+            </w:r>
+          </w:p>
+        </w:tc>
+        <w:tc>
+          <w:tcPr>
+            <w:tcW w:type="dxa" w:w="3368"/>
+            <w:tcBorders>
+              <w:top w:val="single" w:color="BFBFBF" w:sz="4"/>
+              <w:left w:val="single" w:color="BFBFBF" w:sz="4"/>
+              <w:bottom w:val="single" w:color="BFBFBF" w:sz="4"/>
+              <w:right w:val="single" w:color="BFBFBF" w:sz="4"/>
+            </w:tcBorders>
+            <w:tcMar>
+              <w:top w:type="dxa" w:w="40"/>
+              <w:left w:type="dxa" w:w="100"/>
+              <w:bottom w:type="dxa" w:w="40"/>
+              <w:right w:type="dxa" w:w="100"/>
+            </w:tcMar>
+          </w:tcPr>
+          <w:p>
+            <w:pPr>
+              <w:spacing w:after="0"/>
+            </w:pPr>
+            <w:r>
+              <w:rPr>
+                <w:rFonts w:ascii="TH Sarabun New" w:cs="TH Sarabun New" w:eastAsia="TH Sarabun New" w:hAnsi="TH Sarabun New"/>
+                <w:b w:val="false"/>
+                <w:bCs w:val="false"/>
+                <w:sz w:val="28"/>
+                <w:szCs w:val="28"/>
+              </w:rPr>
+              <w:t xml:space="preserve">C · การสั่นผิดปกติ + หยุดเครื่อง</w:t>
+            </w:r>
+          </w:p>
+        </w:tc>
+        <w:tc>
+          <w:tcPr>
+            <w:tcW w:type="dxa" w:w="2500"/>
+            <w:tcBorders>
+              <w:top w:val="single" w:color="BFBFBF" w:sz="4"/>
+              <w:left w:val="single" w:color="BFBFBF" w:sz="4"/>
+              <w:bottom w:val="single" w:color="BFBFBF" w:sz="4"/>
+              <w:right w:val="single" w:color="BFBFBF" w:sz="4"/>
+            </w:tcBorders>
+            <w:tcMar>
+              <w:top w:type="dxa" w:w="40"/>
+              <w:left w:type="dxa" w:w="100"/>
+              <w:bottom w:type="dxa" w:w="40"/>
+              <w:right w:type="dxa" w:w="100"/>
+            </w:tcMar>
+          </w:tcPr>
+          <w:p>
+            <w:pPr>
+              <w:spacing w:after="0"/>
+            </w:pPr>
+            <w:r>
+              <w:rPr>
+                <w:rFonts w:ascii="TH Sarabun New" w:cs="TH Sarabun New" w:eastAsia="TH Sarabun New" w:hAnsi="TH Sarabun New"/>
+                <w:b w:val="false"/>
+                <w:bCs w:val="false"/>
+                <w:sz w:val="28"/>
+                <w:szCs w:val="28"/>
+              </w:rPr>
+              <w:t xml:space="preserve">idea_21 · idea_web.html?idea=21</w:t>
+            </w:r>
+          </w:p>
+        </w:tc>
+      </w:tr>
+      <w:tr>
+        <w:tc>
+          <w:tcPr>
+            <w:tcW w:type="dxa" w:w="900"/>
+            <w:tcBorders>
+              <w:top w:val="single" w:color="BFBFBF" w:sz="4"/>
+              <w:left w:val="single" w:color="BFBFBF" w:sz="4"/>
+              <w:bottom w:val="single" w:color="BFBFBF" w:sz="4"/>
+              <w:right w:val="single" w:color="BFBFBF" w:sz="4"/>
+            </w:tcBorders>
+            <w:tcMar>
+              <w:top w:type="dxa" w:w="40"/>
+              <w:left w:type="dxa" w:w="100"/>
+              <w:bottom w:type="dxa" w:w="40"/>
+              <w:right w:type="dxa" w:w="100"/>
+            </w:tcMar>
+          </w:tcPr>
+          <w:p>
+            <w:pPr>
+              <w:spacing w:after="0"/>
+            </w:pPr>
+            <w:r>
+              <w:rPr>
+                <w:rFonts w:ascii="TH Sarabun New" w:cs="TH Sarabun New" w:eastAsia="TH Sarabun New" w:hAnsi="TH Sarabun New"/>
+                <w:b w:val="false"/>
+                <w:bCs w:val="false"/>
+                <w:sz w:val="28"/>
+                <w:szCs w:val="28"/>
+              </w:rPr>
+              <w:t xml:space="preserve">22</w:t>
+            </w:r>
+          </w:p>
+        </w:tc>
+        <w:tc>
+          <w:tcPr>
+            <w:tcW w:type="dxa" w:w="3600"/>
+            <w:tcBorders>
+              <w:top w:val="single" w:color="BFBFBF" w:sz="4"/>
+              <w:left w:val="single" w:color="BFBFBF" w:sz="4"/>
+              <w:bottom w:val="single" w:color="BFBFBF" w:sz="4"/>
+              <w:right w:val="single" w:color="BFBFBF" w:sz="4"/>
+            </w:tcBorders>
+            <w:tcMar>
+              <w:top w:type="dxa" w:w="40"/>
+              <w:left w:type="dxa" w:w="100"/>
+              <w:bottom w:type="dxa" w:w="40"/>
+              <w:right w:type="dxa" w:w="100"/>
+            </w:tcMar>
+          </w:tcPr>
+          <w:p>
+            <w:pPr>
+              <w:spacing w:after="0"/>
+            </w:pPr>
+            <w:r>
+              <w:rPr>
+                <w:rFonts w:ascii="TH Sarabun New" w:cs="TH Sarabun New" w:eastAsia="TH Sarabun New" w:hAnsi="TH Sarabun New"/>
+                <w:b w:val="false"/>
+                <w:bCs w:val="false"/>
+                <w:sz w:val="28"/>
+                <w:szCs w:val="28"/>
+              </w:rPr>
+              <w:t xml:space="preserve">เครื่องสีข้าวชุมชน</w:t>
+            </w:r>
+          </w:p>
+        </w:tc>
+        <w:tc>
+          <w:tcPr>
+            <w:tcW w:type="dxa" w:w="3368"/>
+            <w:tcBorders>
+              <w:top w:val="single" w:color="BFBFBF" w:sz="4"/>
+              <w:left w:val="single" w:color="BFBFBF" w:sz="4"/>
+              <w:bottom w:val="single" w:color="BFBFBF" w:sz="4"/>
+              <w:right w:val="single" w:color="BFBFBF" w:sz="4"/>
+            </w:tcBorders>
+            <w:tcMar>
+              <w:top w:type="dxa" w:w="40"/>
+              <w:left w:type="dxa" w:w="100"/>
+              <w:bottom w:type="dxa" w:w="40"/>
+              <w:right w:type="dxa" w:w="100"/>
+            </w:tcMar>
+          </w:tcPr>
+          <w:p>
+            <w:pPr>
+              <w:spacing w:after="0"/>
+            </w:pPr>
+            <w:r>
+              <w:rPr>
+                <w:rFonts w:ascii="TH Sarabun New" w:cs="TH Sarabun New" w:eastAsia="TH Sarabun New" w:hAnsi="TH Sarabun New"/>
+                <w:b w:val="false"/>
+                <w:bCs w:val="false"/>
+                <w:sz w:val="28"/>
+                <w:szCs w:val="28"/>
+              </w:rPr>
+              <w:t xml:space="preserve">C · การสั่นผิดปกติ + หยุดเครื่อง</w:t>
+            </w:r>
+          </w:p>
+        </w:tc>
+        <w:tc>
+          <w:tcPr>
+            <w:tcW w:type="dxa" w:w="2500"/>
+            <w:tcBorders>
+              <w:top w:val="single" w:color="BFBFBF" w:sz="4"/>
+              <w:left w:val="single" w:color="BFBFBF" w:sz="4"/>
+              <w:bottom w:val="single" w:color="BFBFBF" w:sz="4"/>
+              <w:right w:val="single" w:color="BFBFBF" w:sz="4"/>
+            </w:tcBorders>
+            <w:tcMar>
+              <w:top w:type="dxa" w:w="40"/>
+              <w:left w:type="dxa" w:w="100"/>
+              <w:bottom w:type="dxa" w:w="40"/>
+              <w:right w:type="dxa" w:w="100"/>
+            </w:tcMar>
+          </w:tcPr>
+          <w:p>
+            <w:pPr>
+              <w:spacing w:after="0"/>
+            </w:pPr>
+            <w:r>
+              <w:rPr>
+                <w:rFonts w:ascii="TH Sarabun New" w:cs="TH Sarabun New" w:eastAsia="TH Sarabun New" w:hAnsi="TH Sarabun New"/>
+                <w:b w:val="false"/>
+                <w:bCs w:val="false"/>
+                <w:sz w:val="28"/>
+                <w:szCs w:val="28"/>
+              </w:rPr>
+              <w:t xml:space="preserve">idea_22 · idea_web.html?idea=22</w:t>
+            </w:r>
+          </w:p>
+        </w:tc>
+      </w:tr>
+      <w:tr>
+        <w:tc>
+          <w:tcPr>
+            <w:tcW w:type="dxa" w:w="900"/>
+            <w:tcBorders>
+              <w:top w:val="single" w:color="BFBFBF" w:sz="4"/>
+              <w:left w:val="single" w:color="BFBFBF" w:sz="4"/>
+              <w:bottom w:val="single" w:color="BFBFBF" w:sz="4"/>
+              <w:right w:val="single" w:color="BFBFBF" w:sz="4"/>
+            </w:tcBorders>
+            <w:tcMar>
+              <w:top w:type="dxa" w:w="40"/>
+              <w:left w:type="dxa" w:w="100"/>
+              <w:bottom w:type="dxa" w:w="40"/>
+              <w:right w:type="dxa" w:w="100"/>
+            </w:tcMar>
+          </w:tcPr>
+          <w:p>
+            <w:pPr>
+              <w:spacing w:after="0"/>
+            </w:pPr>
+            <w:r>
+              <w:rPr>
+                <w:rFonts w:ascii="TH Sarabun New" w:cs="TH Sarabun New" w:eastAsia="TH Sarabun New" w:hAnsi="TH Sarabun New"/>
+                <w:b w:val="false"/>
+                <w:bCs w:val="false"/>
+                <w:sz w:val="28"/>
+                <w:szCs w:val="28"/>
+              </w:rPr>
+              <w:t xml:space="preserve">23</w:t>
+            </w:r>
+          </w:p>
+        </w:tc>
+        <w:tc>
+          <w:tcPr>
+            <w:tcW w:type="dxa" w:w="3600"/>
+            <w:tcBorders>
+              <w:top w:val="single" w:color="BFBFBF" w:sz="4"/>
+              <w:left w:val="single" w:color="BFBFBF" w:sz="4"/>
+              <w:bottom w:val="single" w:color="BFBFBF" w:sz="4"/>
+              <w:right w:val="single" w:color="BFBFBF" w:sz="4"/>
+            </w:tcBorders>
+            <w:tcMar>
+              <w:top w:type="dxa" w:w="40"/>
+              <w:left w:type="dxa" w:w="100"/>
+              <w:bottom w:type="dxa" w:w="40"/>
+              <w:right w:type="dxa" w:w="100"/>
+            </w:tcMar>
+          </w:tcPr>
+          <w:p>
+            <w:pPr>
+              <w:spacing w:after="0"/>
+            </w:pPr>
+            <w:r>
+              <w:rPr>
+                <w:rFonts w:ascii="TH Sarabun New" w:cs="TH Sarabun New" w:eastAsia="TH Sarabun New" w:hAnsi="TH Sarabun New"/>
+                <w:b w:val="false"/>
+                <w:bCs w:val="false"/>
+                <w:sz w:val="28"/>
+                <w:szCs w:val="28"/>
+              </w:rPr>
+              <w:t xml:space="preserve">ถาดไข่ระหว่างขนส่ง</w:t>
+            </w:r>
+          </w:p>
+        </w:tc>
+        <w:tc>
+          <w:tcPr>
+            <w:tcW w:type="dxa" w:w="3368"/>
+            <w:tcBorders>
+              <w:top w:val="single" w:color="BFBFBF" w:sz="4"/>
+              <w:left w:val="single" w:color="BFBFBF" w:sz="4"/>
+              <w:bottom w:val="single" w:color="BFBFBF" w:sz="4"/>
+              <w:right w:val="single" w:color="BFBFBF" w:sz="4"/>
+            </w:tcBorders>
+            <w:tcMar>
+              <w:top w:type="dxa" w:w="40"/>
+              <w:left w:type="dxa" w:w="100"/>
+              <w:bottom w:type="dxa" w:w="40"/>
+              <w:right w:type="dxa" w:w="100"/>
+            </w:tcMar>
+          </w:tcPr>
+          <w:p>
+            <w:pPr>
+              <w:spacing w:after="0"/>
+            </w:pPr>
+            <w:r>
+              <w:rPr>
+                <w:rFonts w:ascii="TH Sarabun New" w:cs="TH Sarabun New" w:eastAsia="TH Sarabun New" w:hAnsi="TH Sarabun New"/>
+                <w:b w:val="false"/>
+                <w:bCs w:val="false"/>
+                <w:sz w:val="28"/>
+                <w:szCs w:val="28"/>
+              </w:rPr>
+              <w:t xml:space="preserve">C · การสั่นผิดปกติ + หยุดเครื่อง</w:t>
+            </w:r>
+          </w:p>
+        </w:tc>
+        <w:tc>
+          <w:tcPr>
+            <w:tcW w:type="dxa" w:w="2500"/>
+            <w:tcBorders>
+              <w:top w:val="single" w:color="BFBFBF" w:sz="4"/>
+              <w:left w:val="single" w:color="BFBFBF" w:sz="4"/>
+              <w:bottom w:val="single" w:color="BFBFBF" w:sz="4"/>
+              <w:right w:val="single" w:color="BFBFBF" w:sz="4"/>
+            </w:tcBorders>
+            <w:tcMar>
+              <w:top w:type="dxa" w:w="40"/>
+              <w:left w:type="dxa" w:w="100"/>
+              <w:bottom w:type="dxa" w:w="40"/>
+              <w:right w:type="dxa" w:w="100"/>
+            </w:tcMar>
+          </w:tcPr>
+          <w:p>
+            <w:pPr>
+              <w:spacing w:after="0"/>
+            </w:pPr>
+            <w:r>
+              <w:rPr>
+                <w:rFonts w:ascii="TH Sarabun New" w:cs="TH Sarabun New" w:eastAsia="TH Sarabun New" w:hAnsi="TH Sarabun New"/>
+                <w:b w:val="false"/>
+                <w:bCs w:val="false"/>
+                <w:sz w:val="28"/>
+                <w:szCs w:val="28"/>
+              </w:rPr>
+              <w:t xml:space="preserve">idea_23 · idea_web.html?idea=23</w:t>
+            </w:r>
+          </w:p>
+        </w:tc>
+      </w:tr>
+      <w:tr>
+        <w:tc>
+          <w:tcPr>
+            <w:tcW w:type="dxa" w:w="900"/>
+            <w:tcBorders>
+              <w:top w:val="single" w:color="BFBFBF" w:sz="4"/>
+              <w:left w:val="single" w:color="BFBFBF" w:sz="4"/>
+              <w:bottom w:val="single" w:color="BFBFBF" w:sz="4"/>
+              <w:right w:val="single" w:color="BFBFBF" w:sz="4"/>
+            </w:tcBorders>
+            <w:tcMar>
+              <w:top w:type="dxa" w:w="40"/>
+              <w:left w:type="dxa" w:w="100"/>
+              <w:bottom w:type="dxa" w:w="40"/>
+              <w:right w:type="dxa" w:w="100"/>
+            </w:tcMar>
+          </w:tcPr>
+          <w:p>
+            <w:pPr>
+              <w:spacing w:after="0"/>
+            </w:pPr>
+            <w:r>
+              <w:rPr>
+                <w:rFonts w:ascii="TH Sarabun New" w:cs="TH Sarabun New" w:eastAsia="TH Sarabun New" w:hAnsi="TH Sarabun New"/>
+                <w:b w:val="false"/>
+                <w:bCs w:val="false"/>
+                <w:sz w:val="28"/>
+                <w:szCs w:val="28"/>
+              </w:rPr>
+              <w:t xml:space="preserve">24</w:t>
+            </w:r>
+          </w:p>
+        </w:tc>
+        <w:tc>
+          <w:tcPr>
+            <w:tcW w:type="dxa" w:w="3600"/>
+            <w:tcBorders>
+              <w:top w:val="single" w:color="BFBFBF" w:sz="4"/>
+              <w:left w:val="single" w:color="BFBFBF" w:sz="4"/>
+              <w:bottom w:val="single" w:color="BFBFBF" w:sz="4"/>
+              <w:right w:val="single" w:color="BFBFBF" w:sz="4"/>
+            </w:tcBorders>
+            <w:tcMar>
+              <w:top w:type="dxa" w:w="40"/>
+              <w:left w:type="dxa" w:w="100"/>
+              <w:bottom w:type="dxa" w:w="40"/>
+              <w:right w:type="dxa" w:w="100"/>
+            </w:tcMar>
+          </w:tcPr>
+          <w:p>
+            <w:pPr>
+              <w:spacing w:after="0"/>
+            </w:pPr>
+            <w:r>
+              <w:rPr>
+                <w:rFonts w:ascii="TH Sarabun New" w:cs="TH Sarabun New" w:eastAsia="TH Sarabun New" w:hAnsi="TH Sarabun New"/>
+                <w:b w:val="false"/>
+                <w:bCs w:val="false"/>
+                <w:sz w:val="28"/>
+                <w:szCs w:val="28"/>
+              </w:rPr>
+              <w:t xml:space="preserve">ลังผลไม้บนรถกระบะ</w:t>
+            </w:r>
+          </w:p>
+        </w:tc>
+        <w:tc>
+          <w:tcPr>
+            <w:tcW w:type="dxa" w:w="3368"/>
+            <w:tcBorders>
+              <w:top w:val="single" w:color="BFBFBF" w:sz="4"/>
+              <w:left w:val="single" w:color="BFBFBF" w:sz="4"/>
+              <w:bottom w:val="single" w:color="BFBFBF" w:sz="4"/>
+              <w:right w:val="single" w:color="BFBFBF" w:sz="4"/>
+            </w:tcBorders>
+            <w:tcMar>
+              <w:top w:type="dxa" w:w="40"/>
+              <w:left w:type="dxa" w:w="100"/>
+              <w:bottom w:type="dxa" w:w="40"/>
+              <w:right w:type="dxa" w:w="100"/>
+            </w:tcMar>
+          </w:tcPr>
+          <w:p>
+            <w:pPr>
+              <w:spacing w:after="0"/>
+            </w:pPr>
+            <w:r>
+              <w:rPr>
+                <w:rFonts w:ascii="TH Sarabun New" w:cs="TH Sarabun New" w:eastAsia="TH Sarabun New" w:hAnsi="TH Sarabun New"/>
+                <w:b w:val="false"/>
+                <w:bCs w:val="false"/>
+                <w:sz w:val="28"/>
+                <w:szCs w:val="28"/>
+              </w:rPr>
+              <w:t xml:space="preserve">C · การสั่นผิดปกติ + หยุดเครื่อง</w:t>
+            </w:r>
+          </w:p>
+        </w:tc>
+        <w:tc>
+          <w:tcPr>
+            <w:tcW w:type="dxa" w:w="2500"/>
+            <w:tcBorders>
+              <w:top w:val="single" w:color="BFBFBF" w:sz="4"/>
+              <w:left w:val="single" w:color="BFBFBF" w:sz="4"/>
+              <w:bottom w:val="single" w:color="BFBFBF" w:sz="4"/>
+              <w:right w:val="single" w:color="BFBFBF" w:sz="4"/>
+            </w:tcBorders>
+            <w:tcMar>
+              <w:top w:type="dxa" w:w="40"/>
+              <w:left w:type="dxa" w:w="100"/>
+              <w:bottom w:type="dxa" w:w="40"/>
+              <w:right w:type="dxa" w:w="100"/>
+            </w:tcMar>
+          </w:tcPr>
+          <w:p>
+            <w:pPr>
+              <w:spacing w:after="0"/>
+            </w:pPr>
+            <w:r>
+              <w:rPr>
+                <w:rFonts w:ascii="TH Sarabun New" w:cs="TH Sarabun New" w:eastAsia="TH Sarabun New" w:hAnsi="TH Sarabun New"/>
+                <w:b w:val="false"/>
+                <w:bCs w:val="false"/>
+                <w:sz w:val="28"/>
+                <w:szCs w:val="28"/>
+              </w:rPr>
+              <w:t xml:space="preserve">idea_24 · idea_web.html?idea=24</w:t>
+            </w:r>
+          </w:p>
+        </w:tc>
+      </w:tr>
+      <w:tr>
+        <w:tc>
+          <w:tcPr>
+            <w:tcW w:type="dxa" w:w="900"/>
+            <w:tcBorders>
+              <w:top w:val="single" w:color="BFBFBF" w:sz="4"/>
+              <w:left w:val="single" w:color="BFBFBF" w:sz="4"/>
+              <w:bottom w:val="single" w:color="BFBFBF" w:sz="4"/>
+              <w:right w:val="single" w:color="BFBFBF" w:sz="4"/>
+            </w:tcBorders>
+            <w:tcMar>
+              <w:top w:type="dxa" w:w="40"/>
+              <w:left w:type="dxa" w:w="100"/>
+              <w:bottom w:type="dxa" w:w="40"/>
+              <w:right w:type="dxa" w:w="100"/>
+            </w:tcMar>
+          </w:tcPr>
+          <w:p>
+            <w:pPr>
+              <w:spacing w:after="0"/>
+            </w:pPr>
+            <w:r>
+              <w:rPr>
+                <w:rFonts w:ascii="TH Sarabun New" w:cs="TH Sarabun New" w:eastAsia="TH Sarabun New" w:hAnsi="TH Sarabun New"/>
+                <w:b w:val="false"/>
+                <w:bCs w:val="false"/>
+                <w:sz w:val="28"/>
+                <w:szCs w:val="28"/>
+              </w:rPr>
+              <w:t xml:space="preserve">5</w:t>
+            </w:r>
+          </w:p>
+        </w:tc>
+        <w:tc>
+          <w:tcPr>
+            <w:tcW w:type="dxa" w:w="3600"/>
+            <w:tcBorders>
+              <w:top w:val="single" w:color="BFBFBF" w:sz="4"/>
+              <w:left w:val="single" w:color="BFBFBF" w:sz="4"/>
+              <w:bottom w:val="single" w:color="BFBFBF" w:sz="4"/>
+              <w:right w:val="single" w:color="BFBFBF" w:sz="4"/>
+            </w:tcBorders>
+            <w:tcMar>
+              <w:top w:type="dxa" w:w="40"/>
+              <w:left w:type="dxa" w:w="100"/>
+              <w:bottom w:type="dxa" w:w="40"/>
+              <w:right w:type="dxa" w:w="100"/>
+            </w:tcMar>
+          </w:tcPr>
+          <w:p>
+            <w:pPr>
+              <w:spacing w:after="0"/>
+            </w:pPr>
+            <w:r>
+              <w:rPr>
+                <w:rFonts w:ascii="TH Sarabun New" w:cs="TH Sarabun New" w:eastAsia="TH Sarabun New" w:hAnsi="TH Sarabun New"/>
+                <w:b w:val="false"/>
+                <w:bCs w:val="false"/>
+                <w:sz w:val="28"/>
+                <w:szCs w:val="28"/>
+              </w:rPr>
+              <w:t xml:space="preserve">คอกปศุสัตว์กลางคืน</w:t>
+            </w:r>
+          </w:p>
+        </w:tc>
+        <w:tc>
+          <w:tcPr>
+            <w:tcW w:type="dxa" w:w="3368"/>
+            <w:tcBorders>
+              <w:top w:val="single" w:color="BFBFBF" w:sz="4"/>
+              <w:left w:val="single" w:color="BFBFBF" w:sz="4"/>
+              <w:bottom w:val="single" w:color="BFBFBF" w:sz="4"/>
+              <w:right w:val="single" w:color="BFBFBF" w:sz="4"/>
+            </w:tcBorders>
+            <w:tcMar>
+              <w:top w:type="dxa" w:w="40"/>
+              <w:left w:type="dxa" w:w="100"/>
+              <w:bottom w:type="dxa" w:w="40"/>
+              <w:right w:type="dxa" w:w="100"/>
+            </w:tcMar>
+          </w:tcPr>
+          <w:p>
+            <w:pPr>
+              <w:spacing w:after="0"/>
+            </w:pPr>
+            <w:r>
+              <w:rPr>
+                <w:rFonts w:ascii="TH Sarabun New" w:cs="TH Sarabun New" w:eastAsia="TH Sarabun New" w:hAnsi="TH Sarabun New"/>
+                <w:b w:val="false"/>
+                <w:bCs w:val="false"/>
+                <w:sz w:val="28"/>
+                <w:szCs w:val="28"/>
+              </w:rPr>
+              <w:t xml:space="preserve">D · เรดาร์จับผู้บุกรุก</w:t>
+            </w:r>
+          </w:p>
+        </w:tc>
+        <w:tc>
+          <w:tcPr>
+            <w:tcW w:type="dxa" w:w="2500"/>
+            <w:tcBorders>
+              <w:top w:val="single" w:color="BFBFBF" w:sz="4"/>
+              <w:left w:val="single" w:color="BFBFBF" w:sz="4"/>
+              <w:bottom w:val="single" w:color="BFBFBF" w:sz="4"/>
+              <w:right w:val="single" w:color="BFBFBF" w:sz="4"/>
+            </w:tcBorders>
+            <w:tcMar>
+              <w:top w:type="dxa" w:w="40"/>
+              <w:left w:type="dxa" w:w="100"/>
+              <w:bottom w:type="dxa" w:w="40"/>
+              <w:right w:type="dxa" w:w="100"/>
+            </w:tcMar>
+          </w:tcPr>
+          <w:p>
+            <w:pPr>
+              <w:spacing w:after="0"/>
+            </w:pPr>
+            <w:r>
+              <w:rPr>
+                <w:rFonts w:ascii="TH Sarabun New" w:cs="TH Sarabun New" w:eastAsia="TH Sarabun New" w:hAnsi="TH Sarabun New"/>
+                <w:b w:val="false"/>
+                <w:bCs w:val="false"/>
+                <w:sz w:val="28"/>
+                <w:szCs w:val="28"/>
+              </w:rPr>
+              <w:t xml:space="preserve">idea_5 · idea_web.html?idea=5</w:t>
+            </w:r>
+          </w:p>
+        </w:tc>
+      </w:tr>
+      <w:tr>
+        <w:tc>
+          <w:tcPr>
+            <w:tcW w:type="dxa" w:w="900"/>
+            <w:tcBorders>
+              <w:top w:val="single" w:color="BFBFBF" w:sz="4"/>
+              <w:left w:val="single" w:color="BFBFBF" w:sz="4"/>
+              <w:bottom w:val="single" w:color="BFBFBF" w:sz="4"/>
+              <w:right w:val="single" w:color="BFBFBF" w:sz="4"/>
+            </w:tcBorders>
+            <w:tcMar>
+              <w:top w:type="dxa" w:w="40"/>
+              <w:left w:type="dxa" w:w="100"/>
+              <w:bottom w:type="dxa" w:w="40"/>
+              <w:right w:type="dxa" w:w="100"/>
+            </w:tcMar>
+          </w:tcPr>
+          <w:p>
+            <w:pPr>
+              <w:spacing w:after="0"/>
+            </w:pPr>
+            <w:r>
+              <w:rPr>
+                <w:rFonts w:ascii="TH Sarabun New" w:cs="TH Sarabun New" w:eastAsia="TH Sarabun New" w:hAnsi="TH Sarabun New"/>
+                <w:b w:val="false"/>
+                <w:bCs w:val="false"/>
+                <w:sz w:val="28"/>
+                <w:szCs w:val="28"/>
+              </w:rPr>
+              <w:t xml:space="preserve">25</w:t>
+            </w:r>
+          </w:p>
+        </w:tc>
+        <w:tc>
+          <w:tcPr>
+            <w:tcW w:type="dxa" w:w="3600"/>
+            <w:tcBorders>
+              <w:top w:val="single" w:color="BFBFBF" w:sz="4"/>
+              <w:left w:val="single" w:color="BFBFBF" w:sz="4"/>
+              <w:bottom w:val="single" w:color="BFBFBF" w:sz="4"/>
+              <w:right w:val="single" w:color="BFBFBF" w:sz="4"/>
+            </w:tcBorders>
+            <w:tcMar>
+              <w:top w:type="dxa" w:w="40"/>
+              <w:left w:type="dxa" w:w="100"/>
+              <w:bottom w:type="dxa" w:w="40"/>
+              <w:right w:type="dxa" w:w="100"/>
+            </w:tcMar>
+          </w:tcPr>
+          <w:p>
+            <w:pPr>
+              <w:spacing w:after="0"/>
+            </w:pPr>
+            <w:r>
+              <w:rPr>
+                <w:rFonts w:ascii="TH Sarabun New" w:cs="TH Sarabun New" w:eastAsia="TH Sarabun New" w:hAnsi="TH Sarabun New"/>
+                <w:b w:val="false"/>
+                <w:bCs w:val="false"/>
+                <w:sz w:val="28"/>
+                <w:szCs w:val="28"/>
+              </w:rPr>
+              <w:t xml:space="preserve">ประตูโกดังกันขโมย</w:t>
+            </w:r>
+          </w:p>
+        </w:tc>
+        <w:tc>
+          <w:tcPr>
+            <w:tcW w:type="dxa" w:w="3368"/>
+            <w:tcBorders>
+              <w:top w:val="single" w:color="BFBFBF" w:sz="4"/>
+              <w:left w:val="single" w:color="BFBFBF" w:sz="4"/>
+              <w:bottom w:val="single" w:color="BFBFBF" w:sz="4"/>
+              <w:right w:val="single" w:color="BFBFBF" w:sz="4"/>
+            </w:tcBorders>
+            <w:tcMar>
+              <w:top w:type="dxa" w:w="40"/>
+              <w:left w:type="dxa" w:w="100"/>
+              <w:bottom w:type="dxa" w:w="40"/>
+              <w:right w:type="dxa" w:w="100"/>
+            </w:tcMar>
+          </w:tcPr>
+          <w:p>
+            <w:pPr>
+              <w:spacing w:after="0"/>
+            </w:pPr>
+            <w:r>
+              <w:rPr>
+                <w:rFonts w:ascii="TH Sarabun New" w:cs="TH Sarabun New" w:eastAsia="TH Sarabun New" w:hAnsi="TH Sarabun New"/>
+                <w:b w:val="false"/>
+                <w:bCs w:val="false"/>
+                <w:sz w:val="28"/>
+                <w:szCs w:val="28"/>
+              </w:rPr>
+              <w:t xml:space="preserve">D · เรดาร์จับผู้บุกรุก</w:t>
+            </w:r>
+          </w:p>
+        </w:tc>
+        <w:tc>
+          <w:tcPr>
+            <w:tcW w:type="dxa" w:w="2500"/>
+            <w:tcBorders>
+              <w:top w:val="single" w:color="BFBFBF" w:sz="4"/>
+              <w:left w:val="single" w:color="BFBFBF" w:sz="4"/>
+              <w:bottom w:val="single" w:color="BFBFBF" w:sz="4"/>
+              <w:right w:val="single" w:color="BFBFBF" w:sz="4"/>
+            </w:tcBorders>
+            <w:tcMar>
+              <w:top w:type="dxa" w:w="40"/>
+              <w:left w:type="dxa" w:w="100"/>
+              <w:bottom w:type="dxa" w:w="40"/>
+              <w:right w:type="dxa" w:w="100"/>
+            </w:tcMar>
+          </w:tcPr>
+          <w:p>
+            <w:pPr>
+              <w:spacing w:after="0"/>
+            </w:pPr>
+            <w:r>
+              <w:rPr>
+                <w:rFonts w:ascii="TH Sarabun New" w:cs="TH Sarabun New" w:eastAsia="TH Sarabun New" w:hAnsi="TH Sarabun New"/>
+                <w:b w:val="false"/>
+                <w:bCs w:val="false"/>
+                <w:sz w:val="28"/>
+                <w:szCs w:val="28"/>
+              </w:rPr>
+              <w:t xml:space="preserve">idea_25 · idea_web.html?idea=25</w:t>
             </w:r>
           </w:p>
         </w:tc>
@@ -1873,7 +4110,7 @@
           <w:sz w:val="24"/>
           <w:szCs w:val="24"/>
         </w:rPr>
-        <w:t xml:space="preserve">ค่าเกณฑ์ในชุดเริ่มต้นเป็นค่าสาธิตในห้องเรียน ทีมต้องตั้งเกณฑ์ใหม่ตามเรื่องของทีม · ไอเดีย 5 ใช้เรดาร์ เหมาะกับกลุ่มที่พร้อม</w:t>
+        <w:t xml:space="preserve">ค่าเกณฑ์ในโค้ดเริ่มต้นเป็นค่าสาธิตในห้องเรียน · ค่าที่มาจากลูกบิดเป็นค่าจำลอง ต้องบอกในการนำเสนอ · เรื่อง 5 และ 25 ใช้เรดาร์ เหมาะกับกลุ่มที่พร้อม</w:t>
       </w:r>
     </w:p>
     <w:p>
@@ -1889,7 +4126,7 @@
           <w:sz w:val="40"/>
           <w:szCs w:val="40"/>
         </w:rPr>
-        <w:t xml:space="preserve">2. กติกา: โจทย์ต้องไม่ซ้ำกัน</w:t>
+        <w:t xml:space="preserve">2. กติกา: เรื่องละ 1 ทีม</w:t>
       </w:r>
     </w:p>
     <w:p>
@@ -1907,7 +4144,7 @@
           <w:sz w:val="30"/>
           <w:szCs w:val="30"/>
         </w:rPr>
-        <w:t xml:space="preserve">แต่ละไอเดียมีได้ </w:t>
+        <w:t xml:space="preserve">22 กลุ่ม เลือกจาก 25 เรื่อง </w:t>
       </w:r>
       <w:r>
         <w:rPr>
@@ -1917,7 +4154,7 @@
           <w:sz w:val="30"/>
           <w:szCs w:val="30"/>
         </w:rPr>
-        <w:t xml:space="preserve">ไม่เกิน 3 ทีม</w:t>
+        <w:t xml:space="preserve">เรื่องละ 1 ทีม</w:t>
       </w:r>
       <w:r>
         <w:rPr>
@@ -1925,7 +4162,25 @@
           <w:sz w:val="30"/>
           <w:szCs w:val="30"/>
         </w:rPr>
-        <w:t xml:space="preserve"> · ลงชื่อบนกระดานรวมในคาบเสนอหัวข้อ ใครลงก่อนได้ก่อน</w:t>
+        <w:t xml:space="preserve"> · เลือกผ่านหน้า </w:t>
+      </w:r>
+      <w:r>
+        <w:rPr>
+          <w:rFonts w:ascii="TH Sarabun New" w:cs="TH Sarabun New" w:eastAsia="TH Sarabun New" w:hAnsi="TH Sarabun New"/>
+          <w:b/>
+          <w:bCs/>
+          <w:sz w:val="30"/>
+          <w:szCs w:val="30"/>
+        </w:rPr>
+        <w:t xml:space="preserve">signup.html</w:t>
+      </w:r>
+      <w:r>
+        <w:rPr>
+          <w:rFonts w:ascii="TH Sarabun New" w:cs="TH Sarabun New" w:eastAsia="TH Sarabun New" w:hAnsi="TH Sarabun New"/>
+          <w:sz w:val="30"/>
+          <w:szCs w:val="30"/>
+        </w:rPr>
+        <w:t xml:space="preserve"> (ใครกดก่อนได้ก่อน เห็นผลทันทีทุกเครื่อง)</w:t>
       </w:r>
     </w:p>
     <w:p>
@@ -1943,25 +4198,7 @@
           <w:sz w:val="30"/>
           <w:szCs w:val="30"/>
         </w:rPr>
-        <w:t xml:space="preserve">ทีมที่เลือกไอเดียเดียวกัน ต้องมี </w:t>
-      </w:r>
-      <w:r>
-        <w:rPr>
-          <w:rFonts w:ascii="TH Sarabun New" w:cs="TH Sarabun New" w:eastAsia="TH Sarabun New" w:hAnsi="TH Sarabun New"/>
-          <w:b/>
-          <w:bCs/>
-          <w:sz w:val="30"/>
-          <w:szCs w:val="30"/>
-        </w:rPr>
-        <w:t xml:space="preserve">ผู้ใช้หรือสถานที่คนละแบบ</w:t>
-      </w:r>
-      <w:r>
-        <w:rPr>
-          <w:rFonts w:ascii="TH Sarabun New" w:cs="TH Sarabun New" w:eastAsia="TH Sarabun New" w:hAnsi="TH Sarabun New"/>
-          <w:sz w:val="30"/>
-          <w:szCs w:val="30"/>
-        </w:rPr>
-        <w:t xml:space="preserve"> เช่น ไอเดีย 3: ไซโลข้าวเปลือก · ไซโลเมล็ดพันธุ์ · โกดังข้าวสาร</w:t>
+        <w:t xml:space="preserve">อยากทำเรื่องของตัวเองนอกรายการก็ได้ โดยเลือกชุดเริ่มต้น A · B · C หรือ D ที่ใกล้ที่สุดไปเริ่ม แล้วแจ้งผู้สอน</w:t>
       </w:r>
     </w:p>
     <w:p>
@@ -1989,7 +4226,7 @@
           <w:sz w:val="30"/>
           <w:szCs w:val="30"/>
         </w:rPr>
-        <w:t xml:space="preserve">ส่วนไหนมาจากชุดเริ่มต้น และส่วนไหนทีมทำเอง</w:t>
+        <w:t xml:space="preserve">ส่วนไหนมาจากโค้ดเริ่มต้น และส่วนไหนทีมทำเอง</w:t>
       </w:r>
       <w:r>
         <w:rPr>
@@ -1998,6 +4235,21 @@
           <w:szCs w:val="30"/>
         </w:rPr>
         <w:t xml:space="preserve"> (เขียนในหัวไฟล์ด้วย)</w:t>
+      </w:r>
+    </w:p>
+    <w:p>
+      <w:pPr>
+        <w:spacing w:before="60"/>
+      </w:pPr>
+      <w:r>
+        <w:rPr>
+          <w:rFonts w:ascii="TH Sarabun New" w:cs="TH Sarabun New" w:eastAsia="TH Sarabun New" w:hAnsi="TH Sarabun New"/>
+          <w:i/>
+          <w:iCs/>
+          <w:sz w:val="24"/>
+          <w:szCs w:val="24"/>
+        </w:rPr>
+        <w:t xml:space="preserve">ตัวอย่าง Edge AI 3 ตัวใน project/ai_future/ เป็นแนวทางในอนาคตเท่านั้น ไม่อยู่ในโจทย์รุ่นนี้</w:t>
       </w:r>
     </w:p>
     <w:p>
@@ -2665,7 +4917,7 @@
                 <w:sz w:val="28"/>
                 <w:szCs w:val="28"/>
               </w:rPr>
-              <w:t xml:space="preserve">รันไฟล์บอร์ดของไอเดียบนบอร์ดจริง</w:t>
+              <w:t xml:space="preserve">รันไฟล์บอร์ดของเรื่องบนบอร์ดจริง</w:t>
             </w:r>
           </w:p>
         </w:tc>
@@ -2917,7 +5169,7 @@
           <w:sz w:val="40"/>
           <w:szCs w:val="40"/>
         </w:rPr>
-        <w:t xml:space="preserve">5. ฝั่งบอร์ด: แก้จากไฟล์ของไอเดีย (ไม่ต้องเขียน HMI ใหม่)</w:t>
+        <w:t xml:space="preserve">5. ฝั่งบอร์ด: แก้จากไฟล์ของเรื่อง (ไม่ต้องเขียน HMI ใหม่)</w:t>
       </w:r>
     </w:p>
     <w:p>
@@ -2938,7 +5190,7 @@
           <w:sz w:val="30"/>
           <w:szCs w:val="30"/>
         </w:rPr>
-        <w:t xml:space="preserve">คัดลอกไฟล์ของไอเดียเป็น g&lt;เลขทีม&gt;_&lt;ชื่อโปรเจกต์&gt;.py</w:t>
+        <w:t xml:space="preserve">คัดลอกไฟล์ของเรื่องเป็น g&lt;เลขทีม&gt;_&lt;ชื่อโปรเจกต์&gt;.py</w:t>
       </w:r>
     </w:p>
     <w:p>
@@ -4125,7 +6377,7 @@
                 <w:sz w:val="28"/>
                 <w:szCs w:val="28"/>
               </w:rPr>
-              <w:t xml:space="preserve">เลือกไอเดีย · ลงชื่อบนกระดาน · รันไฟล์ของไอเดีย</w:t>
+              <w:t xml:space="preserve">เลือกเรื่องใน signup.html · รันไฟล์ของเรื่อง</w:t>
             </w:r>
           </w:p>
         </w:tc>
@@ -4586,7 +6838,7 @@
           <w:sz w:val="30"/>
           <w:szCs w:val="30"/>
         </w:rPr>
-        <w:t xml:space="preserve">ไอเดียที่เลือก และผู้ใช้/สถานที่ของทีม: </w:t>
+        <w:t xml:space="preserve">เรื่องที่เลือก (1–25) และผู้ใช้หน้างาน: </w:t>
       </w:r>
       <w:r>
         <w:rPr>
@@ -5411,7 +7663,7 @@
           <w:sz w:val="30"/>
           <w:szCs w:val="30"/>
         </w:rPr>
-        <w:t xml:space="preserve">รันไฟล์ของไอเดียบนบอร์ด แล้วเห็นค่าของกลุ่มบน idea_web.html แล้ว 1 ครั้ง</w:t>
+        <w:t xml:space="preserve">รันไฟล์ของเรื่องบนบอร์ด แล้วเห็นค่าของกลุ่มบน idea_web.html แล้ว 1 ครั้ง</w:t>
       </w:r>
     </w:p>
     <w:p>
@@ -6159,7 +8411,7 @@
                 <w:sz w:val="28"/>
                 <w:szCs w:val="28"/>
               </w:rPr>
-              <w:t xml:space="preserve">ผู้ใช้ชัด ไม่ซ้ำทีมอื่น บอกได้ว่าลดความเสียหายอะไร</w:t>
+              <w:t xml:space="preserve">ผู้ใช้ชัด บอกได้ว่าลดความเสียหายอะไร</w:t>
             </w:r>
           </w:p>
         </w:tc>
@@ -6701,9 +8953,9 @@
           <w:sz w:val="30"/>
           <w:szCs w:val="30"/>
         </w:rPr>
-        <w:t xml:space="preserve">ชุดเริ่มต้นทั้ง 8 ไอเดีย (project/): </w:t>
-      </w:r>
-      <w:hyperlink w:history="1" r:id="rId-zkqecjl22z8csjqwrtp-">
+        <w:t xml:space="preserve">โค้ดเริ่มต้นทั้ง 25 เรื่อง (project/): </w:t>
+      </w:r>
+      <w:hyperlink w:history="1" r:id="rIdkveemcwv_po6ocx7eh_7n">
         <w:r>
           <w:rPr>
             <w:rFonts w:ascii="TH Sarabun New" w:cs="TH Sarabun New" w:eastAsia="TH Sarabun New" w:hAnsi="TH Sarabun New"/>
@@ -6726,9 +8978,59 @@
           <w:sz w:val="30"/>
           <w:szCs w:val="30"/>
         </w:rPr>
-        <w:t xml:space="preserve">หน้าเว็บของไอเดีย (เลือกไอเดียได้ในหน้า): </w:t>
-      </w:r>
-      <w:hyperlink w:history="1" r:id="rId8rwjl1uucc3rehgu-b_p3">
+        <w:t xml:space="preserve">ตัวอย่าง Edge AI สำหรับอนาคต (ไม่อยู่ในโจทย์): </w:t>
+      </w:r>
+      <w:hyperlink w:history="1" r:id="rId1iso70qkwwnnpour7zejb">
+        <w:r>
+          <w:rPr>
+            <w:rFonts w:ascii="TH Sarabun New" w:cs="TH Sarabun New" w:eastAsia="TH Sarabun New" w:hAnsi="TH Sarabun New"/>
+            <w:color w:val="0563C1"/>
+            <w:sz w:val="24"/>
+            <w:szCs w:val="24"/>
+            <w:u w:val="single"/>
+          </w:rPr>
+          <w:t xml:space="preserve">https://github.com/Advance-Innovation-Centre-AIC/aiot-development-for-smart-farm/tree/main/project/ai_future</w:t>
+        </w:r>
+      </w:hyperlink>
+    </w:p>
+    <w:p>
+      <w:pPr>
+        <w:spacing w:after="60"/>
+      </w:pPr>
+      <w:r>
+        <w:rPr>
+          <w:rFonts w:ascii="TH Sarabun New" w:cs="TH Sarabun New" w:eastAsia="TH Sarabun New" w:hAnsi="TH Sarabun New"/>
+          <w:sz w:val="30"/>
+          <w:szCs w:val="30"/>
+        </w:rPr>
+        <w:t xml:space="preserve">หน้าเลือกเรื่องของแต่ละกลุ่ม (signup.html): </w:t>
+      </w:r>
+      <w:hyperlink w:history="1" r:id="rId7-eqkhgmfcwsjmaqp58qh">
+        <w:r>
+          <w:rPr>
+            <w:rFonts w:ascii="TH Sarabun New" w:cs="TH Sarabun New" w:eastAsia="TH Sarabun New" w:hAnsi="TH Sarabun New"/>
+            <w:color w:val="0563C1"/>
+            <w:sz w:val="24"/>
+            <w:szCs w:val="24"/>
+            <w:u w:val="single"/>
+          </w:rPr>
+          <w:t xml:space="preserve">https://advance-innovation-centre-aic.github.io/aiot-development-for-smart-farm/project/signup.html</w:t>
+        </w:r>
+      </w:hyperlink>
+    </w:p>
+    <w:p>
+      <w:pPr>
+        <w:spacing w:after="60"/>
+      </w:pPr>
+      <w:r>
+        <w:rPr>
+          <w:rFonts w:ascii="TH Sarabun New" w:cs="TH Sarabun New" w:eastAsia="TH Sarabun New" w:hAnsi="TH Sarabun New"/>
+          <w:sz w:val="30"/>
+          <w:szCs w:val="30"/>
+        </w:rPr>
+        <w:t xml:space="preserve">หน้าเว็บของเรื่อง (เลือกเรื่องได้ในหน้า): </w:t>
+      </w:r>
+      <w:hyperlink w:history="1" r:id="rIde2cofjrcvlt6uhzqpqlw7">
         <w:r>
           <w:rPr>
             <w:rFonts w:ascii="TH Sarabun New" w:cs="TH Sarabun New" w:eastAsia="TH Sarabun New" w:hAnsi="TH Sarabun New"/>
@@ -6753,7 +9055,7 @@
         </w:rPr>
         <w:t xml:space="preserve">สัญญา MQTT (วางให้ AI ก่อน vibe coding): </w:t>
       </w:r>
-      <w:hyperlink w:history="1" r:id="rIdhsp5o3zzonkdff6mo0iap">
+      <w:hyperlink w:history="1" r:id="rIdozyc4fkteg113mlzqv9ck">
         <w:r>
           <w:rPr>
             <w:rFonts w:ascii="TH Sarabun New" w:cs="TH Sarabun New" w:eastAsia="TH Sarabun New" w:hAnsi="TH Sarabun New"/>
@@ -6778,7 +9080,7 @@
         </w:rPr>
         <w:t xml:space="preserve">fake_board.html (บอร์ดจำลองสำหรับทดสอบเว็บ): </w:t>
       </w:r>
-      <w:hyperlink w:history="1" r:id="rIduintql67ta2gnqihy1nty">
+      <w:hyperlink w:history="1" r:id="rIdydyzx8fbccknhokwksaaf">
         <w:r>
           <w:rPr>
             <w:rFonts w:ascii="TH Sarabun New" w:cs="TH Sarabun New" w:eastAsia="TH Sarabun New" w:hAnsi="TH Sarabun New"/>
@@ -6803,7 +9105,7 @@
         </w:rPr>
         <w:t xml:space="preserve">farm_web.html (หน้าเว็บรวมของห้อง): </w:t>
       </w:r>
-      <w:hyperlink w:history="1" r:id="rId1fib332jrprjrwvx3e6y3">
+      <w:hyperlink w:history="1" r:id="rIdre2e_nhfagkw2azlnsc21">
         <w:r>
           <w:rPr>
             <w:rFonts w:ascii="TH Sarabun New" w:cs="TH Sarabun New" w:eastAsia="TH Sarabun New" w:hAnsi="TH Sarabun New"/>

</xml_diff>

<commit_message>
docs(project): the teacher announces the story sign-up link in class
</commit_message>
<xml_diff>
--- a/PROJECT_BRIEF_lite_th.docx
+++ b/PROJECT_BRIEF_lite_th.docx
@@ -4162,7 +4162,7 @@
           <w:sz w:val="30"/>
           <w:szCs w:val="30"/>
         </w:rPr>
-        <w:t xml:space="preserve"> · เลือกผ่านหน้า </w:t>
+        <w:t xml:space="preserve"> · </w:t>
       </w:r>
       <w:r>
         <w:rPr>
@@ -4172,7 +4172,7 @@
           <w:sz w:val="30"/>
           <w:szCs w:val="30"/>
         </w:rPr>
-        <w:t xml:space="preserve">signup.html</w:t>
+        <w:t xml:space="preserve">ผู้สอนจะแจ้งลิงก์หรือ QR Code สำหรับเลือกเรื่องในคาบ</w:t>
       </w:r>
       <w:r>
         <w:rPr>
@@ -6377,7 +6377,7 @@
                 <w:sz w:val="28"/>
                 <w:szCs w:val="28"/>
               </w:rPr>
-              <w:t xml:space="preserve">เลือกเรื่องใน signup.html · รันไฟล์ของเรื่อง</w:t>
+              <w:t xml:space="preserve">เลือกเรื่องจากลิงก์ที่ผู้สอนแจ้ง · รันไฟล์ของเรื่อง</w:t>
             </w:r>
           </w:p>
         </w:tc>
@@ -8955,7 +8955,7 @@
         </w:rPr>
         <w:t xml:space="preserve">โค้ดเริ่มต้นทั้ง 25 เรื่อง (project/): </w:t>
       </w:r>
-      <w:hyperlink w:history="1" r:id="rIdkveemcwv_po6ocx7eh_7n">
+      <w:hyperlink w:history="1" r:id="rIdy2ydmpsy5hzzkckoiglgd">
         <w:r>
           <w:rPr>
             <w:rFonts w:ascii="TH Sarabun New" w:cs="TH Sarabun New" w:eastAsia="TH Sarabun New" w:hAnsi="TH Sarabun New"/>
@@ -8980,7 +8980,7 @@
         </w:rPr>
         <w:t xml:space="preserve">ตัวอย่าง Edge AI สำหรับอนาคต (ไม่อยู่ในโจทย์): </w:t>
       </w:r>
-      <w:hyperlink w:history="1" r:id="rId1iso70qkwwnnpour7zejb">
+      <w:hyperlink w:history="1" r:id="rId-ugeewkjrmsmioydl1aku">
         <w:r>
           <w:rPr>
             <w:rFonts w:ascii="TH Sarabun New" w:cs="TH Sarabun New" w:eastAsia="TH Sarabun New" w:hAnsi="TH Sarabun New"/>
@@ -9003,34 +9003,9 @@
           <w:sz w:val="30"/>
           <w:szCs w:val="30"/>
         </w:rPr>
-        <w:t xml:space="preserve">หน้าเลือกเรื่องของแต่ละกลุ่ม (signup.html): </w:t>
-      </w:r>
-      <w:hyperlink w:history="1" r:id="rId7-eqkhgmfcwsjmaqp58qh">
-        <w:r>
-          <w:rPr>
-            <w:rFonts w:ascii="TH Sarabun New" w:cs="TH Sarabun New" w:eastAsia="TH Sarabun New" w:hAnsi="TH Sarabun New"/>
-            <w:color w:val="0563C1"/>
-            <w:sz w:val="24"/>
-            <w:szCs w:val="24"/>
-            <w:u w:val="single"/>
-          </w:rPr>
-          <w:t xml:space="preserve">https://advance-innovation-centre-aic.github.io/aiot-development-for-smart-farm/project/signup.html</w:t>
-        </w:r>
-      </w:hyperlink>
-    </w:p>
-    <w:p>
-      <w:pPr>
-        <w:spacing w:after="60"/>
-      </w:pPr>
-      <w:r>
-        <w:rPr>
-          <w:rFonts w:ascii="TH Sarabun New" w:cs="TH Sarabun New" w:eastAsia="TH Sarabun New" w:hAnsi="TH Sarabun New"/>
-          <w:sz w:val="30"/>
-          <w:szCs w:val="30"/>
-        </w:rPr>
         <w:t xml:space="preserve">หน้าเว็บของเรื่อง (เลือกเรื่องได้ในหน้า): </w:t>
       </w:r>
-      <w:hyperlink w:history="1" r:id="rIde2cofjrcvlt6uhzqpqlw7">
+      <w:hyperlink w:history="1" r:id="rIdb2mb-gqe4hdi1fhaeevnz">
         <w:r>
           <w:rPr>
             <w:rFonts w:ascii="TH Sarabun New" w:cs="TH Sarabun New" w:eastAsia="TH Sarabun New" w:hAnsi="TH Sarabun New"/>
@@ -9055,7 +9030,7 @@
         </w:rPr>
         <w:t xml:space="preserve">สัญญา MQTT (วางให้ AI ก่อน vibe coding): </w:t>
       </w:r>
-      <w:hyperlink w:history="1" r:id="rIdozyc4fkteg113mlzqv9ck">
+      <w:hyperlink w:history="1" r:id="rIdkrdyr4zsrfc8saf_fjw3k">
         <w:r>
           <w:rPr>
             <w:rFonts w:ascii="TH Sarabun New" w:cs="TH Sarabun New" w:eastAsia="TH Sarabun New" w:hAnsi="TH Sarabun New"/>
@@ -9080,7 +9055,7 @@
         </w:rPr>
         <w:t xml:space="preserve">fake_board.html (บอร์ดจำลองสำหรับทดสอบเว็บ): </w:t>
       </w:r>
-      <w:hyperlink w:history="1" r:id="rIdydyzx8fbccknhokwksaaf">
+      <w:hyperlink w:history="1" r:id="rIdjj_ilxtaqqka5hfzbsfah">
         <w:r>
           <w:rPr>
             <w:rFonts w:ascii="TH Sarabun New" w:cs="TH Sarabun New" w:eastAsia="TH Sarabun New" w:hAnsi="TH Sarabun New"/>
@@ -9105,7 +9080,7 @@
         </w:rPr>
         <w:t xml:space="preserve">farm_web.html (หน้าเว็บรวมของห้อง): </w:t>
       </w:r>
-      <w:hyperlink w:history="1" r:id="rIdre2e_nhfagkw2azlnsc21">
+      <w:hyperlink w:history="1" r:id="rIdnfolyfg7cqgxnceqc5nwe">
         <w:r>
           <w:rPr>
             <w:rFonts w:ascii="TH Sarabun New" w:cs="TH Sarabun New" w:eastAsia="TH Sarabun New" w:hAnsi="TH Sarabun New"/>

</xml_diff>

<commit_message>
docs(project): kits C and D say they use plain rules; web pages write วินาที; four stories per kickoff slide
- Kits C (vibration) and D (radar) are labelled "กฎธรรมดา ไม่ใช้ AI" in the
  brief, the S3 worksheet and deck, the kickoff deck, the story index, the
  sign-up page and project/README_th.md. Their starters compare against a
  learned baseline or confirm N readings; none imports an AI module.
- The 25 story web pages spell out "วินาที" instead of the abbreviation "วิ".
- The kickoff deck shows stories 9-25 four per slide, board and web side by
  side, like stories 1-8. Screenshots re-shot live: board file in the BENTO
  Emulator, broker.hivemq.com, web page open; 25/25 rendered values.
</commit_message>
<xml_diff>
--- a/PROJECT_BRIEF_lite_th.docx
+++ b/PROJECT_BRIEF_lite_th.docx
@@ -1455,7 +1455,7 @@
                 <w:sz w:val="28"/>
                 <w:szCs w:val="28"/>
               </w:rPr>
-              <w:t xml:space="preserve">D · เรดาร์จับผู้บุกรุก</w:t>
+              <w:t xml:space="preserve">D · เรดาร์จับผู้บุกรุก (กฎธรรมดา ไม่ใช้ AI)</w:t>
             </w:r>
           </w:p>
         </w:tc>
@@ -1715,7 +1715,7 @@
                 <w:sz w:val="28"/>
                 <w:szCs w:val="28"/>
               </w:rPr>
-              <w:t xml:space="preserve">C · การสั่นผิดปกติ + หยุดเครื่อง</w:t>
+              <w:t xml:space="preserve">C · การสั่นผิดปกติ + หยุดเครื่อง (กฎธรรมดา ไม่ใช้ AI)</w:t>
             </w:r>
           </w:p>
         </w:tc>
@@ -3535,7 +3535,7 @@
                 <w:sz w:val="28"/>
                 <w:szCs w:val="28"/>
               </w:rPr>
-              <w:t xml:space="preserve">C · การสั่นผิดปกติ + หยุดเครื่อง</w:t>
+              <w:t xml:space="preserve">C · การสั่นผิดปกติ + หยุดเครื่อง (กฎธรรมดา ไม่ใช้ AI)</w:t>
             </w:r>
           </w:p>
         </w:tc>
@@ -3665,7 +3665,7 @@
                 <w:sz w:val="28"/>
                 <w:szCs w:val="28"/>
               </w:rPr>
-              <w:t xml:space="preserve">C · การสั่นผิดปกติ + หยุดเครื่อง</w:t>
+              <w:t xml:space="preserve">C · การสั่นผิดปกติ + หยุดเครื่อง (กฎธรรมดา ไม่ใช้ AI)</w:t>
             </w:r>
           </w:p>
         </w:tc>
@@ -3795,7 +3795,7 @@
                 <w:sz w:val="28"/>
                 <w:szCs w:val="28"/>
               </w:rPr>
-              <w:t xml:space="preserve">C · การสั่นผิดปกติ + หยุดเครื่อง</w:t>
+              <w:t xml:space="preserve">C · การสั่นผิดปกติ + หยุดเครื่อง (กฎธรรมดา ไม่ใช้ AI)</w:t>
             </w:r>
           </w:p>
         </w:tc>
@@ -3925,7 +3925,7 @@
                 <w:sz w:val="28"/>
                 <w:szCs w:val="28"/>
               </w:rPr>
-              <w:t xml:space="preserve">C · การสั่นผิดปกติ + หยุดเครื่อง</w:t>
+              <w:t xml:space="preserve">C · การสั่นผิดปกติ + หยุดเครื่อง (กฎธรรมดา ไม่ใช้ AI)</w:t>
             </w:r>
           </w:p>
         </w:tc>
@@ -4055,7 +4055,7 @@
                 <w:sz w:val="28"/>
                 <w:szCs w:val="28"/>
               </w:rPr>
-              <w:t xml:space="preserve">D · เรดาร์จับผู้บุกรุก</w:t>
+              <w:t xml:space="preserve">D · เรดาร์จับผู้บุกรุก (กฎธรรมดา ไม่ใช้ AI)</w:t>
             </w:r>
           </w:p>
         </w:tc>
@@ -8937,7 +8937,7 @@
         </w:rPr>
         <w:t xml:space="preserve">โค้ดเริ่มต้นทั้ง 25 เรื่อง (project/): </w:t>
       </w:r>
-      <w:hyperlink w:history="1" r:id="rIdmkdoneyyex-ewdqhwemkj">
+      <w:hyperlink w:history="1" r:id="rIdq_ujhipm_0uk5_hm220x5">
         <w:r>
           <w:rPr>
             <w:rFonts w:ascii="TH Sarabun New" w:cs="TH Sarabun New" w:eastAsia="TH Sarabun New" w:hAnsi="TH Sarabun New"/>
@@ -8962,7 +8962,7 @@
         </w:rPr>
         <w:t xml:space="preserve">ตัวอย่าง Edge AI สำหรับอนาคต (ไม่อยู่ในโจทย์): </w:t>
       </w:r>
-      <w:hyperlink w:history="1" r:id="rIdgmi6tuwko4v8mky9vydoa">
+      <w:hyperlink w:history="1" r:id="rIdvvgv32y3q0wz-51ru4pkg">
         <w:r>
           <w:rPr>
             <w:rFonts w:ascii="TH Sarabun New" w:cs="TH Sarabun New" w:eastAsia="TH Sarabun New" w:hAnsi="TH Sarabun New"/>
@@ -8987,7 +8987,7 @@
         </w:rPr>
         <w:t xml:space="preserve">หน้าเว็บของทั้ง 25 เรื่อง: </w:t>
       </w:r>
-      <w:hyperlink w:history="1" r:id="rIdfexiiuputbcimzeczcbaz">
+      <w:hyperlink w:history="1" r:id="rId4xpa6w9wwjadr2kbujuxk">
         <w:r>
           <w:rPr>
             <w:rFonts w:ascii="TH Sarabun New" w:cs="TH Sarabun New" w:eastAsia="TH Sarabun New" w:hAnsi="TH Sarabun New"/>
@@ -9012,7 +9012,7 @@
         </w:rPr>
         <w:t xml:space="preserve">สัญญา MQTT (วางให้ AI ก่อน vibe coding): </w:t>
       </w:r>
-      <w:hyperlink w:history="1" r:id="rIdhhzljswq70r09nrdg5zkc">
+      <w:hyperlink w:history="1" r:id="rIddwyphzv8ybm-_w-a7lcgo">
         <w:r>
           <w:rPr>
             <w:rFonts w:ascii="TH Sarabun New" w:cs="TH Sarabun New" w:eastAsia="TH Sarabun New" w:hAnsi="TH Sarabun New"/>
@@ -9037,7 +9037,7 @@
         </w:rPr>
         <w:t xml:space="preserve">fake_board.html (บอร์ดจำลองสำหรับทดสอบเว็บ): </w:t>
       </w:r>
-      <w:hyperlink w:history="1" r:id="rId8p0vv7hu7rtayrpswybcy">
+      <w:hyperlink w:history="1" r:id="rId5jv7-fmvksoav-52nmejc">
         <w:r>
           <w:rPr>
             <w:rFonts w:ascii="TH Sarabun New" w:cs="TH Sarabun New" w:eastAsia="TH Sarabun New" w:hAnsi="TH Sarabun New"/>
@@ -9062,7 +9062,7 @@
         </w:rPr>
         <w:t xml:space="preserve">farm_web.html (หน้าเว็บรวมของห้อง): </w:t>
       </w:r>
-      <w:hyperlink w:history="1" r:id="rId77j640om9ee8l5q4jyzzc">
+      <w:hyperlink w:history="1" r:id="rIdcc-w1w5jome6radofzr4v">
         <w:r>
           <w:rPr>
             <w:rFonts w:ascii="TH Sarabun New" w:cs="TH Sarabun New" w:eastAsia="TH Sarabun New" w:hAnsi="TH Sarabun New"/>

</xml_diff>